<commit_message>
added two new scenarios
</commit_message>
<xml_diff>
--- a/report_notes.docx
+++ b/report_notes.docx
@@ -8,11 +8,1148 @@
           <w:lang w:val="cs-CZ"/>
         </w:rPr>
       </w:pPr>
-      <w:r>
-        <w:rPr>
-          <w:lang w:val="cs-CZ"/>
-        </w:rPr>
-        <w:br/>
+    </w:p>
+    <w:p>
+      <w:pPr>
+        <w:jc w:val="center"/>
+        <w:rPr>
+          <w:b/>
+          <w:bCs/>
+          <w:sz w:val="28"/>
+          <w:szCs w:val="28"/>
+          <w:lang w:val="cs-CZ"/>
+        </w:rPr>
+      </w:pPr>
+      <w:r>
+        <w:rPr>
+          <w:b/>
+          <w:bCs/>
+          <w:sz w:val="28"/>
+          <w:szCs w:val="28"/>
+          <w:lang w:val="cs-CZ"/>
+        </w:rPr>
+        <w:t xml:space="preserve">DONT FORGET THE TITLE </w:t>
+      </w:r>
+    </w:p>
+    <w:p>
+      <w:pPr>
+        <w:jc w:val="center"/>
+        <w:rPr>
+          <w:b/>
+          <w:bCs/>
+          <w:sz w:val="28"/>
+          <w:szCs w:val="28"/>
+        </w:rPr>
+      </w:pPr>
+      <w:r>
+        <w:rPr>
+          <w:b/>
+          <w:bCs/>
+          <w:sz w:val="28"/>
+          <w:szCs w:val="28"/>
+        </w:rPr>
+        <w:t>Jácha a Mara</w:t>
+      </w:r>
+    </w:p>
+    <w:p>
+      <w:pPr>
+        <w:jc w:val="center"/>
+        <w:rPr>
+          <w:b/>
+          <w:bCs/>
+          <w:sz w:val="28"/>
+          <w:szCs w:val="28"/>
+        </w:rPr>
+      </w:pPr>
+    </w:p>
+    <w:p>
+      <w:pPr>
+        <w:rPr>
+          <w:b/>
+          <w:bCs/>
+          <w:sz w:val="28"/>
+          <w:szCs w:val="28"/>
+          <w:lang w:val="cs-CZ"/>
+        </w:rPr>
+      </w:pPr>
+      <w:r>
+        <w:rPr>
+          <w:b/>
+          <w:bCs/>
+          <w:sz w:val="28"/>
+          <w:szCs w:val="28"/>
+          <w:lang w:val="cs-CZ"/>
+        </w:rPr>
+        <w:t>Theretical base</w:t>
+      </w:r>
+      <w:r>
+        <w:rPr>
+          <w:b/>
+          <w:bCs/>
+          <w:sz w:val="28"/>
+          <w:szCs w:val="28"/>
+          <w:lang w:val="cs-CZ"/>
+        </w:rPr>
+        <w:t xml:space="preserve"> - </w:t>
+      </w:r>
+      <w:r>
+        <w:rPr>
+          <w:b/>
+          <w:bCs/>
+          <w:sz w:val="28"/>
+          <w:szCs w:val="28"/>
+          <w:lang w:val="cs-CZ"/>
+        </w:rPr>
+        <w:t>Cournot Oligopoly</w:t>
+      </w:r>
+    </w:p>
+    <w:p>
+      <w:pPr>
+        <w:rPr>
+          <w:sz w:val="24"/>
+          <w:szCs w:val="24"/>
+        </w:rPr>
+      </w:pPr>
+      <w:r>
+        <w:rPr>
+          <w:sz w:val="24"/>
+          <w:szCs w:val="24"/>
+          <w:lang w:val="cs-CZ"/>
+        </w:rPr>
+        <w:t xml:space="preserve">In Cournot oligopoly model, firms compete by choosing the amout of goods they produce. </w:t>
+      </w:r>
+      <w:r>
+        <w:rPr>
+          <w:sz w:val="24"/>
+          <w:szCs w:val="24"/>
+        </w:rPr>
+        <w:t xml:space="preserve">The market price is then determined from total output using the </w:t>
+      </w:r>
+      <w:r>
+        <w:rPr>
+          <w:sz w:val="24"/>
+          <w:szCs w:val="24"/>
+        </w:rPr>
+        <w:t>inverse demand function:</w:t>
+      </w:r>
+    </w:p>
+    <w:p>
+      <w:pPr>
+        <w:jc w:val="center"/>
+        <w:rPr>
+          <w:sz w:val="24"/>
+          <w:szCs w:val="24"/>
+        </w:rPr>
+      </w:pPr>
+      <w:r>
+        <w:rPr>
+          <w:sz w:val="24"/>
+          <w:szCs w:val="24"/>
+        </w:rPr>
+        <w:t>P</w:t>
+      </w:r>
+      <w:r>
+        <w:rPr>
+          <w:sz w:val="24"/>
+          <w:szCs w:val="24"/>
+        </w:rPr>
+        <w:t xml:space="preserve"> </w:t>
+      </w:r>
+      <w:r>
+        <w:rPr>
+          <w:sz w:val="24"/>
+          <w:szCs w:val="24"/>
+        </w:rPr>
+        <w:t>=</w:t>
+      </w:r>
+      <w:r>
+        <w:rPr>
+          <w:sz w:val="24"/>
+          <w:szCs w:val="24"/>
+        </w:rPr>
+        <w:t xml:space="preserve"> </w:t>
+      </w:r>
+      <w:r>
+        <w:rPr>
+          <w:sz w:val="24"/>
+          <w:szCs w:val="24"/>
+        </w:rPr>
+        <w:t>a</w:t>
+      </w:r>
+      <w:r>
+        <w:rPr>
+          <w:sz w:val="24"/>
+          <w:szCs w:val="24"/>
+        </w:rPr>
+        <w:t xml:space="preserve"> </w:t>
+      </w:r>
+      <w:r>
+        <w:rPr>
+          <w:sz w:val="24"/>
+          <w:szCs w:val="24"/>
+        </w:rPr>
+        <w:t>−</w:t>
+      </w:r>
+      <w:r>
+        <w:rPr>
+          <w:sz w:val="24"/>
+          <w:szCs w:val="24"/>
+        </w:rPr>
+        <w:t xml:space="preserve"> </w:t>
+      </w:r>
+      <w:r>
+        <w:rPr>
+          <w:sz w:val="24"/>
+          <w:szCs w:val="24"/>
+        </w:rPr>
+        <w:t>b</w:t>
+      </w:r>
+      <w:r>
+        <w:rPr>
+          <w:sz w:val="24"/>
+          <w:szCs w:val="24"/>
+        </w:rPr>
+        <w:t>Q</w:t>
+      </w:r>
+    </w:p>
+    <w:p>
+      <w:pPr>
+        <w:spacing w:after="0"/>
+        <w:rPr>
+          <w:sz w:val="24"/>
+          <w:szCs w:val="24"/>
+        </w:rPr>
+      </w:pPr>
+      <w:r>
+        <w:rPr>
+          <w:sz w:val="24"/>
+          <w:szCs w:val="24"/>
+        </w:rPr>
+        <w:t>Q…total quantity produced</w:t>
+      </w:r>
+    </w:p>
+    <w:p>
+      <w:pPr>
+        <w:spacing w:after="0"/>
+        <w:rPr>
+          <w:sz w:val="24"/>
+          <w:szCs w:val="24"/>
+        </w:rPr>
+      </w:pPr>
+      <w:r>
+        <w:rPr>
+          <w:sz w:val="24"/>
+          <w:szCs w:val="24"/>
+        </w:rPr>
+        <w:t xml:space="preserve">a…theoretical maximum price </w:t>
+      </w:r>
+      <w:r>
+        <w:rPr>
+          <w:sz w:val="24"/>
+          <w:szCs w:val="24"/>
+        </w:rPr>
+        <w:t>when quantity is zero</w:t>
+      </w:r>
+      <w:r>
+        <w:rPr>
+          <w:sz w:val="24"/>
+          <w:szCs w:val="24"/>
+        </w:rPr>
+        <w:t>s</w:t>
+      </w:r>
+    </w:p>
+    <w:p>
+      <w:pPr>
+        <w:spacing w:after="0"/>
+        <w:rPr>
+          <w:sz w:val="24"/>
+          <w:szCs w:val="24"/>
+        </w:rPr>
+      </w:pPr>
+      <w:r>
+        <w:rPr>
+          <w:sz w:val="24"/>
+          <w:szCs w:val="24"/>
+        </w:rPr>
+        <w:t>b</w:t>
+      </w:r>
+      <w:r>
+        <w:rPr>
+          <w:sz w:val="24"/>
+          <w:szCs w:val="24"/>
+        </w:rPr>
+        <w:t>…supply sensitivity</w:t>
+      </w:r>
+    </w:p>
+    <w:p>
+      <w:pPr>
+        <w:rPr>
+          <w:sz w:val="24"/>
+          <w:szCs w:val="24"/>
+        </w:rPr>
+      </w:pPr>
+    </w:p>
+    <w:p>
+      <w:pPr>
+        <w:rPr>
+          <w:sz w:val="24"/>
+          <w:szCs w:val="24"/>
+        </w:rPr>
+      </w:pPr>
+      <w:r>
+        <w:rPr>
+          <w:sz w:val="24"/>
+          <w:szCs w:val="24"/>
+        </w:rPr>
+        <w:t>In this model</w:t>
+      </w:r>
+      <w:r>
+        <w:rPr>
+          <w:sz w:val="24"/>
+          <w:szCs w:val="24"/>
+        </w:rPr>
+        <w:t xml:space="preserve"> a demand curve </w:t>
+      </w:r>
+      <w:r>
+        <w:rPr>
+          <w:sz w:val="24"/>
+          <w:szCs w:val="24"/>
+        </w:rPr>
+        <w:t xml:space="preserve">was calibrated </w:t>
+      </w:r>
+      <w:r>
+        <w:rPr>
+          <w:sz w:val="24"/>
+          <w:szCs w:val="24"/>
+        </w:rPr>
+        <w:t>to an initial market equilibrium</w:t>
+      </w:r>
+      <w:r>
+        <w:rPr>
+          <w:sz w:val="24"/>
+          <w:szCs w:val="24"/>
+        </w:rPr>
+        <w:t xml:space="preserve">. This approach was used mainly because parameter </w:t>
+      </w:r>
+      <w:r>
+        <w:rPr>
+          <w:i/>
+          <w:iCs/>
+          <w:sz w:val="24"/>
+          <w:szCs w:val="24"/>
+        </w:rPr>
+        <w:t xml:space="preserve">a </w:t>
+      </w:r>
+      <w:r>
+        <w:rPr>
+          <w:sz w:val="24"/>
+          <w:szCs w:val="24"/>
+        </w:rPr>
+        <w:t>is a purely theoretical number that is impossible to know.</w:t>
+      </w:r>
+      <w:r>
+        <w:rPr>
+          <w:sz w:val="24"/>
+          <w:szCs w:val="24"/>
+        </w:rPr>
+        <w:t xml:space="preserve"> Final price calculation:</w:t>
+      </w:r>
+    </w:p>
+    <w:p>
+      <w:pPr>
+        <w:jc w:val="center"/>
+        <w:rPr>
+          <w:sz w:val="24"/>
+          <w:szCs w:val="24"/>
+        </w:rPr>
+      </w:pPr>
+      <w:r>
+        <w:rPr>
+          <w:sz w:val="24"/>
+          <w:szCs w:val="24"/>
+        </w:rPr>
+        <w:t xml:space="preserve">P = P_base – </w:t>
+      </w:r>
+      <w:r>
+        <w:rPr>
+          <w:sz w:val="24"/>
+          <w:szCs w:val="24"/>
+        </w:rPr>
+        <w:t>b</w:t>
+      </w:r>
+      <w:r>
+        <w:rPr>
+          <w:sz w:val="24"/>
+          <w:szCs w:val="24"/>
+        </w:rPr>
+        <w:t xml:space="preserve"> * (Q – Q_base)</w:t>
+      </w:r>
+    </w:p>
+    <w:p>
+      <w:pPr>
+        <w:rPr>
+          <w:sz w:val="24"/>
+          <w:szCs w:val="24"/>
+        </w:rPr>
+      </w:pPr>
+      <w:r>
+        <w:rPr>
+          <w:sz w:val="24"/>
+          <w:szCs w:val="24"/>
+        </w:rPr>
+        <w:t>P_base…historically observed equilibrium price</w:t>
+      </w:r>
+    </w:p>
+    <w:p>
+      <w:pPr>
+        <w:rPr>
+          <w:sz w:val="24"/>
+          <w:szCs w:val="24"/>
+        </w:rPr>
+      </w:pPr>
+      <w:r>
+        <w:rPr>
+          <w:sz w:val="24"/>
+          <w:szCs w:val="24"/>
+        </w:rPr>
+        <w:t>Q_base…</w:t>
+      </w:r>
+      <w:r>
+        <w:t xml:space="preserve"> </w:t>
+      </w:r>
+      <w:r>
+        <w:rPr>
+          <w:sz w:val="24"/>
+          <w:szCs w:val="24"/>
+        </w:rPr>
+        <w:t>production level that naturally results in the Base Price</w:t>
+      </w:r>
+    </w:p>
+    <w:p>
+      <w:pPr>
+        <w:rPr>
+          <w:lang w:val="cs-CZ"/>
+        </w:rPr>
+      </w:pPr>
+    </w:p>
+    <w:p>
+      <w:pPr>
+        <w:rPr>
+          <w:b/>
+          <w:bCs/>
+          <w:sz w:val="28"/>
+          <w:szCs w:val="28"/>
+          <w:lang w:val="cs-CZ"/>
+        </w:rPr>
+      </w:pPr>
+    </w:p>
+    <w:p>
+      <w:pPr>
+        <w:rPr>
+          <w:b/>
+          <w:bCs/>
+          <w:sz w:val="28"/>
+          <w:szCs w:val="28"/>
+          <w:lang w:val="cs-CZ"/>
+        </w:rPr>
+      </w:pPr>
+    </w:p>
+    <w:p>
+      <w:pPr>
+        <w:rPr>
+          <w:b/>
+          <w:bCs/>
+          <w:sz w:val="28"/>
+          <w:szCs w:val="28"/>
+          <w:lang w:val="cs-CZ"/>
+        </w:rPr>
+      </w:pPr>
+    </w:p>
+    <w:p>
+      <w:pPr>
+        <w:rPr>
+          <w:b/>
+          <w:bCs/>
+          <w:sz w:val="28"/>
+          <w:szCs w:val="28"/>
+          <w:lang w:val="cs-CZ"/>
+        </w:rPr>
+      </w:pPr>
+    </w:p>
+    <w:p>
+      <w:pPr>
+        <w:rPr>
+          <w:b/>
+          <w:bCs/>
+          <w:sz w:val="28"/>
+          <w:szCs w:val="28"/>
+          <w:lang w:val="cs-CZ"/>
+        </w:rPr>
+      </w:pPr>
+    </w:p>
+    <w:p>
+      <w:pPr>
+        <w:rPr>
+          <w:b/>
+          <w:bCs/>
+          <w:sz w:val="28"/>
+          <w:szCs w:val="28"/>
+          <w:lang w:val="cs-CZ"/>
+        </w:rPr>
+      </w:pPr>
+    </w:p>
+    <w:p>
+      <w:pPr>
+        <w:rPr>
+          <w:b/>
+          <w:bCs/>
+          <w:sz w:val="28"/>
+          <w:szCs w:val="28"/>
+          <w:lang w:val="cs-CZ"/>
+        </w:rPr>
+      </w:pPr>
+    </w:p>
+    <w:p>
+      <w:pPr>
+        <w:rPr>
+          <w:b/>
+          <w:bCs/>
+          <w:sz w:val="28"/>
+          <w:szCs w:val="28"/>
+          <w:lang w:val="cs-CZ"/>
+        </w:rPr>
+      </w:pPr>
+    </w:p>
+    <w:p>
+      <w:pPr>
+        <w:rPr>
+          <w:b/>
+          <w:bCs/>
+          <w:sz w:val="28"/>
+          <w:szCs w:val="28"/>
+          <w:lang w:val="cs-CZ"/>
+        </w:rPr>
+      </w:pPr>
+    </w:p>
+    <w:p>
+      <w:pPr>
+        <w:rPr>
+          <w:b/>
+          <w:bCs/>
+          <w:sz w:val="28"/>
+          <w:szCs w:val="28"/>
+          <w:lang w:val="cs-CZ"/>
+        </w:rPr>
+      </w:pPr>
+    </w:p>
+    <w:p>
+      <w:pPr>
+        <w:rPr>
+          <w:b/>
+          <w:bCs/>
+          <w:sz w:val="28"/>
+          <w:szCs w:val="28"/>
+          <w:lang w:val="cs-CZ"/>
+        </w:rPr>
+      </w:pPr>
+      <w:r>
+        <w:rPr>
+          <w:b/>
+          <w:bCs/>
+          <w:sz w:val="28"/>
+          <w:szCs w:val="28"/>
+          <w:lang w:val="cs-CZ"/>
+        </w:rPr>
+        <w:lastRenderedPageBreak/>
+        <w:drawing>
+          <wp:anchor distT="0" distB="0" distL="114300" distR="114300" simplePos="0" relativeHeight="251659264" behindDoc="1" locked="0" layoutInCell="1" allowOverlap="1" wp14:anchorId="76FBE1E3" wp14:editId="70A78072">
+            <wp:simplePos x="0" y="0"/>
+            <wp:positionH relativeFrom="margin">
+              <wp:posOffset>2827655</wp:posOffset>
+            </wp:positionH>
+            <wp:positionV relativeFrom="paragraph">
+              <wp:posOffset>307340</wp:posOffset>
+            </wp:positionV>
+            <wp:extent cx="3380740" cy="2625725"/>
+            <wp:effectExtent l="0" t="0" r="0" b="3175"/>
+            <wp:wrapTight wrapText="bothSides">
+              <wp:wrapPolygon edited="0">
+                <wp:start x="0" y="0"/>
+                <wp:lineTo x="0" y="21469"/>
+                <wp:lineTo x="21421" y="21469"/>
+                <wp:lineTo x="21421" y="0"/>
+                <wp:lineTo x="0" y="0"/>
+              </wp:wrapPolygon>
+            </wp:wrapTight>
+            <wp:docPr id="1072030826" name="Picture 1"/>
+            <wp:cNvGraphicFramePr>
+              <a:graphicFrameLocks xmlns:a="http://schemas.openxmlformats.org/drawingml/2006/main" noChangeAspect="1"/>
+            </wp:cNvGraphicFramePr>
+            <a:graphic xmlns:a="http://schemas.openxmlformats.org/drawingml/2006/main">
+              <a:graphicData uri="http://schemas.openxmlformats.org/drawingml/2006/picture">
+                <pic:pic xmlns:pic="http://schemas.openxmlformats.org/drawingml/2006/picture">
+                  <pic:nvPicPr>
+                    <pic:cNvPr id="1072030826" name=""/>
+                    <pic:cNvPicPr/>
+                  </pic:nvPicPr>
+                  <pic:blipFill>
+                    <a:blip r:embed="rId5">
+                      <a:extLst>
+                        <a:ext uri="{28A0092B-C50C-407E-A947-70E740481C1C}">
+                          <a14:useLocalDpi xmlns:a14="http://schemas.microsoft.com/office/drawing/2010/main" val="0"/>
+                        </a:ext>
+                      </a:extLst>
+                    </a:blip>
+                    <a:stretch>
+                      <a:fillRect/>
+                    </a:stretch>
+                  </pic:blipFill>
+                  <pic:spPr>
+                    <a:xfrm>
+                      <a:off x="0" y="0"/>
+                      <a:ext cx="3380740" cy="2625725"/>
+                    </a:xfrm>
+                    <a:prstGeom prst="rect">
+                      <a:avLst/>
+                    </a:prstGeom>
+                  </pic:spPr>
+                </pic:pic>
+              </a:graphicData>
+            </a:graphic>
+            <wp14:sizeRelH relativeFrom="margin">
+              <wp14:pctWidth>0</wp14:pctWidth>
+            </wp14:sizeRelH>
+            <wp14:sizeRelV relativeFrom="margin">
+              <wp14:pctHeight>0</wp14:pctHeight>
+            </wp14:sizeRelV>
+          </wp:anchor>
+        </w:drawing>
+      </w:r>
+      <w:r>
+        <w:rPr>
+          <w:b/>
+          <w:bCs/>
+          <w:sz w:val="28"/>
+          <w:szCs w:val="28"/>
+          <w:lang w:val="cs-CZ"/>
+        </w:rPr>
+        <w:drawing>
+          <wp:anchor distT="0" distB="0" distL="114300" distR="114300" simplePos="0" relativeHeight="251658240" behindDoc="0" locked="0" layoutInCell="1" allowOverlap="1" wp14:anchorId="26BFC252" wp14:editId="2D10ACBA">
+            <wp:simplePos x="0" y="0"/>
+            <wp:positionH relativeFrom="margin">
+              <wp:posOffset>-403963</wp:posOffset>
+            </wp:positionH>
+            <wp:positionV relativeFrom="paragraph">
+              <wp:posOffset>392918</wp:posOffset>
+            </wp:positionV>
+            <wp:extent cx="3324860" cy="2508885"/>
+            <wp:effectExtent l="0" t="0" r="8890" b="5715"/>
+            <wp:wrapSquare wrapText="bothSides"/>
+            <wp:docPr id="368777718" name="Picture 1"/>
+            <wp:cNvGraphicFramePr>
+              <a:graphicFrameLocks xmlns:a="http://schemas.openxmlformats.org/drawingml/2006/main" noChangeAspect="1"/>
+            </wp:cNvGraphicFramePr>
+            <a:graphic xmlns:a="http://schemas.openxmlformats.org/drawingml/2006/main">
+              <a:graphicData uri="http://schemas.openxmlformats.org/drawingml/2006/picture">
+                <pic:pic xmlns:pic="http://schemas.openxmlformats.org/drawingml/2006/picture">
+                  <pic:nvPicPr>
+                    <pic:cNvPr id="368777718" name=""/>
+                    <pic:cNvPicPr/>
+                  </pic:nvPicPr>
+                  <pic:blipFill>
+                    <a:blip r:embed="rId6">
+                      <a:extLst>
+                        <a:ext uri="{28A0092B-C50C-407E-A947-70E740481C1C}">
+                          <a14:useLocalDpi xmlns:a14="http://schemas.microsoft.com/office/drawing/2010/main" val="0"/>
+                        </a:ext>
+                      </a:extLst>
+                    </a:blip>
+                    <a:stretch>
+                      <a:fillRect/>
+                    </a:stretch>
+                  </pic:blipFill>
+                  <pic:spPr>
+                    <a:xfrm>
+                      <a:off x="0" y="0"/>
+                      <a:ext cx="3324860" cy="2508885"/>
+                    </a:xfrm>
+                    <a:prstGeom prst="rect">
+                      <a:avLst/>
+                    </a:prstGeom>
+                  </pic:spPr>
+                </pic:pic>
+              </a:graphicData>
+            </a:graphic>
+            <wp14:sizeRelH relativeFrom="margin">
+              <wp14:pctWidth>0</wp14:pctWidth>
+            </wp14:sizeRelH>
+            <wp14:sizeRelV relativeFrom="margin">
+              <wp14:pctHeight>0</wp14:pctHeight>
+            </wp14:sizeRelV>
+          </wp:anchor>
+        </w:drawing>
+      </w:r>
+      <w:r>
+        <w:rPr>
+          <w:b/>
+          <w:bCs/>
+          <w:sz w:val="28"/>
+          <w:szCs w:val="28"/>
+          <w:lang w:val="cs-CZ"/>
+        </w:rPr>
+        <w:t>SCENARIO 1</w:t>
+      </w:r>
+      <w:r>
+        <w:rPr>
+          <w:b/>
+          <w:bCs/>
+          <w:sz w:val="28"/>
+          <w:szCs w:val="28"/>
+          <w:lang w:val="cs-CZ"/>
+        </w:rPr>
+        <w:t xml:space="preserve"> – Current state of OPEC cartel</w:t>
+      </w:r>
+    </w:p>
+    <w:p>
+      <w:pPr>
+        <w:rPr>
+          <w:b/>
+          <w:bCs/>
+          <w:sz w:val="28"/>
+          <w:szCs w:val="28"/>
+          <w:lang w:val="cs-CZ"/>
+        </w:rPr>
+      </w:pPr>
+    </w:p>
+    <w:p>
+      <w:pPr>
+        <w:rPr>
+          <w:sz w:val="24"/>
+          <w:szCs w:val="24"/>
+          <w:lang w:val="cs-CZ"/>
+        </w:rPr>
+      </w:pPr>
+      <w:r>
+        <w:rPr>
+          <w:sz w:val="24"/>
+          <w:szCs w:val="24"/>
+          <w:lang w:val="cs-CZ"/>
+        </w:rPr>
+        <w:t>Profit of Each Country:</w:t>
+      </w:r>
+    </w:p>
+    <w:p>
+      <w:pPr>
+        <w:rPr>
+          <w:sz w:val="24"/>
+          <w:szCs w:val="24"/>
+          <w:lang w:val="cs-CZ"/>
+        </w:rPr>
+      </w:pPr>
+      <w:r>
+        <w:rPr>
+          <w:sz w:val="24"/>
+          <w:szCs w:val="24"/>
+          <w:lang w:val="cs-CZ"/>
+        </w:rPr>
+        <w:t>Saudi Arabia : $25</w:t>
+      </w:r>
+      <w:r>
+        <w:rPr>
+          <w:sz w:val="24"/>
+          <w:szCs w:val="24"/>
+          <w:lang w:val="cs-CZ"/>
+        </w:rPr>
+        <w:t>574</w:t>
+      </w:r>
+    </w:p>
+    <w:p>
+      <w:pPr>
+        <w:rPr>
+          <w:sz w:val="24"/>
+          <w:szCs w:val="24"/>
+          <w:lang w:val="cs-CZ"/>
+        </w:rPr>
+      </w:pPr>
+      <w:r>
+        <w:rPr>
+          <w:sz w:val="24"/>
+          <w:szCs w:val="24"/>
+          <w:lang w:val="cs-CZ"/>
+        </w:rPr>
+        <w:t>Venezuela : $19</w:t>
+      </w:r>
+      <w:r>
+        <w:rPr>
+          <w:sz w:val="24"/>
+          <w:szCs w:val="24"/>
+          <w:lang w:val="cs-CZ"/>
+        </w:rPr>
+        <w:t>96</w:t>
+      </w:r>
+    </w:p>
+    <w:p>
+      <w:pPr>
+        <w:rPr>
+          <w:sz w:val="24"/>
+          <w:szCs w:val="24"/>
+          <w:lang w:val="cs-CZ"/>
+        </w:rPr>
+      </w:pPr>
+      <w:r>
+        <w:rPr>
+          <w:sz w:val="24"/>
+          <w:szCs w:val="24"/>
+          <w:lang w:val="cs-CZ"/>
+        </w:rPr>
+        <w:t>UAE : $9</w:t>
+      </w:r>
+      <w:r>
+        <w:rPr>
+          <w:sz w:val="24"/>
+          <w:szCs w:val="24"/>
+          <w:lang w:val="cs-CZ"/>
+        </w:rPr>
+        <w:t>640</w:t>
+      </w:r>
+    </w:p>
+    <w:p>
+      <w:pPr>
+        <w:rPr>
+          <w:sz w:val="24"/>
+          <w:szCs w:val="24"/>
+          <w:lang w:val="cs-CZ"/>
+        </w:rPr>
+      </w:pPr>
+      <w:r>
+        <w:rPr>
+          <w:sz w:val="24"/>
+          <w:szCs w:val="24"/>
+          <w:lang w:val="cs-CZ"/>
+        </w:rPr>
+        <w:t>Nigeria : $20</w:t>
+      </w:r>
+      <w:r>
+        <w:rPr>
+          <w:sz w:val="24"/>
+          <w:szCs w:val="24"/>
+          <w:lang w:val="cs-CZ"/>
+        </w:rPr>
+        <w:t>95</w:t>
+      </w:r>
+    </w:p>
+    <w:p>
+      <w:pPr>
+        <w:rPr>
+          <w:sz w:val="24"/>
+          <w:szCs w:val="24"/>
+          <w:lang w:val="cs-CZ"/>
+        </w:rPr>
+      </w:pPr>
+      <w:r>
+        <w:rPr>
+          <w:sz w:val="24"/>
+          <w:szCs w:val="24"/>
+          <w:lang w:val="cs-CZ"/>
+        </w:rPr>
+        <w:t>Total profit of OPEC cartel: $3</w:t>
+      </w:r>
+      <w:r>
+        <w:rPr>
+          <w:sz w:val="24"/>
+          <w:szCs w:val="24"/>
+          <w:lang w:val="cs-CZ"/>
+        </w:rPr>
+        <w:t>9306</w:t>
+      </w:r>
+    </w:p>
+    <w:p>
+      <w:pPr>
+        <w:rPr>
+          <w:b/>
+          <w:bCs/>
+          <w:sz w:val="28"/>
+          <w:szCs w:val="28"/>
+          <w:lang w:val="cs-CZ"/>
+        </w:rPr>
+      </w:pPr>
+    </w:p>
+    <w:p>
+      <w:pPr>
+        <w:rPr>
+          <w:sz w:val="24"/>
+          <w:szCs w:val="24"/>
+          <w:lang w:val="cs-CZ"/>
+        </w:rPr>
+      </w:pPr>
+    </w:p>
+    <w:p>
+      <w:pPr>
+        <w:rPr>
+          <w:b/>
+          <w:bCs/>
+          <w:sz w:val="28"/>
+          <w:szCs w:val="28"/>
+          <w:lang w:val="cs-CZ"/>
+        </w:rPr>
+      </w:pPr>
+      <w:r>
+        <w:rPr>
+          <w:b/>
+          <w:bCs/>
+          <w:sz w:val="28"/>
+          <w:szCs w:val="28"/>
+          <w:lang w:val="cs-CZ"/>
+        </w:rPr>
+        <w:t xml:space="preserve">SCENARIO </w:t>
+      </w:r>
+      <w:r>
+        <w:rPr>
+          <w:b/>
+          <w:bCs/>
+          <w:sz w:val="28"/>
+          <w:szCs w:val="28"/>
+          <w:lang w:val="cs-CZ"/>
+        </w:rPr>
+        <w:t>2</w:t>
+      </w:r>
+      <w:r>
+        <w:rPr>
+          <w:b/>
+          <w:bCs/>
+          <w:sz w:val="28"/>
+          <w:szCs w:val="28"/>
+          <w:lang w:val="cs-CZ"/>
+        </w:rPr>
+        <w:t xml:space="preserve"> – </w:t>
+      </w:r>
+      <w:r>
+        <w:rPr>
+          <w:b/>
+          <w:bCs/>
+          <w:sz w:val="28"/>
+          <w:szCs w:val="28"/>
+          <w:lang w:val="cs-CZ"/>
+        </w:rPr>
+        <w:t>All OPEC members follow quotas</w:t>
+      </w:r>
+    </w:p>
+    <w:p>
+      <w:pPr>
+        <w:rPr>
+          <w:b/>
+          <w:bCs/>
+          <w:sz w:val="28"/>
+          <w:szCs w:val="28"/>
+          <w:lang w:val="cs-CZ"/>
+        </w:rPr>
+      </w:pPr>
+    </w:p>
+    <w:p>
+      <w:pPr>
+        <w:rPr>
+          <w:b/>
+          <w:bCs/>
+          <w:sz w:val="28"/>
+          <w:szCs w:val="28"/>
+          <w:lang w:val="cs-CZ"/>
+        </w:rPr>
+      </w:pPr>
+    </w:p>
+    <w:p>
+      <w:pPr>
+        <w:rPr>
+          <w:b/>
+          <w:bCs/>
+          <w:sz w:val="28"/>
+          <w:szCs w:val="28"/>
+          <w:lang w:val="cs-CZ"/>
+        </w:rPr>
+      </w:pPr>
+    </w:p>
+    <w:p>
+      <w:pPr>
+        <w:rPr>
+          <w:b/>
+          <w:bCs/>
+          <w:sz w:val="28"/>
+          <w:szCs w:val="28"/>
+          <w:lang w:val="cs-CZ"/>
+        </w:rPr>
+      </w:pPr>
+    </w:p>
+    <w:p>
+      <w:pPr>
+        <w:rPr>
+          <w:b/>
+          <w:bCs/>
+          <w:sz w:val="28"/>
+          <w:szCs w:val="28"/>
+          <w:lang w:val="cs-CZ"/>
+        </w:rPr>
+      </w:pPr>
+    </w:p>
+    <w:p>
+      <w:pPr>
+        <w:rPr>
+          <w:b/>
+          <w:bCs/>
+          <w:sz w:val="28"/>
+          <w:szCs w:val="28"/>
+          <w:lang w:val="cs-CZ"/>
+        </w:rPr>
+      </w:pPr>
+    </w:p>
+    <w:p>
+      <w:pPr>
+        <w:rPr>
+          <w:b/>
+          <w:bCs/>
+          <w:sz w:val="28"/>
+          <w:szCs w:val="28"/>
+          <w:lang w:val="cs-CZ"/>
+        </w:rPr>
+      </w:pPr>
+    </w:p>
+    <w:p>
+      <w:pPr>
+        <w:rPr>
+          <w:b/>
+          <w:bCs/>
+          <w:sz w:val="28"/>
+          <w:szCs w:val="28"/>
+          <w:lang w:val="cs-CZ"/>
+        </w:rPr>
+      </w:pPr>
+    </w:p>
+    <w:p>
+      <w:pPr>
+        <w:rPr>
+          <w:b/>
+          <w:bCs/>
+          <w:sz w:val="28"/>
+          <w:szCs w:val="28"/>
+          <w:lang w:val="cs-CZ"/>
+        </w:rPr>
+      </w:pPr>
+    </w:p>
+    <w:p>
+      <w:pPr>
+        <w:rPr>
+          <w:b/>
+          <w:bCs/>
+          <w:sz w:val="28"/>
+          <w:szCs w:val="28"/>
+          <w:lang w:val="cs-CZ"/>
+        </w:rPr>
+      </w:pPr>
+      <w:r>
+        <w:rPr>
+          <w:b/>
+          <w:bCs/>
+          <w:sz w:val="28"/>
+          <w:szCs w:val="28"/>
+          <w:lang w:val="cs-CZ"/>
+        </w:rPr>
+        <w:t>SCENARIO 3 – Saudi Arabia doesn’t flood the market</w:t>
+      </w:r>
+    </w:p>
+    <w:p>
+      <w:pPr>
+        <w:rPr>
+          <w:b/>
+          <w:bCs/>
+          <w:sz w:val="28"/>
+          <w:szCs w:val="28"/>
+          <w:lang w:val="cs-CZ"/>
+        </w:rPr>
+      </w:pPr>
+    </w:p>
+    <w:p>
+      <w:pPr>
+        <w:rPr>
+          <w:b/>
+          <w:bCs/>
+          <w:sz w:val="28"/>
+          <w:szCs w:val="28"/>
+          <w:lang w:val="cs-CZ"/>
+        </w:rPr>
+      </w:pPr>
+      <w:r>
+        <w:rPr>
+          <w:b/>
+          <w:bCs/>
+          <w:sz w:val="28"/>
+          <w:szCs w:val="28"/>
+          <w:lang w:val="cs-CZ"/>
+        </w:rPr>
+        <w:t xml:space="preserve">SCENARIO </w:t>
+      </w:r>
+      <w:r>
+        <w:rPr>
+          <w:b/>
+          <w:bCs/>
+          <w:sz w:val="28"/>
+          <w:szCs w:val="28"/>
+          <w:lang w:val="cs-CZ"/>
+        </w:rPr>
+        <w:t xml:space="preserve">4…n </w:t>
+      </w:r>
+    </w:p>
+    <w:p>
+      <w:pPr>
+        <w:rPr>
+          <w:b/>
+          <w:bCs/>
+          <w:sz w:val="28"/>
+          <w:szCs w:val="28"/>
+          <w:lang w:val="cs-CZ"/>
+        </w:rPr>
+      </w:pPr>
+    </w:p>
+    <w:p>
+      <w:pPr>
+        <w:rPr>
+          <w:b/>
+          <w:bCs/>
+          <w:sz w:val="28"/>
+          <w:szCs w:val="28"/>
+          <w:lang w:val="cs-CZ"/>
+        </w:rPr>
+      </w:pPr>
+    </w:p>
+    <w:p>
+      <w:pPr>
+        <w:rPr>
+          <w:b/>
+          <w:bCs/>
+          <w:sz w:val="28"/>
+          <w:szCs w:val="28"/>
+          <w:lang w:val="cs-CZ"/>
+        </w:rPr>
+      </w:pPr>
+    </w:p>
+    <w:p>
+      <w:pPr>
+        <w:rPr>
+          <w:b/>
+          <w:bCs/>
+          <w:sz w:val="28"/>
+          <w:szCs w:val="28"/>
+          <w:lang w:val="cs-CZ"/>
+        </w:rPr>
+      </w:pPr>
+    </w:p>
+    <w:p>
+      <w:pPr>
+        <w:rPr>
+          <w:lang w:val="cs-CZ"/>
+        </w:rPr>
+      </w:pPr>
+      <w:r>
+        <w:rPr>
+          <w:lang w:val="cs-CZ"/>
+        </w:rPr>
         <w:t>1. Model: Ten by na tuto konzultaci měl být již finální nebo blízký finalizaci.</w:t>
       </w:r>
       <w:r>
@@ -98,121 +1235,166 @@
         </w:rPr>
         <w:br/>
       </w:r>
-      <w:hyperlink r:id="rId5" w:tgtFrame="_blank" w:history="1">
+      <w:hyperlink r:id="rId7" w:tgtFrame="_blank" w:history="1">
         <w:r>
           <w:rPr>
             <w:rStyle w:val="Hyperlink"/>
             <w:lang w:val="cs-CZ"/>
           </w:rPr>
-          <w:t>https://www.fi.muni.cz/~xpelanek/IV109/?action=hodnoceni</w:t>
+          <w:t>https://www.fi.muni.cz/~xpelanek/IV109/?action=</w:t>
         </w:r>
-      </w:hyperlink>
-      <w:r>
-        <w:rPr>
-          <w:lang w:val="cs-CZ"/>
-        </w:rPr>
-        <w:t>). Pokud budete</w:t>
-      </w:r>
-      <w:r>
-        <w:rPr>
-          <w:lang w:val="cs-CZ"/>
-        </w:rPr>
-        <w:br/>
-        <w:t>mít</w:t>
-      </w:r>
-      <w:r>
-        <w:rPr>
-          <w:lang w:val="cs-CZ"/>
-        </w:rPr>
-        <w:br/>
-        <w:t>draft připravený, dám vám k němu rychlou zpětnou vazbu či zodpovím dotazy k</w:t>
-      </w:r>
-      <w:r>
-        <w:rPr>
-          <w:lang w:val="cs-CZ"/>
-        </w:rPr>
-        <w:br/>
-        <w:t>nejasnostem.</w:t>
-      </w:r>
-    </w:p>
-    <w:p>
-      <w:pPr>
-        <w:rPr>
-          <w:lang w:val="cs-CZ"/>
-        </w:rPr>
-      </w:pPr>
-    </w:p>
-    <w:p>
-      <w:pPr>
-        <w:rPr>
-          <w:lang w:val="cs-CZ"/>
-        </w:rPr>
-      </w:pPr>
-      <w:hyperlink r:id="rId6" w:history="1">
         <w:r>
           <w:rPr>
             <w:rStyle w:val="Hyperlink"/>
             <w:lang w:val="cs-CZ"/>
           </w:rPr>
-          <w:t>https://www.jstor.org/stable/1818638?seq=1</w:t>
+          <w:t>h</w:t>
         </w:r>
-      </w:hyperlink>
-    </w:p>
-    <w:p>
-      <w:hyperlink r:id="rId7" w:history="1">
         <w:r>
           <w:rPr>
             <w:rStyle w:val="Hyperlink"/>
             <w:lang w:val="cs-CZ"/>
           </w:rPr>
-          <w:t>https://files.econ.cam.ac.uk/people-files/faculty/km418/IIEA/IIEA_2018_Conference/Papers/Ghoddusi_On%20Quota%20Violations%20of%20OPEC%20Members.pdf</w:t>
+          <w:t>odnoceni</w:t>
         </w:r>
       </w:hyperlink>
-    </w:p>
-    <w:p>
-      <w:pPr>
-        <w:rPr>
-          <w:b/>
-          <w:bCs/>
-        </w:rPr>
-      </w:pPr>
-    </w:p>
-    <w:p>
-      <w:pPr>
-        <w:rPr>
-          <w:b/>
-          <w:bCs/>
-        </w:rPr>
-      </w:pPr>
-      <w:proofErr w:type="spellStart"/>
-      <w:r>
-        <w:rPr>
-          <w:b/>
-          <w:bCs/>
-        </w:rPr>
-        <w:t>Cournotuv</w:t>
-      </w:r>
-      <w:proofErr w:type="spellEnd"/>
-      <w:r>
-        <w:rPr>
-          <w:b/>
-          <w:bCs/>
-        </w:rPr>
-        <w:t xml:space="preserve"> </w:t>
-      </w:r>
-      <w:proofErr w:type="spellStart"/>
-      <w:r>
-        <w:rPr>
-          <w:b/>
-          <w:bCs/>
-        </w:rPr>
-        <w:t>oligopol</w:t>
-      </w:r>
-      <w:proofErr w:type="spellEnd"/>
-    </w:p>
-    <w:p>
-      <w:pPr>
-        <w:rPr>
+      <w:r>
+        <w:rPr>
+          <w:lang w:val="cs-CZ"/>
+        </w:rPr>
+        <w:t>). Pokud budete</w:t>
+      </w:r>
+      <w:r>
+        <w:rPr>
+          <w:lang w:val="cs-CZ"/>
+        </w:rPr>
+        <w:br/>
+        <w:t>mít</w:t>
+      </w:r>
+      <w:r>
+        <w:rPr>
+          <w:lang w:val="cs-CZ"/>
+        </w:rPr>
+        <w:br/>
+        <w:t>draft připravený, dám vám k němu rychlou zpětnou vazbu či zodpovím dotazy k</w:t>
+      </w:r>
+      <w:r>
+        <w:rPr>
+          <w:lang w:val="cs-CZ"/>
+        </w:rPr>
+        <w:br/>
+        <w:t>nejasnostem.</w:t>
+      </w:r>
+    </w:p>
+    <w:p>
+      <w:pPr>
+        <w:rPr>
+          <w:lang w:val="cs-CZ"/>
+        </w:rPr>
+      </w:pPr>
+    </w:p>
+    <w:p>
+      <w:pPr>
+        <w:rPr>
+          <w:b/>
+          <w:bCs/>
+          <w:lang w:val="cs-CZ"/>
+        </w:rPr>
+      </w:pPr>
+    </w:p>
+    <w:p>
+      <w:pPr>
+        <w:rPr>
+          <w:lang w:val="cs-CZ"/>
+        </w:rPr>
+      </w:pPr>
+    </w:p>
+    <w:p>
+      <w:pPr>
+        <w:rPr>
+          <w:b/>
+          <w:bCs/>
+          <w:lang w:val="cs-CZ"/>
+        </w:rPr>
+      </w:pPr>
+      <w:r>
+        <w:rPr>
+          <w:b/>
+          <w:bCs/>
+          <w:lang w:val="cs-CZ"/>
+        </w:rPr>
+        <w:t>Navrh změny názvu</w:t>
+      </w:r>
+    </w:p>
+    <w:p>
+      <w:pPr>
+        <w:rPr>
+          <w:lang w:val="cs-CZ"/>
+        </w:rPr>
+      </w:pPr>
+      <w:r>
+        <w:rPr>
+          <w:lang w:val="cs-CZ"/>
+        </w:rPr>
+        <w:t>Repeated Game Simulation of OPEC behaviour</w:t>
+      </w:r>
+    </w:p>
+    <w:p>
+      <w:pPr>
+        <w:rPr>
+          <w:b/>
+          <w:bCs/>
+          <w:sz w:val="28"/>
+          <w:szCs w:val="28"/>
+          <w:lang w:val="cs-CZ"/>
+        </w:rPr>
+      </w:pPr>
+    </w:p>
+    <w:p>
+      <w:pPr>
+        <w:rPr>
+          <w:b/>
+          <w:bCs/>
+          <w:sz w:val="28"/>
+          <w:szCs w:val="28"/>
+          <w:lang w:val="cs-CZ"/>
+        </w:rPr>
+      </w:pPr>
+      <w:r>
+        <w:rPr>
+          <w:b/>
+          <w:bCs/>
+          <w:sz w:val="28"/>
+          <w:szCs w:val="28"/>
+          <w:lang w:val="cs-CZ"/>
+        </w:rPr>
+        <w:t>Source</w:t>
+      </w:r>
+    </w:p>
+    <w:p>
+      <w:pPr>
+        <w:rPr>
+          <w:sz w:val="24"/>
+          <w:szCs w:val="24"/>
+          <w:lang w:val="cs-CZ"/>
+        </w:rPr>
+      </w:pPr>
+      <w:r>
+        <w:rPr>
+          <w:sz w:val="24"/>
+          <w:szCs w:val="24"/>
+          <w:lang w:val="cs-CZ"/>
+        </w:rPr>
+        <w:t>OPEC behaviour: A Test of Alternative Hypotesis</w:t>
+      </w:r>
+    </w:p>
+    <w:p>
+      <w:pPr>
+        <w:rPr>
+          <w:b/>
+          <w:bCs/>
+          <w:sz w:val="28"/>
+          <w:szCs w:val="28"/>
           <w:lang w:val="cs-CZ"/>
         </w:rPr>
       </w:pPr>
@@ -220,219 +1402,161 @@
         <w:r>
           <w:rPr>
             <w:rStyle w:val="Hyperlink"/>
+            <w:b/>
+            <w:bCs/>
+            <w:sz w:val="28"/>
+            <w:szCs w:val="28"/>
             <w:lang w:val="cs-CZ"/>
           </w:rPr>
-          <w:t>https://homepages.math.uic.edu/~marker/stat473-s19/Cournot.pdf</w:t>
+          <w:t>https://oaktrust.library.tamu.edu/server/api/core/bitstreams/7baa611a-3399-41b8-b3fc-70381131baca/content</w:t>
         </w:r>
       </w:hyperlink>
     </w:p>
     <w:p>
       <w:pPr>
         <w:rPr>
-          <w:lang w:val="cs-CZ"/>
-        </w:rPr>
-      </w:pPr>
-    </w:p>
-    <w:p>
-      <w:pPr>
-        <w:rPr>
-          <w:b/>
-          <w:bCs/>
-          <w:lang w:val="cs-CZ"/>
-        </w:rPr>
-      </w:pPr>
-      <w:proofErr w:type="spellStart"/>
-      <w:r>
-        <w:rPr>
-          <w:b/>
-          <w:bCs/>
-          <w:lang w:val="cs-CZ"/>
-        </w:rPr>
-        <w:t>Navrh</w:t>
-      </w:r>
-      <w:proofErr w:type="spellEnd"/>
-      <w:r>
-        <w:rPr>
-          <w:b/>
-          <w:bCs/>
-          <w:lang w:val="cs-CZ"/>
-        </w:rPr>
-        <w:t xml:space="preserve"> změny názvu</w:t>
-      </w:r>
-    </w:p>
-    <w:p>
-      <w:pPr>
-        <w:rPr>
-          <w:lang w:val="cs-CZ"/>
-        </w:rPr>
-      </w:pPr>
-      <w:proofErr w:type="spellStart"/>
-      <w:r>
-        <w:rPr>
-          <w:lang w:val="cs-CZ"/>
-        </w:rPr>
-        <w:t>Repeated</w:t>
-      </w:r>
-      <w:proofErr w:type="spellEnd"/>
-      <w:r>
-        <w:rPr>
-          <w:lang w:val="cs-CZ"/>
-        </w:rPr>
-        <w:t xml:space="preserve"> Game </w:t>
-      </w:r>
-      <w:proofErr w:type="spellStart"/>
-      <w:r>
-        <w:rPr>
-          <w:lang w:val="cs-CZ"/>
-        </w:rPr>
-        <w:t>Simulation</w:t>
-      </w:r>
-      <w:proofErr w:type="spellEnd"/>
-      <w:r>
-        <w:rPr>
-          <w:lang w:val="cs-CZ"/>
-        </w:rPr>
-        <w:t xml:space="preserve"> </w:t>
-      </w:r>
-      <w:proofErr w:type="spellStart"/>
-      <w:r>
-        <w:rPr>
-          <w:lang w:val="cs-CZ"/>
-        </w:rPr>
-        <w:t>of</w:t>
-      </w:r>
-      <w:proofErr w:type="spellEnd"/>
-      <w:r>
-        <w:rPr>
-          <w:lang w:val="cs-CZ"/>
-        </w:rPr>
-        <w:t xml:space="preserve"> OPEC </w:t>
-      </w:r>
-      <w:proofErr w:type="spellStart"/>
-      <w:r>
-        <w:rPr>
-          <w:lang w:val="cs-CZ"/>
-        </w:rPr>
-        <w:t>behaviour</w:t>
-      </w:r>
-      <w:proofErr w:type="spellEnd"/>
-    </w:p>
-    <w:p>
-      <w:pPr>
-        <w:rPr>
-          <w:lang w:val="cs-CZ"/>
-        </w:rPr>
-      </w:pPr>
-    </w:p>
-    <w:p>
-      <w:pPr>
-        <w:rPr>
-          <w:lang w:val="cs-CZ"/>
-        </w:rPr>
-      </w:pPr>
-    </w:p>
-    <w:p>
-      <w:pPr>
-        <w:rPr>
-          <w:lang w:val="cs-CZ"/>
-        </w:rPr>
-      </w:pPr>
-    </w:p>
-    <w:p>
-      <w:pPr>
-        <w:rPr>
-          <w:lang w:val="cs-CZ"/>
-        </w:rPr>
-      </w:pPr>
-    </w:p>
-    <w:p>
-      <w:pPr>
-        <w:rPr>
-          <w:lang w:val="cs-CZ"/>
-        </w:rPr>
-      </w:pPr>
-    </w:p>
-    <w:p>
-      <w:pPr>
-        <w:rPr>
-          <w:lang w:val="cs-CZ"/>
-        </w:rPr>
-      </w:pPr>
-    </w:p>
-    <w:p>
-      <w:pPr>
-        <w:rPr>
-          <w:lang w:val="cs-CZ"/>
-        </w:rPr>
-      </w:pPr>
-    </w:p>
-    <w:p>
-      <w:pPr>
-        <w:rPr>
-          <w:lang w:val="cs-CZ"/>
-        </w:rPr>
-      </w:pPr>
-    </w:p>
-    <w:p>
-      <w:pPr>
-        <w:rPr>
-          <w:lang w:val="cs-CZ"/>
-        </w:rPr>
-      </w:pPr>
-    </w:p>
-    <w:p>
-      <w:pPr>
-        <w:rPr>
-          <w:lang w:val="cs-CZ"/>
-        </w:rPr>
-      </w:pPr>
-    </w:p>
-    <w:p>
-      <w:pPr>
-        <w:rPr>
-          <w:lang w:val="cs-CZ"/>
-        </w:rPr>
-      </w:pPr>
-    </w:p>
-    <w:p>
-      <w:pPr>
-        <w:rPr>
-          <w:lang w:val="cs-CZ"/>
-        </w:rPr>
-      </w:pPr>
-    </w:p>
-    <w:p>
-      <w:pPr>
-        <w:rPr>
-          <w:lang w:val="cs-CZ"/>
-        </w:rPr>
-      </w:pPr>
-    </w:p>
-    <w:p>
-      <w:pPr>
-        <w:rPr>
-          <w:lang w:val="cs-CZ"/>
-        </w:rPr>
-      </w:pPr>
-    </w:p>
-    <w:p>
-      <w:pPr>
-        <w:rPr>
-          <w:lang w:val="cs-CZ"/>
-        </w:rPr>
-      </w:pPr>
-    </w:p>
-    <w:p>
-      <w:pPr>
-        <w:rPr>
-          <w:lang w:val="cs-CZ"/>
-        </w:rPr>
-      </w:pPr>
-    </w:p>
-    <w:p>
-      <w:pPr>
-        <w:rPr>
-          <w:lang w:val="en-US"/>
+          <w:b/>
+          <w:bCs/>
+          <w:sz w:val="28"/>
+          <w:szCs w:val="28"/>
+          <w:lang w:val="cs-CZ"/>
+        </w:rPr>
+      </w:pPr>
+    </w:p>
+    <w:p>
+      <w:pPr>
+        <w:rPr>
+          <w:sz w:val="24"/>
+          <w:szCs w:val="24"/>
+          <w:lang w:val="cs-CZ"/>
+        </w:rPr>
+      </w:pPr>
+      <w:r>
+        <w:rPr>
+          <w:sz w:val="24"/>
+          <w:szCs w:val="24"/>
+          <w:lang w:val="cs-CZ"/>
+        </w:rPr>
+        <w:t>A Model for the Global Crude Oil Market Using a Multi-Pool MCP Approach</w:t>
+      </w:r>
+    </w:p>
+    <w:p>
+      <w:pPr>
+        <w:rPr>
+          <w:sz w:val="24"/>
+          <w:szCs w:val="24"/>
+          <w:lang w:val="cs-CZ"/>
+        </w:rPr>
+      </w:pPr>
+      <w:hyperlink r:id="rId9" w:history="1">
+        <w:r>
+          <w:rPr>
+            <w:rStyle w:val="Hyperlink"/>
+            <w:sz w:val="24"/>
+            <w:szCs w:val="24"/>
+            <w:lang w:val="cs-CZ"/>
+          </w:rPr>
+          <w:t>https://www.diw.de/documents/publikationen/73/diw_01.c.96394.de/dp869.pdf</w:t>
+        </w:r>
+      </w:hyperlink>
+    </w:p>
+    <w:p>
+      <w:pPr>
+        <w:rPr>
+          <w:sz w:val="24"/>
+          <w:szCs w:val="24"/>
+          <w:lang w:val="cs-CZ"/>
+        </w:rPr>
+      </w:pPr>
+    </w:p>
+    <w:p>
+      <w:pPr>
+        <w:rPr>
+          <w:lang w:val="cs-CZ"/>
+        </w:rPr>
+      </w:pPr>
+    </w:p>
+    <w:p>
+      <w:pPr>
+        <w:rPr>
+          <w:lang w:val="cs-CZ"/>
+        </w:rPr>
+      </w:pPr>
+    </w:p>
+    <w:p>
+      <w:pPr>
+        <w:rPr>
+          <w:lang w:val="cs-CZ"/>
+        </w:rPr>
+      </w:pPr>
+    </w:p>
+    <w:p>
+      <w:pPr>
+        <w:rPr>
+          <w:lang w:val="cs-CZ"/>
+        </w:rPr>
+      </w:pPr>
+    </w:p>
+    <w:p>
+      <w:pPr>
+        <w:rPr>
+          <w:lang w:val="cs-CZ"/>
+        </w:rPr>
+      </w:pPr>
+    </w:p>
+    <w:p>
+      <w:pPr>
+        <w:rPr>
+          <w:lang w:val="cs-CZ"/>
+        </w:rPr>
+      </w:pPr>
+    </w:p>
+    <w:p>
+      <w:pPr>
+        <w:rPr>
+          <w:lang w:val="cs-CZ"/>
+        </w:rPr>
+      </w:pPr>
+    </w:p>
+    <w:p>
+      <w:pPr>
+        <w:rPr>
+          <w:lang w:val="cs-CZ"/>
+        </w:rPr>
+      </w:pPr>
+    </w:p>
+    <w:p>
+      <w:pPr>
+        <w:rPr>
+          <w:lang w:val="cs-CZ"/>
+        </w:rPr>
+      </w:pPr>
+    </w:p>
+    <w:p>
+      <w:pPr>
+        <w:rPr>
+          <w:lang w:val="cs-CZ"/>
+        </w:rPr>
+      </w:pPr>
+    </w:p>
+    <w:p>
+      <w:pPr>
+        <w:rPr>
+          <w:lang w:val="cs-CZ"/>
+        </w:rPr>
+      </w:pPr>
+    </w:p>
+    <w:p>
+      <w:pPr>
+        <w:rPr>
+          <w:lang w:val="cs-CZ"/>
+        </w:rPr>
+      </w:pPr>
+    </w:p>
+    <w:p>
+      <w:pPr>
+        <w:rPr>
+          <w:lang w:val="cs-CZ"/>
         </w:rPr>
       </w:pPr>
     </w:p>
@@ -909,6 +2033,7 @@
   <w:style w:type="paragraph" w:default="1" w:styleId="Normal">
     <w:name w:val="Normal"/>
     <w:qFormat/>
+    <w:rsid w:val="0075029B"/>
     <w:rPr>
       <w:lang w:val="en-GB"/>
     </w:rPr>

</xml_diff>

<commit_message>
fixed typo in report!
</commit_message>
<xml_diff>
--- a/report_notes.docx
+++ b/report_notes.docx
@@ -70,17 +70,7 @@
           <w:szCs w:val="28"/>
           <w:lang w:val="en-US"/>
         </w:rPr>
-        <w:t xml:space="preserve"> base - </w:t>
-      </w:r>
-      <w:r>
-        <w:rPr>
-          <w:b/>
-          <w:bCs/>
-          <w:sz w:val="28"/>
-          <w:szCs w:val="28"/>
-          <w:lang w:val="en-US"/>
-        </w:rPr>
-        <w:t>Cournot Oligopoly</w:t>
+        <w:t xml:space="preserve"> base - Cournot Oligopoly</w:t>
       </w:r>
     </w:p>
     <w:p>
@@ -113,23 +103,7 @@
           <w:szCs w:val="24"/>
           <w:lang w:val="en-US"/>
         </w:rPr>
-        <w:t xml:space="preserve"> of goods they produce. </w:t>
-      </w:r>
-      <w:r>
-        <w:rPr>
-          <w:sz w:val="24"/>
-          <w:szCs w:val="24"/>
-          <w:lang w:val="en-US"/>
-        </w:rPr>
-        <w:t xml:space="preserve">The market price is then determined from total output using the </w:t>
-      </w:r>
-      <w:r>
-        <w:rPr>
-          <w:sz w:val="24"/>
-          <w:szCs w:val="24"/>
-          <w:lang w:val="en-US"/>
-        </w:rPr>
-        <w:t>inverse demand function:</w:t>
+        <w:t xml:space="preserve"> of goods they produce. The market price is then determined from total output using the inverse demand function:</w:t>
       </w:r>
     </w:p>
     <w:p>
@@ -205,7 +179,6 @@
         </w:rPr>
         <w:t xml:space="preserve"> </w:t>
       </w:r>
-      <w:proofErr w:type="spellStart"/>
       <w:r>
         <w:rPr>
           <w:sz w:val="24"/>
@@ -222,7 +195,6 @@
         </w:rPr>
         <w:t>Q</w:t>
       </w:r>
-      <w:proofErr w:type="spellEnd"/>
     </w:p>
     <w:p>
       <w:pPr>
@@ -333,31 +305,7 @@
           <w:szCs w:val="24"/>
           <w:lang w:val="en-US"/>
         </w:rPr>
-        <w:t xml:space="preserve"> a demand curve </w:t>
-      </w:r>
-      <w:r>
-        <w:rPr>
-          <w:sz w:val="24"/>
-          <w:szCs w:val="24"/>
-          <w:lang w:val="en-US"/>
-        </w:rPr>
-        <w:t xml:space="preserve">was calibrated </w:t>
-      </w:r>
-      <w:r>
-        <w:rPr>
-          <w:sz w:val="24"/>
-          <w:szCs w:val="24"/>
-          <w:lang w:val="en-US"/>
-        </w:rPr>
-        <w:t>to an initial market equilibrium</w:t>
-      </w:r>
-      <w:r>
-        <w:rPr>
-          <w:sz w:val="24"/>
-          <w:szCs w:val="24"/>
-          <w:lang w:val="en-US"/>
-        </w:rPr>
-        <w:t xml:space="preserve">. This approach was used mainly because parameter </w:t>
+        <w:t xml:space="preserve"> a demand curve was calibrated to an initial market equilibrium. This approach was used mainly because parameter </w:t>
       </w:r>
       <w:r>
         <w:rPr>
@@ -401,25 +349,7 @@
           <w:szCs w:val="24"/>
           <w:lang w:val="en-US"/>
         </w:rPr>
-        <w:t xml:space="preserve">P = </w:t>
-      </w:r>
-      <w:proofErr w:type="spellStart"/>
-      <w:r>
-        <w:rPr>
-          <w:sz w:val="24"/>
-          <w:szCs w:val="24"/>
-          <w:lang w:val="en-US"/>
-        </w:rPr>
-        <w:t>P_base</w:t>
-      </w:r>
-      <w:proofErr w:type="spellEnd"/>
-      <w:r>
-        <w:rPr>
-          <w:sz w:val="24"/>
-          <w:szCs w:val="24"/>
-          <w:lang w:val="en-US"/>
-        </w:rPr>
-        <w:t xml:space="preserve"> – </w:t>
+        <w:t xml:space="preserve">P = P_base – </w:t>
       </w:r>
       <w:r>
         <w:rPr>
@@ -435,79 +365,41 @@
           <w:szCs w:val="24"/>
           <w:lang w:val="en-US"/>
         </w:rPr>
-        <w:t xml:space="preserve"> * (Q – </w:t>
-      </w:r>
-      <w:proofErr w:type="spellStart"/>
-      <w:r>
-        <w:rPr>
-          <w:sz w:val="24"/>
-          <w:szCs w:val="24"/>
-          <w:lang w:val="en-US"/>
-        </w:rPr>
-        <w:t>Q_base</w:t>
-      </w:r>
-      <w:proofErr w:type="spellEnd"/>
-      <w:r>
-        <w:rPr>
-          <w:sz w:val="24"/>
-          <w:szCs w:val="24"/>
-          <w:lang w:val="en-US"/>
-        </w:rPr>
-        <w:t>)</w:t>
-      </w:r>
-    </w:p>
-    <w:p>
-      <w:pPr>
-        <w:rPr>
-          <w:sz w:val="24"/>
-          <w:szCs w:val="24"/>
-          <w:lang w:val="en-US"/>
-        </w:rPr>
-      </w:pPr>
-      <w:proofErr w:type="spellStart"/>
-      <w:r>
-        <w:rPr>
-          <w:sz w:val="24"/>
-          <w:szCs w:val="24"/>
-          <w:lang w:val="en-US"/>
-        </w:rPr>
-        <w:t>P_base</w:t>
-      </w:r>
-      <w:proofErr w:type="spellEnd"/>
-      <w:r>
-        <w:rPr>
-          <w:sz w:val="24"/>
-          <w:szCs w:val="24"/>
-          <w:lang w:val="en-US"/>
-        </w:rPr>
-        <w:t>…historically observed equilibrium price</w:t>
-      </w:r>
-    </w:p>
-    <w:p>
-      <w:pPr>
-        <w:rPr>
-          <w:sz w:val="24"/>
-          <w:szCs w:val="24"/>
-          <w:lang w:val="en-US"/>
-        </w:rPr>
-      </w:pPr>
-      <w:proofErr w:type="spellStart"/>
-      <w:r>
-        <w:rPr>
-          <w:sz w:val="24"/>
-          <w:szCs w:val="24"/>
-          <w:lang w:val="en-US"/>
-        </w:rPr>
-        <w:t>Q_base</w:t>
-      </w:r>
-      <w:proofErr w:type="spellEnd"/>
-      <w:r>
-        <w:rPr>
-          <w:sz w:val="24"/>
-          <w:szCs w:val="24"/>
-          <w:lang w:val="en-US"/>
-        </w:rPr>
-        <w:t>…</w:t>
+        <w:t xml:space="preserve"> * (Q – Q_base)</w:t>
+      </w:r>
+    </w:p>
+    <w:p>
+      <w:pPr>
+        <w:rPr>
+          <w:sz w:val="24"/>
+          <w:szCs w:val="24"/>
+          <w:lang w:val="en-US"/>
+        </w:rPr>
+      </w:pPr>
+      <w:r>
+        <w:rPr>
+          <w:sz w:val="24"/>
+          <w:szCs w:val="24"/>
+          <w:lang w:val="en-US"/>
+        </w:rPr>
+        <w:t>P_base…historically observed equilibrium price</w:t>
+      </w:r>
+    </w:p>
+    <w:p>
+      <w:pPr>
+        <w:rPr>
+          <w:sz w:val="24"/>
+          <w:szCs w:val="24"/>
+          <w:lang w:val="en-US"/>
+        </w:rPr>
+      </w:pPr>
+      <w:r>
+        <w:rPr>
+          <w:sz w:val="24"/>
+          <w:szCs w:val="24"/>
+          <w:lang w:val="en-US"/>
+        </w:rPr>
+        <w:t>Q_base…</w:t>
       </w:r>
       <w:r>
         <w:rPr>
@@ -655,6 +547,7 @@
         <w:rPr>
           <w:b/>
           <w:bCs/>
+          <w:noProof/>
           <w:sz w:val="28"/>
           <w:szCs w:val="28"/>
           <w:lang w:val="en-US"/>
@@ -728,6 +621,7 @@
         <w:rPr>
           <w:b/>
           <w:bCs/>
+          <w:noProof/>
           <w:sz w:val="28"/>
           <w:szCs w:val="28"/>
           <w:lang w:val="en-US"/>
@@ -870,7 +764,15 @@
                 <w:szCs w:val="24"/>
                 <w:lang w:val="en-US"/>
               </w:rPr>
-              <w:t>Saudia Arabie</w:t>
+              <w:t>Saudia Arabi</w:t>
+            </w:r>
+            <w:r>
+              <w:rPr>
+                <w:sz w:val="24"/>
+                <w:szCs w:val="24"/>
+                <w:lang w:val="en-US"/>
+              </w:rPr>
+              <w:t>a</w:t>
             </w:r>
           </w:p>
         </w:tc>
@@ -1112,37 +1014,7 @@
           <w:szCs w:val="28"/>
           <w:lang w:val="en-US"/>
         </w:rPr>
-        <w:t xml:space="preserve">SCENARIO </w:t>
-      </w:r>
-      <w:r>
-        <w:rPr>
-          <w:b/>
-          <w:bCs/>
-          <w:sz w:val="28"/>
-          <w:szCs w:val="28"/>
-          <w:lang w:val="en-US"/>
-        </w:rPr>
-        <w:t>2</w:t>
-      </w:r>
-      <w:r>
-        <w:rPr>
-          <w:b/>
-          <w:bCs/>
-          <w:sz w:val="28"/>
-          <w:szCs w:val="28"/>
-          <w:lang w:val="en-US"/>
-        </w:rPr>
-        <w:t xml:space="preserve"> – </w:t>
-      </w:r>
-      <w:r>
-        <w:rPr>
-          <w:b/>
-          <w:bCs/>
-          <w:sz w:val="28"/>
-          <w:szCs w:val="28"/>
-          <w:lang w:val="en-US"/>
-        </w:rPr>
-        <w:t xml:space="preserve">All OPEC </w:t>
+        <w:t xml:space="preserve">SCENARIO 2 – All OPEC </w:t>
       </w:r>
       <w:r>
         <w:rPr>
@@ -1219,12 +1091,13 @@
         <w:rPr>
           <w:b/>
           <w:bCs/>
+          <w:noProof/>
           <w:sz w:val="28"/>
           <w:szCs w:val="28"/>
           <w:lang w:val="en-US"/>
         </w:rPr>
         <w:drawing>
-          <wp:anchor distT="0" distB="0" distL="114300" distR="114300" simplePos="0" relativeHeight="251661312" behindDoc="1" locked="0" layoutInCell="1" allowOverlap="1" wp14:anchorId="18F5807C" wp14:editId="058266B5">
+          <wp:anchor distT="0" distB="0" distL="114300" distR="114300" simplePos="0" relativeHeight="251661312" behindDoc="1" locked="0" layoutInCell="1" allowOverlap="1" wp14:anchorId="18F5807C" wp14:editId="746C0034">
             <wp:simplePos x="0" y="0"/>
             <wp:positionH relativeFrom="column">
               <wp:posOffset>2806198</wp:posOffset>
@@ -1300,6 +1173,7 @@
         <w:rPr>
           <w:b/>
           <w:bCs/>
+          <w:noProof/>
           <w:sz w:val="28"/>
           <w:szCs w:val="28"/>
           <w:lang w:val="en-US"/>
@@ -1421,7 +1295,15 @@
                 <w:szCs w:val="24"/>
                 <w:lang w:val="en-US"/>
               </w:rPr>
-              <w:t>Saudia Arabie</w:t>
+              <w:t>Saudia Arabi</w:t>
+            </w:r>
+            <w:r>
+              <w:rPr>
+                <w:sz w:val="24"/>
+                <w:szCs w:val="24"/>
+                <w:lang w:val="en-US"/>
+              </w:rPr>
+              <w:t>a</w:t>
             </w:r>
           </w:p>
         </w:tc>
@@ -1663,6 +1545,7 @@
         <w:rPr>
           <w:b/>
           <w:bCs/>
+          <w:noProof/>
           <w:sz w:val="28"/>
           <w:szCs w:val="28"/>
           <w:lang w:val="en-US"/>
@@ -1736,6 +1619,7 @@
         <w:rPr>
           <w:b/>
           <w:bCs/>
+          <w:noProof/>
           <w:sz w:val="28"/>
           <w:szCs w:val="28"/>
           <w:lang w:val="en-US"/>
@@ -1824,6 +1708,16 @@
         </w:rPr>
         <w:t>Saves the Market</w:t>
       </w:r>
+      <w:r>
+        <w:rPr>
+          <w:b/>
+          <w:bCs/>
+          <w:sz w:val="28"/>
+          <w:szCs w:val="28"/>
+          <w:lang w:val="en-US"/>
+        </w:rPr>
+        <w:t xml:space="preserve"> Price</w:t>
+      </w:r>
     </w:p>
     <w:p>
       <w:pPr>
@@ -1868,7 +1762,15 @@
                 <w:szCs w:val="24"/>
                 <w:lang w:val="en-US"/>
               </w:rPr>
-              <w:t>Saudia Arabie</w:t>
+              <w:t>Saudia Arabi</w:t>
+            </w:r>
+            <w:r>
+              <w:rPr>
+                <w:sz w:val="24"/>
+                <w:szCs w:val="24"/>
+                <w:lang w:val="en-US"/>
+              </w:rPr>
+              <w:t>a</w:t>
             </w:r>
           </w:p>
         </w:tc>
@@ -2131,6 +2033,7 @@
         <w:rPr>
           <w:b/>
           <w:bCs/>
+          <w:noProof/>
           <w:sz w:val="28"/>
           <w:szCs w:val="28"/>
           <w:lang w:val="en-US"/>
@@ -2207,53 +2110,24 @@
           <w:szCs w:val="28"/>
           <w:lang w:val="en-US"/>
         </w:rPr>
-        <w:t xml:space="preserve">SCENARIO </w:t>
-      </w:r>
-      <w:r>
-        <w:rPr>
-          <w:b/>
-          <w:bCs/>
-          <w:sz w:val="28"/>
-          <w:szCs w:val="28"/>
-          <w:lang w:val="en-US"/>
-        </w:rPr>
-        <w:t>4</w:t>
-      </w:r>
-      <w:r>
-        <w:rPr>
-          <w:b/>
-          <w:bCs/>
-          <w:sz w:val="28"/>
-          <w:szCs w:val="28"/>
-          <w:lang w:val="en-US"/>
-        </w:rPr>
-        <w:t xml:space="preserve"> – </w:t>
-      </w:r>
-      <w:r>
-        <w:rPr>
-          <w:b/>
-          <w:bCs/>
-          <w:sz w:val="28"/>
-          <w:szCs w:val="28"/>
-          <w:lang w:val="en-US"/>
-        </w:rPr>
-        <w:t>Maximal possible production, ignore quotas</w:t>
-      </w:r>
-    </w:p>
-    <w:p>
-      <w:pPr>
-        <w:rPr>
-          <w:b/>
-          <w:bCs/>
-          <w:sz w:val="28"/>
-          <w:szCs w:val="28"/>
-          <w:lang w:val="en-US"/>
-        </w:rPr>
-      </w:pPr>
-      <w:r>
-        <w:rPr>
-          <w:b/>
-          <w:bCs/>
+        <w:t>SCENARIO 4 – Maximal possible production, ignore quotas</w:t>
+      </w:r>
+    </w:p>
+    <w:p>
+      <w:pPr>
+        <w:rPr>
+          <w:b/>
+          <w:bCs/>
+          <w:sz w:val="28"/>
+          <w:szCs w:val="28"/>
+          <w:lang w:val="en-US"/>
+        </w:rPr>
+      </w:pPr>
+      <w:r>
+        <w:rPr>
+          <w:b/>
+          <w:bCs/>
+          <w:noProof/>
           <w:sz w:val="28"/>
           <w:szCs w:val="28"/>
           <w:lang w:val="en-US"/>
@@ -2355,7 +2229,15 @@
                 <w:szCs w:val="24"/>
                 <w:lang w:val="en-US"/>
               </w:rPr>
-              <w:t>Saudia Arabie</w:t>
+              <w:t>Saudia Arabi</w:t>
+            </w:r>
+            <w:r>
+              <w:rPr>
+                <w:sz w:val="24"/>
+                <w:szCs w:val="24"/>
+                <w:lang w:val="en-US"/>
+              </w:rPr>
+              <w:t>a</w:t>
             </w:r>
           </w:p>
         </w:tc>
@@ -2619,36 +2501,8 @@
           <w:szCs w:val="24"/>
           <w:lang w:val="en-US"/>
         </w:rPr>
-        <w:t xml:space="preserve">OPEC </w:t>
-      </w:r>
-      <w:proofErr w:type="spellStart"/>
-      <w:r>
-        <w:rPr>
-          <w:sz w:val="24"/>
-          <w:szCs w:val="24"/>
-          <w:lang w:val="en-US"/>
-        </w:rPr>
-        <w:t>behaviour</w:t>
-      </w:r>
-      <w:proofErr w:type="spellEnd"/>
-      <w:r>
-        <w:rPr>
-          <w:sz w:val="24"/>
-          <w:szCs w:val="24"/>
-          <w:lang w:val="en-US"/>
-        </w:rPr>
-        <w:t xml:space="preserve">: A Test of Alternative </w:t>
-      </w:r>
-      <w:proofErr w:type="spellStart"/>
-      <w:r>
-        <w:rPr>
-          <w:sz w:val="24"/>
-          <w:szCs w:val="24"/>
-          <w:lang w:val="en-US"/>
-        </w:rPr>
-        <w:t>Hypotesis</w:t>
-      </w:r>
-      <w:proofErr w:type="spellEnd"/>
+        <w:t>OPEC behaviour: A Test of Alternative Hypotesis</w:t>
+      </w:r>
     </w:p>
     <w:p>
       <w:pPr>
@@ -3502,6 +3356,7 @@
   <w:style w:type="character" w:default="1" w:styleId="DefaultParagraphFont">
     <w:name w:val="Default Paragraph Font"/>
     <w:uiPriority w:val="1"/>
+    <w:semiHidden/>
     <w:unhideWhenUsed/>
   </w:style>
   <w:style w:type="table" w:default="1" w:styleId="TableNormal">

</xml_diff>

<commit_message>
fist page of report
</commit_message>
<xml_diff>
--- a/report_notes.docx
+++ b/report_notes.docx
@@ -83,31 +83,116 @@
           <w:lang w:val="en-US"/>
         </w:rPr>
       </w:pPr>
-      <w:proofErr w:type="spellStart"/>
-      <w:r>
-        <w:rPr>
-          <w:sz w:val="24"/>
-          <w:szCs w:val="24"/>
-          <w:lang w:val="en-US"/>
-        </w:rPr>
-        <w:t>Implemetation</w:t>
-      </w:r>
-      <w:proofErr w:type="spellEnd"/>
-      <w:r>
-        <w:rPr>
-          <w:sz w:val="24"/>
-          <w:szCs w:val="24"/>
-          <w:lang w:val="en-US"/>
-        </w:rPr>
-        <w:t xml:space="preserve"> done in Python</w:t>
-      </w:r>
-      <w:r>
-        <w:rPr>
-          <w:sz w:val="24"/>
-          <w:szCs w:val="24"/>
-          <w:lang w:val="en-US"/>
-        </w:rPr>
-        <w:t xml:space="preserve"> s</w:t>
+      <w:r>
+        <w:rPr>
+          <w:sz w:val="24"/>
+          <w:szCs w:val="24"/>
+          <w:lang w:val="en-US"/>
+        </w:rPr>
+        <w:t>The project implements repeated game-theoretic model to analyze the evolution of</w:t>
+      </w:r>
+      <w:r>
+        <w:rPr>
+          <w:sz w:val="24"/>
+          <w:szCs w:val="24"/>
+          <w:lang w:val="en-US"/>
+        </w:rPr>
+        <w:t xml:space="preserve"> crude oil prices </w:t>
+      </w:r>
+      <w:r>
+        <w:rPr>
+          <w:sz w:val="24"/>
+          <w:szCs w:val="24"/>
+          <w:lang w:val="en-US"/>
+        </w:rPr>
+        <w:t>under different strategic scenarios adopted by OPEC member states</w:t>
+      </w:r>
+      <w:r>
+        <w:rPr>
+          <w:sz w:val="24"/>
+          <w:szCs w:val="24"/>
+          <w:lang w:val="en-US"/>
+        </w:rPr>
+        <w:t>.</w:t>
+      </w:r>
+    </w:p>
+    <w:p>
+      <w:pPr>
+        <w:rPr>
+          <w:sz w:val="24"/>
+          <w:szCs w:val="24"/>
+          <w:lang w:val="en-US"/>
+        </w:rPr>
+      </w:pPr>
+    </w:p>
+    <w:p>
+      <w:pPr>
+        <w:rPr>
+          <w:b/>
+          <w:bCs/>
+          <w:sz w:val="28"/>
+          <w:szCs w:val="28"/>
+          <w:lang w:val="en-US"/>
+        </w:rPr>
+      </w:pPr>
+      <w:r>
+        <w:rPr>
+          <w:b/>
+          <w:bCs/>
+          <w:sz w:val="28"/>
+          <w:szCs w:val="28"/>
+          <w:lang w:val="en-US"/>
+        </w:rPr>
+        <w:t>Theoretical base - Cournot Oligopoly</w:t>
+      </w:r>
+    </w:p>
+    <w:p>
+      <w:pPr>
+        <w:rPr>
+          <w:sz w:val="24"/>
+          <w:szCs w:val="24"/>
+          <w:lang w:val="en-US"/>
+        </w:rPr>
+      </w:pPr>
+      <w:r>
+        <w:rPr>
+          <w:sz w:val="24"/>
+          <w:szCs w:val="24"/>
+          <w:lang w:val="en-US"/>
+        </w:rPr>
+        <w:t xml:space="preserve">Cournot oligopoly </w:t>
+      </w:r>
+      <w:r>
+        <w:rPr>
+          <w:sz w:val="24"/>
+          <w:szCs w:val="24"/>
+          <w:lang w:val="en-US"/>
+        </w:rPr>
+        <w:t>model is widely used in economics to describe a market where firms produce a homogenous product</w:t>
+      </w:r>
+      <w:r>
+        <w:rPr>
+          <w:sz w:val="24"/>
+          <w:szCs w:val="24"/>
+          <w:lang w:val="en-US"/>
+        </w:rPr>
+        <w:t xml:space="preserve">; </w:t>
+      </w:r>
+      <w:r>
+        <w:rPr>
+          <w:sz w:val="24"/>
+          <w:szCs w:val="24"/>
+          <w:lang w:val="en-US"/>
+        </w:rPr>
+        <w:t>crude oil is a classic example of this</w:t>
+      </w:r>
+      <w:r>
+        <w:rPr>
+          <w:sz w:val="24"/>
+          <w:szCs w:val="24"/>
+          <w:lang w:val="en-US"/>
+        </w:rPr>
+        <w:t>.</w:t>
       </w:r>
       <w:r>
         <w:rPr>
@@ -117,72 +202,12 @@
         </w:rPr>
         <w:t xml:space="preserve"> </w:t>
       </w:r>
-      <w:proofErr w:type="spellStart"/>
-      <w:r>
-        <w:rPr>
-          <w:sz w:val="24"/>
-          <w:szCs w:val="24"/>
-          <w:lang w:val="en-US"/>
-        </w:rPr>
-        <w:t>Jáchou</w:t>
-      </w:r>
-      <w:proofErr w:type="spellEnd"/>
-      <w:r>
-        <w:rPr>
-          <w:sz w:val="24"/>
-          <w:szCs w:val="24"/>
-          <w:lang w:val="en-US"/>
-        </w:rPr>
-        <w:t>.</w:t>
-      </w:r>
-    </w:p>
-    <w:p>
-      <w:pPr>
-        <w:rPr>
-          <w:b/>
-          <w:bCs/>
-          <w:sz w:val="28"/>
-          <w:szCs w:val="28"/>
-          <w:lang w:val="en-US"/>
-        </w:rPr>
-      </w:pPr>
-    </w:p>
-    <w:p>
-      <w:pPr>
-        <w:rPr>
-          <w:b/>
-          <w:bCs/>
-          <w:sz w:val="28"/>
-          <w:szCs w:val="28"/>
-          <w:lang w:val="en-US"/>
-        </w:rPr>
-      </w:pPr>
-      <w:r>
-        <w:rPr>
-          <w:b/>
-          <w:bCs/>
-          <w:sz w:val="28"/>
-          <w:szCs w:val="28"/>
-          <w:lang w:val="en-US"/>
-        </w:rPr>
-        <w:t>Theoretical base - Cournot Oligopoly</w:t>
-      </w:r>
-    </w:p>
-    <w:p>
-      <w:pPr>
-        <w:rPr>
-          <w:sz w:val="24"/>
-          <w:szCs w:val="24"/>
-          <w:lang w:val="en-US"/>
-        </w:rPr>
-      </w:pPr>
-      <w:r>
-        <w:rPr>
-          <w:sz w:val="24"/>
-          <w:szCs w:val="24"/>
-          <w:lang w:val="en-US"/>
-        </w:rPr>
-        <w:t>In Cournot oligopoly model, firms compete by choosing the amount of goods they produce. The market price is then determined from total output using the inverse demand function:</w:t>
+      <w:r>
+        <w:rPr>
+          <w:sz w:val="24"/>
+          <w:szCs w:val="24"/>
+        </w:rPr>
+        <w:t>In this model, firms compete by independently choosing their production quantities. Further details on the Cournot framework can be found in [1]. The market price is determined by total output through an inverse demand function:</w:t>
       </w:r>
     </w:p>
     <w:p>
@@ -234,7 +259,23 @@
           <w:szCs w:val="24"/>
           <w:lang w:val="en-US"/>
         </w:rPr>
-        <w:t>…total quantity produced</w:t>
+        <w:t>…</w:t>
+      </w:r>
+      <w:r>
+        <w:rPr>
+          <w:sz w:val="24"/>
+          <w:szCs w:val="24"/>
+          <w:lang w:val="en-US"/>
+        </w:rPr>
+        <w:t>sum of production of all fir</w:t>
+      </w:r>
+      <w:r>
+        <w:rPr>
+          <w:sz w:val="24"/>
+          <w:szCs w:val="24"/>
+          <w:lang w:val="en-US"/>
+        </w:rPr>
+        <w:t>ms</w:t>
       </w:r>
     </w:p>
     <w:p>
@@ -316,33 +357,62 @@
         <w:rPr>
           <w:sz w:val="24"/>
           <w:szCs w:val="24"/>
-          <w:lang w:val="en-US"/>
-        </w:rPr>
-        <w:t xml:space="preserve">In this model a demand curve was calibrated to an initial market equilibrium. This approach was used mainly because parameter </w:t>
-      </w:r>
-      <w:r>
-        <w:rPr>
-          <w:i/>
-          <w:iCs/>
-          <w:sz w:val="24"/>
-          <w:szCs w:val="24"/>
-          <w:lang w:val="en-US"/>
-        </w:rPr>
-        <w:t xml:space="preserve">a </w:t>
-      </w:r>
-      <w:r>
-        <w:rPr>
-          <w:sz w:val="24"/>
-          <w:szCs w:val="24"/>
-          <w:lang w:val="en-US"/>
-        </w:rPr>
-        <w:t>is a purely theoretical number that is impossible to know. Final price calculation:</w:t>
+        </w:rPr>
+        <w:t>In our model, t</w:t>
+      </w:r>
+      <w:r>
+        <w:rPr>
+          <w:sz w:val="24"/>
+          <w:szCs w:val="24"/>
+        </w:rPr>
+        <w:t>he inverse demand function is calibrated to a reference equilibrium</w:t>
+      </w:r>
+      <w:r>
+        <w:rPr>
+          <w:sz w:val="24"/>
+          <w:szCs w:val="24"/>
+        </w:rPr>
+        <w:t xml:space="preserve"> </w:t>
+      </w:r>
+      <w:r>
+        <w:rPr>
+          <w:sz w:val="24"/>
+          <w:szCs w:val="24"/>
+        </w:rPr>
+        <w:t xml:space="preserve">to avoid the need for estimating the unobservable theoretical intercept </w:t>
+      </w:r>
+      <m:oMath>
+        <m:r>
+          <w:rPr>
+            <w:rFonts w:ascii="Cambria Math" w:hAnsi="Cambria Math"/>
+            <w:sz w:val="24"/>
+            <w:szCs w:val="24"/>
+          </w:rPr>
+          <m:t>α</m:t>
+        </m:r>
+      </m:oMath>
+      <w:r>
+        <w:rPr>
+          <w:rFonts w:eastAsiaTheme="minorEastAsia"/>
+          <w:sz w:val="24"/>
+          <w:szCs w:val="24"/>
+        </w:rPr>
+        <w:t xml:space="preserve">. </w:t>
+      </w:r>
+      <w:r>
+        <w:rPr>
+          <w:rFonts w:eastAsiaTheme="minorEastAsia"/>
+          <w:sz w:val="24"/>
+          <w:szCs w:val="24"/>
+        </w:rPr>
+        <w:t>Final price calculation is the following:</w:t>
       </w:r>
     </w:p>
     <w:p>
       <w:pPr>
         <w:jc w:val="center"/>
         <w:rPr>
+          <w:rFonts w:eastAsiaTheme="minorEastAsia"/>
           <w:sz w:val="24"/>
           <w:szCs w:val="24"/>
           <w:lang w:val="en-US"/>
@@ -482,97 +552,335 @@
           <w:lang w:val="en-US"/>
         </w:rPr>
       </w:pPr>
+      <m:oMath>
+        <m:sSub>
+          <m:sSubPr>
+            <m:ctrlPr>
+              <w:rPr>
+                <w:rFonts w:ascii="Cambria Math" w:hAnsi="Cambria Math"/>
+                <w:i/>
+                <w:sz w:val="24"/>
+                <w:szCs w:val="24"/>
+                <w:lang w:val="en-US"/>
+              </w:rPr>
+            </m:ctrlPr>
+          </m:sSubPr>
+          <m:e>
+            <m:r>
+              <w:rPr>
+                <w:rFonts w:ascii="Cambria Math" w:hAnsi="Cambria Math"/>
+                <w:sz w:val="24"/>
+                <w:szCs w:val="24"/>
+                <w:lang w:val="en-US"/>
+              </w:rPr>
+              <m:t>P</m:t>
+            </m:r>
+          </m:e>
+          <m:sub>
+            <m:r>
+              <w:rPr>
+                <w:rFonts w:ascii="Cambria Math" w:hAnsi="Cambria Math"/>
+                <w:sz w:val="24"/>
+                <w:szCs w:val="24"/>
+                <w:lang w:val="en-US"/>
+              </w:rPr>
+              <m:t>base</m:t>
+            </m:r>
+          </m:sub>
+        </m:sSub>
+      </m:oMath>
+      <w:r>
+        <w:rPr>
+          <w:rFonts w:eastAsiaTheme="minorEastAsia"/>
+          <w:sz w:val="24"/>
+          <w:szCs w:val="24"/>
+          <w:lang w:val="en-US"/>
+        </w:rPr>
+        <w:t xml:space="preserve"> </w:t>
+      </w:r>
+      <w:r>
+        <w:rPr>
+          <w:rFonts w:eastAsiaTheme="minorEastAsia"/>
+          <w:sz w:val="24"/>
+          <w:szCs w:val="24"/>
+          <w:lang w:val="en-US"/>
+        </w:rPr>
+        <w:t xml:space="preserve"> </w:t>
+      </w:r>
+      <w:r>
+        <w:rPr>
+          <w:rFonts w:eastAsiaTheme="minorEastAsia"/>
+          <w:sz w:val="24"/>
+          <w:szCs w:val="24"/>
+          <w:lang w:val="en-US"/>
+        </w:rPr>
+        <w:t xml:space="preserve">and </w:t>
+      </w:r>
+      <m:oMath>
+        <m:sSub>
+          <m:sSubPr>
+            <m:ctrlPr>
+              <w:rPr>
+                <w:rFonts w:ascii="Cambria Math" w:eastAsiaTheme="minorEastAsia" w:hAnsi="Cambria Math"/>
+                <w:i/>
+                <w:sz w:val="24"/>
+                <w:szCs w:val="24"/>
+                <w:lang w:val="en-US"/>
+              </w:rPr>
+            </m:ctrlPr>
+          </m:sSubPr>
+          <m:e>
+            <m:r>
+              <w:rPr>
+                <w:rFonts w:ascii="Cambria Math" w:eastAsiaTheme="minorEastAsia" w:hAnsi="Cambria Math"/>
+                <w:sz w:val="24"/>
+                <w:szCs w:val="24"/>
+                <w:lang w:val="en-US"/>
+              </w:rPr>
+              <m:t>Q</m:t>
+            </m:r>
+          </m:e>
+          <m:sub>
+            <m:r>
+              <w:rPr>
+                <w:rFonts w:ascii="Cambria Math" w:eastAsiaTheme="minorEastAsia" w:hAnsi="Cambria Math"/>
+                <w:sz w:val="24"/>
+                <w:szCs w:val="24"/>
+                <w:lang w:val="en-US"/>
+              </w:rPr>
+              <m:t>base</m:t>
+            </m:r>
+          </m:sub>
+        </m:sSub>
+      </m:oMath>
+      <w:r>
+        <w:rPr>
+          <w:rFonts w:eastAsiaTheme="minorEastAsia"/>
+          <w:sz w:val="24"/>
+          <w:szCs w:val="24"/>
+          <w:lang w:val="en-US"/>
+        </w:rPr>
+        <w:t xml:space="preserve">  were set to correspond to </w:t>
+      </w:r>
+      <w:r>
+        <w:rPr>
+          <w:rFonts w:eastAsiaTheme="minorEastAsia"/>
+          <w:sz w:val="24"/>
+          <w:szCs w:val="24"/>
+          <w:lang w:val="en-US"/>
+        </w:rPr>
+        <w:t xml:space="preserve">historical </w:t>
+      </w:r>
+      <w:r>
+        <w:rPr>
+          <w:rFonts w:eastAsiaTheme="minorEastAsia"/>
+          <w:sz w:val="24"/>
+          <w:szCs w:val="24"/>
+          <w:lang w:val="en-US"/>
+        </w:rPr>
+        <w:t xml:space="preserve">real-world oil market </w:t>
+      </w:r>
+      <w:r>
+        <w:rPr>
+          <w:rFonts w:eastAsiaTheme="minorEastAsia"/>
+          <w:sz w:val="24"/>
+          <w:szCs w:val="24"/>
+          <w:lang w:val="en-US"/>
+        </w:rPr>
+        <w:t>data</w:t>
+      </w:r>
+      <w:r>
+        <w:rPr>
+          <w:rFonts w:eastAsiaTheme="minorEastAsia"/>
+          <w:sz w:val="24"/>
+          <w:szCs w:val="24"/>
+          <w:lang w:val="en-US"/>
+        </w:rPr>
+        <w:t xml:space="preserve"> and the parameter </w:t>
+      </w:r>
+      <m:oMath>
+        <m:r>
+          <w:rPr>
+            <w:rFonts w:ascii="Cambria Math" w:eastAsiaTheme="minorEastAsia" w:hAnsi="Cambria Math"/>
+            <w:sz w:val="24"/>
+            <w:szCs w:val="24"/>
+            <w:lang w:val="en-US"/>
+          </w:rPr>
+          <m:t>b</m:t>
+        </m:r>
+      </m:oMath>
+      <w:r>
+        <w:rPr>
+          <w:rFonts w:eastAsiaTheme="minorEastAsia"/>
+          <w:sz w:val="24"/>
+          <w:szCs w:val="24"/>
+          <w:lang w:val="en-US"/>
+        </w:rPr>
+        <w:t xml:space="preserve"> was</w:t>
+      </w:r>
+      <w:r>
+        <w:rPr>
+          <w:rFonts w:eastAsiaTheme="minorEastAsia"/>
+          <w:sz w:val="24"/>
+          <w:szCs w:val="24"/>
+          <w:lang w:val="en-US"/>
+        </w:rPr>
+        <w:t xml:space="preserve"> fixed</w:t>
+      </w:r>
+      <w:r>
+        <w:rPr>
+          <w:rFonts w:eastAsiaTheme="minorEastAsia"/>
+          <w:sz w:val="24"/>
+          <w:szCs w:val="24"/>
+          <w:lang w:val="en-US"/>
+        </w:rPr>
+        <w:t xml:space="preserve"> </w:t>
+      </w:r>
+      <w:r>
+        <w:rPr>
+          <w:rFonts w:eastAsiaTheme="minorEastAsia"/>
+          <w:sz w:val="24"/>
+          <w:szCs w:val="24"/>
+          <w:lang w:val="en-US"/>
+        </w:rPr>
+        <w:t>at</w:t>
+      </w:r>
+      <w:r>
+        <w:rPr>
+          <w:rFonts w:eastAsiaTheme="minorEastAsia"/>
+          <w:sz w:val="24"/>
+          <w:szCs w:val="24"/>
+          <w:lang w:val="en-US"/>
+        </w:rPr>
+        <w:t xml:space="preserve"> 8. </w:t>
+      </w:r>
+      <w:r>
+        <w:rPr>
+          <w:rFonts w:eastAsiaTheme="minorEastAsia"/>
+          <w:sz w:val="24"/>
+          <w:szCs w:val="24"/>
+          <w:lang w:val="en-US"/>
+        </w:rPr>
+        <w:t>Notably</w:t>
+      </w:r>
+      <w:r>
+        <w:rPr>
+          <w:rFonts w:eastAsiaTheme="minorEastAsia"/>
+          <w:sz w:val="24"/>
+          <w:szCs w:val="24"/>
+          <w:lang w:val="en-US"/>
+        </w:rPr>
+        <w:t xml:space="preserve">, these parameters </w:t>
+      </w:r>
+      <w:r>
+        <w:rPr>
+          <w:rFonts w:eastAsiaTheme="minorEastAsia"/>
+          <w:sz w:val="24"/>
+          <w:szCs w:val="24"/>
+          <w:lang w:val="en-US"/>
+        </w:rPr>
+        <w:t xml:space="preserve">remain constant </w:t>
+      </w:r>
+      <w:r>
+        <w:rPr>
+          <w:rFonts w:eastAsiaTheme="minorEastAsia"/>
+          <w:sz w:val="24"/>
+          <w:szCs w:val="24"/>
+        </w:rPr>
+        <w:t>throughout the model's iterations</w:t>
+      </w:r>
+      <w:r>
+        <w:rPr>
+          <w:rFonts w:eastAsiaTheme="minorEastAsia"/>
+          <w:sz w:val="24"/>
+          <w:szCs w:val="24"/>
+          <w:lang w:val="en-US"/>
+        </w:rPr>
+        <w:t xml:space="preserve">. </w:t>
+      </w:r>
+      <w:r>
+        <w:rPr>
+          <w:rFonts w:eastAsiaTheme="minorEastAsia"/>
+          <w:sz w:val="24"/>
+          <w:szCs w:val="24"/>
+        </w:rPr>
+        <w:t xml:space="preserve">The only </w:t>
+      </w:r>
+      <w:r>
+        <w:rPr>
+          <w:rFonts w:eastAsiaTheme="minorEastAsia"/>
+          <w:sz w:val="24"/>
+          <w:szCs w:val="24"/>
+        </w:rPr>
+        <w:t>changing parameter</w:t>
+      </w:r>
+      <w:r>
+        <w:rPr>
+          <w:rFonts w:eastAsiaTheme="minorEastAsia"/>
+          <w:sz w:val="24"/>
+          <w:szCs w:val="24"/>
+        </w:rPr>
+        <w:t xml:space="preserve"> is the total quantity</w:t>
+      </w:r>
+      <w:r>
+        <w:rPr>
+          <w:rFonts w:eastAsiaTheme="minorEastAsia"/>
+          <w:sz w:val="24"/>
+          <w:szCs w:val="24"/>
+        </w:rPr>
+        <w:t xml:space="preserve"> </w:t>
+      </w:r>
+      <m:oMath>
+        <m:r>
+          <w:rPr>
+            <w:rFonts w:ascii="Cambria Math" w:eastAsiaTheme="minorEastAsia" w:hAnsi="Cambria Math"/>
+            <w:sz w:val="24"/>
+            <w:szCs w:val="24"/>
+            <w:lang w:val="en-US"/>
+          </w:rPr>
+          <m:t>Q</m:t>
+        </m:r>
+      </m:oMath>
+      <w:r>
+        <w:rPr>
+          <w:rFonts w:eastAsiaTheme="minorEastAsia"/>
+          <w:sz w:val="24"/>
+          <w:szCs w:val="24"/>
+        </w:rPr>
+        <w:t>, which is determined endogenously by the specific strategy adopted by each state.</w:t>
+      </w:r>
+    </w:p>
+    <w:p>
+      <w:pPr>
+        <w:rPr>
+          <w:lang w:val="en-US"/>
+        </w:rPr>
+      </w:pPr>
+    </w:p>
+    <w:p>
+      <w:pPr>
+        <w:rPr>
+          <w:b/>
+          <w:bCs/>
+          <w:sz w:val="28"/>
+          <w:szCs w:val="28"/>
+          <w:lang w:val="en-US"/>
+        </w:rPr>
+      </w:pPr>
       <w:proofErr w:type="spellStart"/>
       <w:r>
         <w:rPr>
-          <w:sz w:val="24"/>
-          <w:szCs w:val="24"/>
-          <w:lang w:val="en-US"/>
-        </w:rPr>
-        <w:t>P_base</w:t>
+          <w:b/>
+          <w:bCs/>
+          <w:sz w:val="28"/>
+          <w:szCs w:val="28"/>
+          <w:lang w:val="en-US"/>
+        </w:rPr>
+        <w:t>Atributes</w:t>
       </w:r>
       <w:proofErr w:type="spellEnd"/>
       <w:r>
         <w:rPr>
-          <w:sz w:val="24"/>
-          <w:szCs w:val="24"/>
-          <w:lang w:val="en-US"/>
-        </w:rPr>
-        <w:t>…historically observed equilibrium price</w:t>
-      </w:r>
-    </w:p>
-    <w:p>
-      <w:pPr>
-        <w:rPr>
-          <w:sz w:val="24"/>
-          <w:szCs w:val="24"/>
-          <w:lang w:val="en-US"/>
-        </w:rPr>
-      </w:pPr>
-      <w:proofErr w:type="spellStart"/>
-      <w:r>
-        <w:rPr>
-          <w:sz w:val="24"/>
-          <w:szCs w:val="24"/>
-          <w:lang w:val="en-US"/>
-        </w:rPr>
-        <w:t>Q_base</w:t>
-      </w:r>
-      <w:proofErr w:type="spellEnd"/>
-      <w:r>
-        <w:rPr>
-          <w:sz w:val="24"/>
-          <w:szCs w:val="24"/>
-          <w:lang w:val="en-US"/>
-        </w:rPr>
-        <w:t>…</w:t>
-      </w:r>
-      <w:r>
-        <w:rPr>
-          <w:lang w:val="en-US"/>
-        </w:rPr>
-        <w:t xml:space="preserve"> </w:t>
-      </w:r>
-      <w:r>
-        <w:rPr>
-          <w:sz w:val="24"/>
-          <w:szCs w:val="24"/>
-          <w:lang w:val="en-US"/>
-        </w:rPr>
-        <w:t>production level that naturally results in the Base Price</w:t>
-      </w:r>
-    </w:p>
-    <w:p>
-      <w:pPr>
-        <w:rPr>
-          <w:lang w:val="en-US"/>
-        </w:rPr>
-      </w:pPr>
-    </w:p>
-    <w:p>
-      <w:pPr>
-        <w:rPr>
-          <w:b/>
-          <w:bCs/>
-          <w:sz w:val="28"/>
-          <w:szCs w:val="28"/>
-          <w:lang w:val="en-US"/>
-        </w:rPr>
-      </w:pPr>
-      <w:proofErr w:type="spellStart"/>
-      <w:r>
-        <w:rPr>
-          <w:b/>
-          <w:bCs/>
-          <w:sz w:val="28"/>
-          <w:szCs w:val="28"/>
-          <w:lang w:val="en-US"/>
-        </w:rPr>
-        <w:t>Atributes</w:t>
-      </w:r>
-      <w:proofErr w:type="spellEnd"/>
-      <w:r>
-        <w:rPr>
           <w:b/>
           <w:bCs/>
           <w:sz w:val="28"/>
@@ -603,103 +911,707 @@
           <w:lang w:val="en-US"/>
         </w:rPr>
       </w:pPr>
-    </w:p>
-    <w:p>
-      <w:pPr>
-        <w:rPr>
-          <w:b/>
-          <w:bCs/>
-          <w:sz w:val="28"/>
-          <w:szCs w:val="28"/>
-          <w:lang w:val="en-US"/>
-        </w:rPr>
-      </w:pPr>
-    </w:p>
-    <w:p>
-      <w:pPr>
-        <w:rPr>
-          <w:b/>
-          <w:bCs/>
-          <w:sz w:val="28"/>
-          <w:szCs w:val="28"/>
-          <w:lang w:val="en-US"/>
-        </w:rPr>
-      </w:pPr>
-    </w:p>
-    <w:p>
-      <w:pPr>
-        <w:rPr>
-          <w:b/>
-          <w:bCs/>
-          <w:sz w:val="28"/>
-          <w:szCs w:val="28"/>
-          <w:lang w:val="en-US"/>
-        </w:rPr>
-      </w:pPr>
-    </w:p>
-    <w:p>
-      <w:pPr>
-        <w:rPr>
-          <w:b/>
-          <w:bCs/>
-          <w:sz w:val="28"/>
-          <w:szCs w:val="28"/>
-          <w:lang w:val="en-US"/>
-        </w:rPr>
-      </w:pPr>
-    </w:p>
-    <w:p>
-      <w:pPr>
-        <w:rPr>
-          <w:b/>
-          <w:bCs/>
-          <w:sz w:val="28"/>
-          <w:szCs w:val="28"/>
-          <w:lang w:val="en-US"/>
-        </w:rPr>
-      </w:pPr>
-    </w:p>
-    <w:p>
-      <w:pPr>
-        <w:rPr>
-          <w:b/>
-          <w:bCs/>
-          <w:sz w:val="28"/>
-          <w:szCs w:val="28"/>
-          <w:lang w:val="en-US"/>
-        </w:rPr>
-      </w:pPr>
-    </w:p>
-    <w:p>
-      <w:pPr>
-        <w:rPr>
-          <w:b/>
-          <w:bCs/>
-          <w:sz w:val="28"/>
-          <w:szCs w:val="28"/>
-          <w:lang w:val="en-US"/>
-        </w:rPr>
-      </w:pPr>
-    </w:p>
-    <w:p>
-      <w:pPr>
-        <w:rPr>
-          <w:b/>
-          <w:bCs/>
-          <w:sz w:val="28"/>
-          <w:szCs w:val="28"/>
-          <w:lang w:val="en-US"/>
-        </w:rPr>
-      </w:pPr>
-      <w:r>
-        <w:rPr>
-          <w:b/>
-          <w:bCs/>
-          <w:sz w:val="28"/>
-          <w:szCs w:val="28"/>
-          <w:lang w:val="en-US"/>
-        </w:rPr>
-        <w:t xml:space="preserve">SCENARIO 1 – Saudia Arabia Floods the Market </w:t>
+      <w:r>
+        <w:rPr>
+          <w:b/>
+          <w:bCs/>
+          <w:sz w:val="28"/>
+          <w:szCs w:val="28"/>
+          <w:lang w:val="en-US"/>
+        </w:rPr>
+        <w:t>Scenarios</w:t>
+      </w:r>
+    </w:p>
+    <w:p>
+      <w:pPr>
+        <w:rPr>
+          <w:b/>
+          <w:bCs/>
+          <w:sz w:val="28"/>
+          <w:szCs w:val="28"/>
+          <w:lang w:val="en-US"/>
+        </w:rPr>
+      </w:pPr>
+      <w:r>
+        <w:rPr>
+          <w:b/>
+          <w:bCs/>
+          <w:sz w:val="28"/>
+          <w:szCs w:val="28"/>
+          <w:lang w:val="en-US"/>
+        </w:rPr>
+        <w:t>All follow</w:t>
+      </w:r>
+    </w:p>
+    <w:tbl>
+      <w:tblPr>
+        <w:tblStyle w:val="TableGrid"/>
+        <w:tblW w:w="9016" w:type="dxa"/>
+        <w:tblLayout w:type="fixed"/>
+        <w:tblLook w:val="04A0" w:firstRow="1" w:lastRow="0" w:firstColumn="1" w:lastColumn="0" w:noHBand="0" w:noVBand="1"/>
+      </w:tblPr>
+      <w:tblGrid>
+        <w:gridCol w:w="1803"/>
+        <w:gridCol w:w="1803"/>
+        <w:gridCol w:w="1803"/>
+        <w:gridCol w:w="1803"/>
+        <w:gridCol w:w="1804"/>
+      </w:tblGrid>
+      <w:tr>
+        <w:tc>
+          <w:tcPr>
+            <w:tcW w:w="1803" w:type="dxa"/>
+          </w:tcPr>
+          <w:p>
+            <w:pPr>
+              <w:spacing w:after="0" w:line="240" w:lineRule="auto"/>
+              <w:rPr>
+                <w:sz w:val="24"/>
+                <w:szCs w:val="24"/>
+                <w:lang w:val="en-US"/>
+              </w:rPr>
+            </w:pPr>
+            <w:r>
+              <w:rPr>
+                <w:rFonts w:eastAsia="Aptos"/>
+                <w:sz w:val="24"/>
+                <w:szCs w:val="24"/>
+                <w:lang w:val="en-US"/>
+              </w:rPr>
+              <w:t>Saudia Arabia</w:t>
+            </w:r>
+          </w:p>
+        </w:tc>
+        <w:tc>
+          <w:tcPr>
+            <w:tcW w:w="1803" w:type="dxa"/>
+          </w:tcPr>
+          <w:p>
+            <w:pPr>
+              <w:spacing w:after="0" w:line="240" w:lineRule="auto"/>
+              <w:rPr>
+                <w:sz w:val="24"/>
+                <w:szCs w:val="24"/>
+                <w:lang w:val="en-US"/>
+              </w:rPr>
+            </w:pPr>
+            <w:r>
+              <w:rPr>
+                <w:rFonts w:eastAsia="Aptos"/>
+                <w:sz w:val="24"/>
+                <w:szCs w:val="24"/>
+                <w:lang w:val="en-US"/>
+              </w:rPr>
+              <w:t>Venezuela</w:t>
+            </w:r>
+          </w:p>
+        </w:tc>
+        <w:tc>
+          <w:tcPr>
+            <w:tcW w:w="1803" w:type="dxa"/>
+          </w:tcPr>
+          <w:p>
+            <w:pPr>
+              <w:spacing w:after="0" w:line="240" w:lineRule="auto"/>
+              <w:rPr>
+                <w:sz w:val="24"/>
+                <w:szCs w:val="24"/>
+                <w:lang w:val="en-US"/>
+              </w:rPr>
+            </w:pPr>
+            <w:r>
+              <w:rPr>
+                <w:rFonts w:eastAsia="Aptos"/>
+                <w:sz w:val="24"/>
+                <w:szCs w:val="24"/>
+                <w:lang w:val="en-US"/>
+              </w:rPr>
+              <w:t>UAE</w:t>
+            </w:r>
+          </w:p>
+        </w:tc>
+        <w:tc>
+          <w:tcPr>
+            <w:tcW w:w="1803" w:type="dxa"/>
+          </w:tcPr>
+          <w:p>
+            <w:pPr>
+              <w:spacing w:after="0" w:line="240" w:lineRule="auto"/>
+              <w:rPr>
+                <w:sz w:val="24"/>
+                <w:szCs w:val="24"/>
+                <w:lang w:val="en-US"/>
+              </w:rPr>
+            </w:pPr>
+            <w:r>
+              <w:rPr>
+                <w:rFonts w:eastAsia="Aptos"/>
+                <w:sz w:val="24"/>
+                <w:szCs w:val="24"/>
+                <w:lang w:val="en-US"/>
+              </w:rPr>
+              <w:t xml:space="preserve">Nigeria </w:t>
+            </w:r>
+          </w:p>
+        </w:tc>
+        <w:tc>
+          <w:tcPr>
+            <w:tcW w:w="1804" w:type="dxa"/>
+          </w:tcPr>
+          <w:p>
+            <w:pPr>
+              <w:spacing w:after="0" w:line="240" w:lineRule="auto"/>
+              <w:rPr>
+                <w:sz w:val="24"/>
+                <w:szCs w:val="24"/>
+                <w:lang w:val="en-US"/>
+              </w:rPr>
+            </w:pPr>
+            <w:r>
+              <w:rPr>
+                <w:rFonts w:eastAsia="Aptos"/>
+                <w:sz w:val="24"/>
+                <w:szCs w:val="24"/>
+                <w:lang w:val="en-US"/>
+              </w:rPr>
+              <w:t>Total</w:t>
+            </w:r>
+          </w:p>
+        </w:tc>
+      </w:tr>
+      <w:tr>
+        <w:tc>
+          <w:tcPr>
+            <w:tcW w:w="1803" w:type="dxa"/>
+          </w:tcPr>
+          <w:p>
+            <w:pPr>
+              <w:spacing w:after="0" w:line="240" w:lineRule="auto"/>
+              <w:rPr>
+                <w:sz w:val="24"/>
+                <w:szCs w:val="24"/>
+                <w:lang w:val="en-US"/>
+              </w:rPr>
+            </w:pPr>
+            <w:r>
+              <w:rPr>
+                <w:rFonts w:eastAsia="Aptos"/>
+                <w:sz w:val="24"/>
+                <w:szCs w:val="24"/>
+                <w:lang w:val="en-US"/>
+              </w:rPr>
+              <w:t>$</w:t>
+            </w:r>
+            <w:r>
+              <w:rPr>
+                <w:rFonts w:eastAsia="Aptos"/>
+                <w:sz w:val="24"/>
+                <w:szCs w:val="24"/>
+                <w:lang w:val="en-US"/>
+              </w:rPr>
+              <w:t>30 420</w:t>
+            </w:r>
+          </w:p>
+        </w:tc>
+        <w:tc>
+          <w:tcPr>
+            <w:tcW w:w="1803" w:type="dxa"/>
+          </w:tcPr>
+          <w:p>
+            <w:pPr>
+              <w:spacing w:after="0" w:line="240" w:lineRule="auto"/>
+              <w:rPr>
+                <w:sz w:val="24"/>
+                <w:szCs w:val="24"/>
+                <w:lang w:val="en-US"/>
+              </w:rPr>
+            </w:pPr>
+            <w:r>
+              <w:rPr>
+                <w:rFonts w:eastAsia="Aptos"/>
+                <w:sz w:val="24"/>
+                <w:szCs w:val="24"/>
+                <w:lang w:val="en-US"/>
+              </w:rPr>
+              <w:t>$</w:t>
+            </w:r>
+            <w:r>
+              <w:rPr>
+                <w:rFonts w:eastAsia="Aptos"/>
+                <w:sz w:val="24"/>
+                <w:szCs w:val="24"/>
+                <w:lang w:val="en-US"/>
+              </w:rPr>
+              <w:t>3 383</w:t>
+            </w:r>
+          </w:p>
+        </w:tc>
+        <w:tc>
+          <w:tcPr>
+            <w:tcW w:w="1803" w:type="dxa"/>
+          </w:tcPr>
+          <w:p>
+            <w:pPr>
+              <w:spacing w:after="0" w:line="240" w:lineRule="auto"/>
+              <w:rPr>
+                <w:sz w:val="24"/>
+                <w:szCs w:val="24"/>
+                <w:lang w:val="en-US"/>
+              </w:rPr>
+            </w:pPr>
+            <w:r>
+              <w:rPr>
+                <w:rFonts w:eastAsia="Aptos"/>
+                <w:sz w:val="24"/>
+                <w:szCs w:val="24"/>
+                <w:lang w:val="en-US"/>
+              </w:rPr>
+              <w:t>$</w:t>
+            </w:r>
+            <w:r>
+              <w:rPr>
+                <w:rFonts w:eastAsia="Aptos"/>
+                <w:sz w:val="24"/>
+                <w:szCs w:val="24"/>
+                <w:lang w:val="en-US"/>
+              </w:rPr>
+              <w:t>12 119</w:t>
+            </w:r>
+          </w:p>
+        </w:tc>
+        <w:tc>
+          <w:tcPr>
+            <w:tcW w:w="1803" w:type="dxa"/>
+          </w:tcPr>
+          <w:p>
+            <w:pPr>
+              <w:spacing w:after="0" w:line="240" w:lineRule="auto"/>
+              <w:rPr>
+                <w:sz w:val="24"/>
+                <w:szCs w:val="24"/>
+                <w:lang w:val="en-US"/>
+              </w:rPr>
+            </w:pPr>
+            <w:r>
+              <w:rPr>
+                <w:rFonts w:eastAsia="Aptos"/>
+                <w:sz w:val="24"/>
+                <w:szCs w:val="24"/>
+                <w:lang w:val="en-US"/>
+              </w:rPr>
+              <w:t>$</w:t>
+            </w:r>
+            <w:r>
+              <w:rPr>
+                <w:rFonts w:eastAsia="Aptos"/>
+                <w:sz w:val="24"/>
+                <w:szCs w:val="24"/>
+                <w:lang w:val="en-US"/>
+              </w:rPr>
+              <w:t>3 195</w:t>
+            </w:r>
+          </w:p>
+        </w:tc>
+        <w:tc>
+          <w:tcPr>
+            <w:tcW w:w="1804" w:type="dxa"/>
+          </w:tcPr>
+          <w:p>
+            <w:pPr>
+              <w:spacing w:after="0" w:line="240" w:lineRule="auto"/>
+              <w:rPr>
+                <w:sz w:val="24"/>
+                <w:szCs w:val="24"/>
+                <w:lang w:val="en-US"/>
+              </w:rPr>
+            </w:pPr>
+            <w:r>
+              <w:rPr>
+                <w:rFonts w:eastAsia="Aptos"/>
+                <w:sz w:val="24"/>
+                <w:szCs w:val="24"/>
+                <w:lang w:val="en-US"/>
+              </w:rPr>
+              <w:t>$</w:t>
+            </w:r>
+            <w:r>
+              <w:rPr>
+                <w:rFonts w:eastAsia="Aptos"/>
+                <w:sz w:val="24"/>
+                <w:szCs w:val="24"/>
+                <w:lang w:val="en-US"/>
+              </w:rPr>
+              <w:t>49 119</w:t>
+            </w:r>
+          </w:p>
+        </w:tc>
+      </w:tr>
+    </w:tbl>
+    <w:p>
+      <w:pPr>
+        <w:rPr>
+          <w:b/>
+          <w:bCs/>
+          <w:sz w:val="28"/>
+          <w:szCs w:val="28"/>
+          <w:lang w:val="en-US"/>
+        </w:rPr>
+      </w:pPr>
+    </w:p>
+    <w:p>
+      <w:pPr>
+        <w:rPr>
+          <w:b/>
+          <w:bCs/>
+          <w:sz w:val="28"/>
+          <w:szCs w:val="28"/>
+          <w:lang w:val="en-US"/>
+        </w:rPr>
+      </w:pPr>
+      <w:r>
+        <w:rPr>
+          <w:b/>
+          <w:bCs/>
+          <w:sz w:val="28"/>
+          <w:szCs w:val="28"/>
+          <w:lang w:val="en-US"/>
+        </w:rPr>
+        <w:t>ignore quotas</w:t>
+      </w:r>
+    </w:p>
+    <w:p>
+      <w:pPr>
+        <w:rPr>
+          <w:b/>
+          <w:bCs/>
+          <w:sz w:val="28"/>
+          <w:szCs w:val="28"/>
+          <w:lang w:val="en-US"/>
+        </w:rPr>
+      </w:pPr>
+    </w:p>
+    <w:tbl>
+      <w:tblPr>
+        <w:tblStyle w:val="TableGrid"/>
+        <w:tblW w:w="9016" w:type="dxa"/>
+        <w:tblLayout w:type="fixed"/>
+        <w:tblLook w:val="04A0" w:firstRow="1" w:lastRow="0" w:firstColumn="1" w:lastColumn="0" w:noHBand="0" w:noVBand="1"/>
+      </w:tblPr>
+      <w:tblGrid>
+        <w:gridCol w:w="1803"/>
+        <w:gridCol w:w="1803"/>
+        <w:gridCol w:w="1803"/>
+        <w:gridCol w:w="1803"/>
+        <w:gridCol w:w="1804"/>
+      </w:tblGrid>
+      <w:tr>
+        <w:tc>
+          <w:tcPr>
+            <w:tcW w:w="1803" w:type="dxa"/>
+          </w:tcPr>
+          <w:p>
+            <w:pPr>
+              <w:spacing w:after="0" w:line="240" w:lineRule="auto"/>
+              <w:rPr>
+                <w:sz w:val="24"/>
+                <w:szCs w:val="24"/>
+                <w:lang w:val="en-US"/>
+              </w:rPr>
+            </w:pPr>
+            <w:r>
+              <w:rPr>
+                <w:rFonts w:eastAsia="Aptos"/>
+                <w:sz w:val="24"/>
+                <w:szCs w:val="24"/>
+                <w:lang w:val="en-US"/>
+              </w:rPr>
+              <w:t>Saudia Arabia</w:t>
+            </w:r>
+          </w:p>
+        </w:tc>
+        <w:tc>
+          <w:tcPr>
+            <w:tcW w:w="1803" w:type="dxa"/>
+          </w:tcPr>
+          <w:p>
+            <w:pPr>
+              <w:spacing w:after="0" w:line="240" w:lineRule="auto"/>
+              <w:rPr>
+                <w:sz w:val="24"/>
+                <w:szCs w:val="24"/>
+                <w:lang w:val="en-US"/>
+              </w:rPr>
+            </w:pPr>
+            <w:r>
+              <w:rPr>
+                <w:rFonts w:eastAsia="Aptos"/>
+                <w:sz w:val="24"/>
+                <w:szCs w:val="24"/>
+                <w:lang w:val="en-US"/>
+              </w:rPr>
+              <w:t>Venezuela</w:t>
+            </w:r>
+          </w:p>
+        </w:tc>
+        <w:tc>
+          <w:tcPr>
+            <w:tcW w:w="1803" w:type="dxa"/>
+          </w:tcPr>
+          <w:p>
+            <w:pPr>
+              <w:spacing w:after="0" w:line="240" w:lineRule="auto"/>
+              <w:rPr>
+                <w:sz w:val="24"/>
+                <w:szCs w:val="24"/>
+                <w:lang w:val="en-US"/>
+              </w:rPr>
+            </w:pPr>
+            <w:r>
+              <w:rPr>
+                <w:rFonts w:eastAsia="Aptos"/>
+                <w:sz w:val="24"/>
+                <w:szCs w:val="24"/>
+                <w:lang w:val="en-US"/>
+              </w:rPr>
+              <w:t>UAE</w:t>
+            </w:r>
+          </w:p>
+        </w:tc>
+        <w:tc>
+          <w:tcPr>
+            <w:tcW w:w="1803" w:type="dxa"/>
+          </w:tcPr>
+          <w:p>
+            <w:pPr>
+              <w:spacing w:after="0" w:line="240" w:lineRule="auto"/>
+              <w:rPr>
+                <w:sz w:val="24"/>
+                <w:szCs w:val="24"/>
+                <w:lang w:val="en-US"/>
+              </w:rPr>
+            </w:pPr>
+            <w:r>
+              <w:rPr>
+                <w:rFonts w:eastAsia="Aptos"/>
+                <w:sz w:val="24"/>
+                <w:szCs w:val="24"/>
+                <w:lang w:val="en-US"/>
+              </w:rPr>
+              <w:t xml:space="preserve">Nigeria </w:t>
+            </w:r>
+          </w:p>
+        </w:tc>
+        <w:tc>
+          <w:tcPr>
+            <w:tcW w:w="1804" w:type="dxa"/>
+          </w:tcPr>
+          <w:p>
+            <w:pPr>
+              <w:spacing w:after="0" w:line="240" w:lineRule="auto"/>
+              <w:rPr>
+                <w:sz w:val="24"/>
+                <w:szCs w:val="24"/>
+                <w:lang w:val="en-US"/>
+              </w:rPr>
+            </w:pPr>
+            <w:r>
+              <w:rPr>
+                <w:rFonts w:eastAsia="Aptos"/>
+                <w:sz w:val="24"/>
+                <w:szCs w:val="24"/>
+                <w:lang w:val="en-US"/>
+              </w:rPr>
+              <w:t>Total</w:t>
+            </w:r>
+          </w:p>
+        </w:tc>
+      </w:tr>
+      <w:tr>
+        <w:tc>
+          <w:tcPr>
+            <w:tcW w:w="1803" w:type="dxa"/>
+          </w:tcPr>
+          <w:p>
+            <w:pPr>
+              <w:spacing w:after="0" w:line="240" w:lineRule="auto"/>
+              <w:rPr>
+                <w:sz w:val="24"/>
+                <w:szCs w:val="24"/>
+                <w:lang w:val="en-US"/>
+              </w:rPr>
+            </w:pPr>
+            <w:r>
+              <w:rPr>
+                <w:rFonts w:eastAsia="Aptos"/>
+                <w:sz w:val="24"/>
+                <w:szCs w:val="24"/>
+                <w:lang w:val="en-US"/>
+              </w:rPr>
+              <w:t>19 439</w:t>
+            </w:r>
+          </w:p>
+        </w:tc>
+        <w:tc>
+          <w:tcPr>
+            <w:tcW w:w="1803" w:type="dxa"/>
+          </w:tcPr>
+          <w:p>
+            <w:pPr>
+              <w:spacing w:after="0" w:line="240" w:lineRule="auto"/>
+              <w:rPr>
+                <w:sz w:val="24"/>
+                <w:szCs w:val="24"/>
+                <w:lang w:val="en-US"/>
+              </w:rPr>
+            </w:pPr>
+            <w:r>
+              <w:rPr>
+                <w:rFonts w:eastAsia="Aptos"/>
+                <w:sz w:val="24"/>
+                <w:szCs w:val="24"/>
+                <w:lang w:val="en-US"/>
+              </w:rPr>
+              <w:t>264</w:t>
+            </w:r>
+          </w:p>
+        </w:tc>
+        <w:tc>
+          <w:tcPr>
+            <w:tcW w:w="1803" w:type="dxa"/>
+          </w:tcPr>
+          <w:p>
+            <w:pPr>
+              <w:spacing w:after="0" w:line="240" w:lineRule="auto"/>
+              <w:rPr>
+                <w:sz w:val="24"/>
+                <w:szCs w:val="24"/>
+                <w:lang w:val="en-US"/>
+              </w:rPr>
+            </w:pPr>
+            <w:r>
+              <w:rPr>
+                <w:rFonts w:eastAsia="Aptos"/>
+                <w:sz w:val="24"/>
+                <w:szCs w:val="24"/>
+                <w:lang w:val="en-US"/>
+              </w:rPr>
+              <w:t>5 715</w:t>
+            </w:r>
+          </w:p>
+        </w:tc>
+        <w:tc>
+          <w:tcPr>
+            <w:tcW w:w="1803" w:type="dxa"/>
+          </w:tcPr>
+          <w:p>
+            <w:pPr>
+              <w:spacing w:after="0" w:line="240" w:lineRule="auto"/>
+              <w:rPr>
+                <w:sz w:val="24"/>
+                <w:szCs w:val="24"/>
+                <w:lang w:val="en-US"/>
+              </w:rPr>
+            </w:pPr>
+            <w:r>
+              <w:rPr>
+                <w:rFonts w:eastAsia="Aptos"/>
+                <w:sz w:val="24"/>
+                <w:szCs w:val="24"/>
+                <w:lang w:val="en-US"/>
+              </w:rPr>
+              <w:t>739</w:t>
+            </w:r>
+          </w:p>
+        </w:tc>
+        <w:tc>
+          <w:tcPr>
+            <w:tcW w:w="1804" w:type="dxa"/>
+          </w:tcPr>
+          <w:p>
+            <w:pPr>
+              <w:spacing w:after="0" w:line="240" w:lineRule="auto"/>
+              <w:rPr>
+                <w:sz w:val="24"/>
+                <w:szCs w:val="24"/>
+                <w:lang w:val="en-US"/>
+              </w:rPr>
+            </w:pPr>
+            <w:r>
+              <w:rPr>
+                <w:rFonts w:eastAsia="Aptos"/>
+                <w:sz w:val="24"/>
+                <w:szCs w:val="24"/>
+                <w:lang w:val="en-US"/>
+              </w:rPr>
+              <w:t>26 158</w:t>
+            </w:r>
+          </w:p>
+        </w:tc>
+      </w:tr>
+    </w:tbl>
+    <w:p>
+      <w:pPr>
+        <w:rPr>
+          <w:b/>
+          <w:bCs/>
+          <w:sz w:val="28"/>
+          <w:szCs w:val="28"/>
+          <w:lang w:val="en-US"/>
+        </w:rPr>
+      </w:pPr>
+    </w:p>
+    <w:p>
+      <w:pPr>
+        <w:rPr>
+          <w:b/>
+          <w:bCs/>
+          <w:sz w:val="28"/>
+          <w:szCs w:val="28"/>
+          <w:lang w:val="en-US"/>
+        </w:rPr>
+      </w:pPr>
+    </w:p>
+    <w:p>
+      <w:pPr>
+        <w:rPr>
+          <w:b/>
+          <w:bCs/>
+          <w:sz w:val="28"/>
+          <w:szCs w:val="28"/>
+          <w:lang w:val="en-US"/>
+        </w:rPr>
+      </w:pPr>
+    </w:p>
+    <w:p>
+      <w:pPr>
+        <w:rPr>
+          <w:b/>
+          <w:bCs/>
+          <w:sz w:val="28"/>
+          <w:szCs w:val="28"/>
+          <w:lang w:val="en-US"/>
+        </w:rPr>
+      </w:pPr>
+    </w:p>
+    <w:p>
+      <w:pPr>
+        <w:rPr>
+          <w:b/>
+          <w:bCs/>
+          <w:sz w:val="28"/>
+          <w:szCs w:val="28"/>
+          <w:lang w:val="en-US"/>
+        </w:rPr>
+      </w:pPr>
+      <w:r>
+        <w:rPr>
+          <w:b/>
+          <w:bCs/>
+          <w:sz w:val="28"/>
+          <w:szCs w:val="28"/>
+          <w:lang w:val="en-US"/>
+        </w:rPr>
+        <w:t xml:space="preserve">Saudia Arabia Floods the Market </w:t>
       </w:r>
     </w:p>
     <w:p>
@@ -743,7 +1655,7 @@
                     </pic:cNvPicPr>
                   </pic:nvPicPr>
                   <pic:blipFill>
-                    <a:blip r:embed="rId5"/>
+                    <a:blip r:embed="rId6"/>
                     <a:stretch>
                       <a:fillRect/>
                     </a:stretch>
@@ -797,7 +1709,7 @@
                     </pic:cNvPicPr>
                   </pic:nvPicPr>
                   <pic:blipFill>
-                    <a:blip r:embed="rId6"/>
+                    <a:blip r:embed="rId7"/>
                     <a:stretch>
                       <a:fillRect/>
                     </a:stretch>
@@ -1090,11 +2002,45 @@
     <w:p>
       <w:pPr>
         <w:rPr>
-          <w:sz w:val="24"/>
-          <w:szCs w:val="24"/>
-          <w:lang w:val="en-US"/>
-        </w:rPr>
-      </w:pPr>
+          <w:b/>
+          <w:bCs/>
+          <w:sz w:val="28"/>
+          <w:szCs w:val="28"/>
+          <w:lang w:val="en-US"/>
+        </w:rPr>
+      </w:pPr>
+    </w:p>
+    <w:p>
+      <w:pPr>
+        <w:rPr>
+          <w:b/>
+          <w:bCs/>
+          <w:sz w:val="28"/>
+          <w:szCs w:val="28"/>
+          <w:lang w:val="en-US"/>
+        </w:rPr>
+      </w:pPr>
+    </w:p>
+    <w:p>
+      <w:pPr>
+        <w:rPr>
+          <w:b/>
+          <w:bCs/>
+          <w:sz w:val="28"/>
+          <w:szCs w:val="28"/>
+          <w:lang w:val="en-US"/>
+        </w:rPr>
+      </w:pPr>
+      <w:r>
+        <w:rPr>
+          <w:b/>
+          <w:bCs/>
+          <w:sz w:val="28"/>
+          <w:szCs w:val="28"/>
+          <w:lang w:val="en-US"/>
+        </w:rPr>
+        <w:t>Saudi Arabia Saves the Market Price</w:t>
+      </w:r>
     </w:p>
     <w:p>
       <w:pPr>
@@ -1115,475 +2061,7 @@
           <w:szCs w:val="28"/>
           <w:lang w:val="en-US"/>
         </w:rPr>
-        <w:drawing>
-          <wp:anchor distT="0" distB="0" distL="114300" distR="114300" simplePos="0" relativeHeight="2" behindDoc="0" locked="0" layoutInCell="0" allowOverlap="1" wp14:anchorId="0FE958B1" wp14:editId="1A0F591A">
-            <wp:simplePos x="0" y="0"/>
-            <wp:positionH relativeFrom="margin">
-              <wp:posOffset>-176335</wp:posOffset>
-            </wp:positionH>
-            <wp:positionV relativeFrom="paragraph">
-              <wp:posOffset>371622</wp:posOffset>
-            </wp:positionV>
-            <wp:extent cx="2880995" cy="2209165"/>
-            <wp:effectExtent l="0" t="0" r="0" b="635"/>
-            <wp:wrapSquare wrapText="bothSides"/>
-            <wp:docPr id="3" name="Image4"/>
-            <wp:cNvGraphicFramePr>
-              <a:graphicFrameLocks xmlns:a="http://schemas.openxmlformats.org/drawingml/2006/main" noChangeAspect="1"/>
-            </wp:cNvGraphicFramePr>
-            <a:graphic xmlns:a="http://schemas.openxmlformats.org/drawingml/2006/main">
-              <a:graphicData uri="http://schemas.openxmlformats.org/drawingml/2006/picture">
-                <pic:pic xmlns:pic="http://schemas.openxmlformats.org/drawingml/2006/picture">
-                  <pic:nvPicPr>
-                    <pic:cNvPr id="3" name="Image4"/>
-                    <pic:cNvPicPr>
-                      <a:picLocks noChangeAspect="1" noChangeArrowheads="1"/>
-                    </pic:cNvPicPr>
-                  </pic:nvPicPr>
-                  <pic:blipFill>
-                    <a:blip r:embed="rId7"/>
-                    <a:srcRect l="1923"/>
-                    <a:stretch>
-                      <a:fillRect/>
-                    </a:stretch>
-                  </pic:blipFill>
-                  <pic:spPr bwMode="auto">
-                    <a:xfrm>
-                      <a:off x="0" y="0"/>
-                      <a:ext cx="2880995" cy="2209165"/>
-                    </a:xfrm>
-                    <a:prstGeom prst="rect">
-                      <a:avLst/>
-                    </a:prstGeom>
-                    <a:noFill/>
-                  </pic:spPr>
-                </pic:pic>
-              </a:graphicData>
-            </a:graphic>
-          </wp:anchor>
-        </w:drawing>
-      </w:r>
-      <w:r>
-        <w:rPr>
-          <w:b/>
-          <w:bCs/>
-          <w:sz w:val="28"/>
-          <w:szCs w:val="28"/>
-          <w:lang w:val="en-US"/>
-        </w:rPr>
-        <w:t>SCENARIO 2 – All OPEC Members Follow Quotas</w:t>
-      </w:r>
-    </w:p>
-    <w:p>
-      <w:pPr>
-        <w:rPr>
-          <w:b/>
-          <w:bCs/>
-          <w:sz w:val="28"/>
-          <w:szCs w:val="28"/>
-          <w:lang w:val="en-US"/>
-        </w:rPr>
-      </w:pPr>
-    </w:p>
-    <w:p>
-      <w:pPr>
-        <w:rPr>
-          <w:b/>
-          <w:bCs/>
-          <w:sz w:val="28"/>
-          <w:szCs w:val="28"/>
-          <w:lang w:val="en-US"/>
-        </w:rPr>
-      </w:pPr>
-    </w:p>
-    <w:p>
-      <w:pPr>
-        <w:rPr>
-          <w:b/>
-          <w:bCs/>
-          <w:sz w:val="28"/>
-          <w:szCs w:val="28"/>
-          <w:lang w:val="en-US"/>
-        </w:rPr>
-      </w:pPr>
-    </w:p>
-    <w:p>
-      <w:pPr>
-        <w:rPr>
-          <w:b/>
-          <w:bCs/>
-          <w:sz w:val="28"/>
-          <w:szCs w:val="28"/>
-          <w:lang w:val="en-US"/>
-        </w:rPr>
-      </w:pPr>
-    </w:p>
-    <w:p>
-      <w:pPr>
-        <w:rPr>
-          <w:b/>
-          <w:bCs/>
-          <w:sz w:val="28"/>
-          <w:szCs w:val="28"/>
-          <w:lang w:val="en-US"/>
-        </w:rPr>
-      </w:pPr>
-    </w:p>
-    <w:p>
-      <w:pPr>
-        <w:rPr>
-          <w:b/>
-          <w:bCs/>
-          <w:sz w:val="28"/>
-          <w:szCs w:val="28"/>
-          <w:lang w:val="en-US"/>
-        </w:rPr>
-      </w:pPr>
-    </w:p>
-    <w:p>
-      <w:pPr>
-        <w:rPr>
-          <w:b/>
-          <w:bCs/>
-          <w:sz w:val="28"/>
-          <w:szCs w:val="28"/>
-          <w:lang w:val="en-US"/>
-        </w:rPr>
-      </w:pPr>
-    </w:p>
-    <w:p>
-      <w:pPr>
-        <w:rPr>
-          <w:b/>
-          <w:bCs/>
-          <w:sz w:val="28"/>
-          <w:szCs w:val="28"/>
-          <w:lang w:val="en-US"/>
-        </w:rPr>
-      </w:pPr>
-    </w:p>
-    <w:tbl>
-      <w:tblPr>
-        <w:tblStyle w:val="TableGrid"/>
-        <w:tblW w:w="9016" w:type="dxa"/>
-        <w:tblLayout w:type="fixed"/>
-        <w:tblLook w:val="04A0" w:firstRow="1" w:lastRow="0" w:firstColumn="1" w:lastColumn="0" w:noHBand="0" w:noVBand="1"/>
-      </w:tblPr>
-      <w:tblGrid>
-        <w:gridCol w:w="1803"/>
-        <w:gridCol w:w="1803"/>
-        <w:gridCol w:w="1803"/>
-        <w:gridCol w:w="1803"/>
-        <w:gridCol w:w="1804"/>
-      </w:tblGrid>
-      <w:tr>
-        <w:tc>
-          <w:tcPr>
-            <w:tcW w:w="1803" w:type="dxa"/>
-          </w:tcPr>
-          <w:p>
-            <w:pPr>
-              <w:spacing w:after="0" w:line="240" w:lineRule="auto"/>
-              <w:rPr>
-                <w:sz w:val="24"/>
-                <w:szCs w:val="24"/>
-                <w:lang w:val="en-US"/>
-              </w:rPr>
-            </w:pPr>
-            <w:r>
-              <w:rPr>
-                <w:rFonts w:eastAsia="Aptos"/>
-                <w:sz w:val="24"/>
-                <w:szCs w:val="24"/>
-                <w:lang w:val="en-US"/>
-              </w:rPr>
-              <w:t>Saudia Arabia</w:t>
-            </w:r>
-          </w:p>
-        </w:tc>
-        <w:tc>
-          <w:tcPr>
-            <w:tcW w:w="1803" w:type="dxa"/>
-          </w:tcPr>
-          <w:p>
-            <w:pPr>
-              <w:spacing w:after="0" w:line="240" w:lineRule="auto"/>
-              <w:rPr>
-                <w:sz w:val="24"/>
-                <w:szCs w:val="24"/>
-                <w:lang w:val="en-US"/>
-              </w:rPr>
-            </w:pPr>
-            <w:r>
-              <w:rPr>
-                <w:rFonts w:eastAsia="Aptos"/>
-                <w:sz w:val="24"/>
-                <w:szCs w:val="24"/>
-                <w:lang w:val="en-US"/>
-              </w:rPr>
-              <w:t>Venezuela</w:t>
-            </w:r>
-          </w:p>
-        </w:tc>
-        <w:tc>
-          <w:tcPr>
-            <w:tcW w:w="1803" w:type="dxa"/>
-          </w:tcPr>
-          <w:p>
-            <w:pPr>
-              <w:spacing w:after="0" w:line="240" w:lineRule="auto"/>
-              <w:rPr>
-                <w:sz w:val="24"/>
-                <w:szCs w:val="24"/>
-                <w:lang w:val="en-US"/>
-              </w:rPr>
-            </w:pPr>
-            <w:r>
-              <w:rPr>
-                <w:rFonts w:eastAsia="Aptos"/>
-                <w:sz w:val="24"/>
-                <w:szCs w:val="24"/>
-                <w:lang w:val="en-US"/>
-              </w:rPr>
-              <w:t>UAE</w:t>
-            </w:r>
-          </w:p>
-        </w:tc>
-        <w:tc>
-          <w:tcPr>
-            <w:tcW w:w="1803" w:type="dxa"/>
-          </w:tcPr>
-          <w:p>
-            <w:pPr>
-              <w:spacing w:after="0" w:line="240" w:lineRule="auto"/>
-              <w:rPr>
-                <w:sz w:val="24"/>
-                <w:szCs w:val="24"/>
-                <w:lang w:val="en-US"/>
-              </w:rPr>
-            </w:pPr>
-            <w:r>
-              <w:rPr>
-                <w:rFonts w:eastAsia="Aptos"/>
-                <w:sz w:val="24"/>
-                <w:szCs w:val="24"/>
-                <w:lang w:val="en-US"/>
-              </w:rPr>
-              <w:t xml:space="preserve">Nigeria </w:t>
-            </w:r>
-          </w:p>
-        </w:tc>
-        <w:tc>
-          <w:tcPr>
-            <w:tcW w:w="1804" w:type="dxa"/>
-          </w:tcPr>
-          <w:p>
-            <w:pPr>
-              <w:spacing w:after="0" w:line="240" w:lineRule="auto"/>
-              <w:rPr>
-                <w:sz w:val="24"/>
-                <w:szCs w:val="24"/>
-                <w:lang w:val="en-US"/>
-              </w:rPr>
-            </w:pPr>
-            <w:r>
-              <w:rPr>
-                <w:rFonts w:eastAsia="Aptos"/>
-                <w:sz w:val="24"/>
-                <w:szCs w:val="24"/>
-                <w:lang w:val="en-US"/>
-              </w:rPr>
-              <w:t>Total</w:t>
-            </w:r>
-          </w:p>
-        </w:tc>
-      </w:tr>
-      <w:tr>
-        <w:tc>
-          <w:tcPr>
-            <w:tcW w:w="1803" w:type="dxa"/>
-          </w:tcPr>
-          <w:p>
-            <w:pPr>
-              <w:spacing w:after="0" w:line="240" w:lineRule="auto"/>
-              <w:rPr>
-                <w:sz w:val="24"/>
-                <w:szCs w:val="24"/>
-                <w:lang w:val="en-US"/>
-              </w:rPr>
-            </w:pPr>
-            <w:r>
-              <w:rPr>
-                <w:rFonts w:eastAsia="Aptos"/>
-                <w:sz w:val="24"/>
-                <w:szCs w:val="24"/>
-                <w:lang w:val="en-US"/>
-              </w:rPr>
-              <w:t>30 420</w:t>
-            </w:r>
-          </w:p>
-        </w:tc>
-        <w:tc>
-          <w:tcPr>
-            <w:tcW w:w="1803" w:type="dxa"/>
-          </w:tcPr>
-          <w:p>
-            <w:pPr>
-              <w:spacing w:after="0" w:line="240" w:lineRule="auto"/>
-              <w:rPr>
-                <w:sz w:val="24"/>
-                <w:szCs w:val="24"/>
-                <w:lang w:val="en-US"/>
-              </w:rPr>
-            </w:pPr>
-            <w:r>
-              <w:rPr>
-                <w:rFonts w:eastAsia="Aptos"/>
-                <w:sz w:val="24"/>
-                <w:szCs w:val="24"/>
-                <w:lang w:val="en-US"/>
-              </w:rPr>
-              <w:t>3 383</w:t>
-            </w:r>
-          </w:p>
-        </w:tc>
-        <w:tc>
-          <w:tcPr>
-            <w:tcW w:w="1803" w:type="dxa"/>
-          </w:tcPr>
-          <w:p>
-            <w:pPr>
-              <w:spacing w:after="0" w:line="240" w:lineRule="auto"/>
-              <w:rPr>
-                <w:sz w:val="24"/>
-                <w:szCs w:val="24"/>
-                <w:lang w:val="en-US"/>
-              </w:rPr>
-            </w:pPr>
-            <w:r>
-              <w:rPr>
-                <w:rFonts w:eastAsia="Aptos"/>
-                <w:sz w:val="24"/>
-                <w:szCs w:val="24"/>
-                <w:lang w:val="en-US"/>
-              </w:rPr>
-              <w:t>12 119</w:t>
-            </w:r>
-          </w:p>
-        </w:tc>
-        <w:tc>
-          <w:tcPr>
-            <w:tcW w:w="1803" w:type="dxa"/>
-          </w:tcPr>
-          <w:p>
-            <w:pPr>
-              <w:spacing w:after="0" w:line="240" w:lineRule="auto"/>
-              <w:rPr>
-                <w:sz w:val="24"/>
-                <w:szCs w:val="24"/>
-                <w:lang w:val="en-US"/>
-              </w:rPr>
-            </w:pPr>
-            <w:r>
-              <w:rPr>
-                <w:rFonts w:eastAsia="Aptos"/>
-                <w:sz w:val="24"/>
-                <w:szCs w:val="24"/>
-                <w:lang w:val="en-US"/>
-              </w:rPr>
-              <w:t>3 195</w:t>
-            </w:r>
-          </w:p>
-        </w:tc>
-        <w:tc>
-          <w:tcPr>
-            <w:tcW w:w="1804" w:type="dxa"/>
-          </w:tcPr>
-          <w:p>
-            <w:pPr>
-              <w:spacing w:after="0" w:line="240" w:lineRule="auto"/>
-              <w:rPr>
-                <w:sz w:val="24"/>
-                <w:szCs w:val="24"/>
-                <w:lang w:val="en-US"/>
-              </w:rPr>
-            </w:pPr>
-            <w:r>
-              <w:rPr>
-                <w:rFonts w:eastAsia="Aptos"/>
-                <w:sz w:val="24"/>
-                <w:szCs w:val="24"/>
-                <w:lang w:val="en-US"/>
-              </w:rPr>
-              <w:t>49 119</w:t>
-            </w:r>
-          </w:p>
-        </w:tc>
-      </w:tr>
-    </w:tbl>
-    <w:p>
-      <w:pPr>
-        <w:rPr>
-          <w:b/>
-          <w:bCs/>
-          <w:sz w:val="28"/>
-          <w:szCs w:val="28"/>
-          <w:lang w:val="en-US"/>
-        </w:rPr>
-      </w:pPr>
-    </w:p>
-    <w:p>
-      <w:pPr>
-        <w:rPr>
-          <w:b/>
-          <w:bCs/>
-          <w:sz w:val="28"/>
-          <w:szCs w:val="28"/>
-          <w:lang w:val="en-US"/>
-        </w:rPr>
-      </w:pPr>
-    </w:p>
-    <w:p>
-      <w:pPr>
-        <w:rPr>
-          <w:b/>
-          <w:bCs/>
-          <w:sz w:val="28"/>
-          <w:szCs w:val="28"/>
-          <w:lang w:val="en-US"/>
-        </w:rPr>
-      </w:pPr>
-      <w:r>
-        <w:rPr>
-          <w:b/>
-          <w:bCs/>
-          <w:sz w:val="28"/>
-          <w:szCs w:val="28"/>
-          <w:lang w:val="en-US"/>
-        </w:rPr>
         <w:lastRenderedPageBreak/>
-        <w:t>SCENARIO 3 – Saudi Arabia Saves the Market Price</w:t>
-      </w:r>
-    </w:p>
-    <w:p>
-      <w:pPr>
-        <w:rPr>
-          <w:b/>
-          <w:bCs/>
-          <w:sz w:val="28"/>
-          <w:szCs w:val="28"/>
-          <w:lang w:val="en-US"/>
-        </w:rPr>
-      </w:pPr>
-      <w:r>
-        <w:rPr>
-          <w:b/>
-          <w:bCs/>
-          <w:noProof/>
-          <w:sz w:val="28"/>
-          <w:szCs w:val="28"/>
-          <w:lang w:val="en-US"/>
-        </w:rPr>
         <w:drawing>
           <wp:anchor distT="0" distB="0" distL="0" distR="0" simplePos="0" relativeHeight="16" behindDoc="0" locked="0" layoutInCell="0" allowOverlap="1" wp14:anchorId="5BCFDC52" wp14:editId="50441818">
             <wp:simplePos x="0" y="0"/>
@@ -1958,297 +2436,6 @@
         </w:rPr>
       </w:pPr>
     </w:p>
-    <w:p>
-      <w:pPr>
-        <w:rPr>
-          <w:b/>
-          <w:bCs/>
-          <w:sz w:val="28"/>
-          <w:szCs w:val="28"/>
-          <w:lang w:val="en-US"/>
-        </w:rPr>
-      </w:pPr>
-      <w:r>
-        <w:rPr>
-          <w:b/>
-          <w:bCs/>
-          <w:sz w:val="28"/>
-          <w:szCs w:val="28"/>
-          <w:lang w:val="en-US"/>
-        </w:rPr>
-        <w:t>SCENARIO 4 – Maximal possible production, ignore quotas</w:t>
-      </w:r>
-    </w:p>
-    <w:p>
-      <w:pPr>
-        <w:rPr>
-          <w:b/>
-          <w:bCs/>
-          <w:sz w:val="28"/>
-          <w:szCs w:val="28"/>
-          <w:lang w:val="en-US"/>
-        </w:rPr>
-      </w:pPr>
-    </w:p>
-    <w:tbl>
-      <w:tblPr>
-        <w:tblStyle w:val="TableGrid"/>
-        <w:tblW w:w="9016" w:type="dxa"/>
-        <w:tblLayout w:type="fixed"/>
-        <w:tblLook w:val="04A0" w:firstRow="1" w:lastRow="0" w:firstColumn="1" w:lastColumn="0" w:noHBand="0" w:noVBand="1"/>
-      </w:tblPr>
-      <w:tblGrid>
-        <w:gridCol w:w="1803"/>
-        <w:gridCol w:w="1803"/>
-        <w:gridCol w:w="1803"/>
-        <w:gridCol w:w="1803"/>
-        <w:gridCol w:w="1804"/>
-      </w:tblGrid>
-      <w:tr>
-        <w:tc>
-          <w:tcPr>
-            <w:tcW w:w="1803" w:type="dxa"/>
-          </w:tcPr>
-          <w:p>
-            <w:pPr>
-              <w:spacing w:after="0" w:line="240" w:lineRule="auto"/>
-              <w:rPr>
-                <w:sz w:val="24"/>
-                <w:szCs w:val="24"/>
-                <w:lang w:val="en-US"/>
-              </w:rPr>
-            </w:pPr>
-            <w:r>
-              <w:rPr>
-                <w:rFonts w:eastAsia="Aptos"/>
-                <w:sz w:val="24"/>
-                <w:szCs w:val="24"/>
-                <w:lang w:val="en-US"/>
-              </w:rPr>
-              <w:t>Saudia Arabia</w:t>
-            </w:r>
-          </w:p>
-        </w:tc>
-        <w:tc>
-          <w:tcPr>
-            <w:tcW w:w="1803" w:type="dxa"/>
-          </w:tcPr>
-          <w:p>
-            <w:pPr>
-              <w:spacing w:after="0" w:line="240" w:lineRule="auto"/>
-              <w:rPr>
-                <w:sz w:val="24"/>
-                <w:szCs w:val="24"/>
-                <w:lang w:val="en-US"/>
-              </w:rPr>
-            </w:pPr>
-            <w:r>
-              <w:rPr>
-                <w:rFonts w:eastAsia="Aptos"/>
-                <w:sz w:val="24"/>
-                <w:szCs w:val="24"/>
-                <w:lang w:val="en-US"/>
-              </w:rPr>
-              <w:t>Venezuela</w:t>
-            </w:r>
-          </w:p>
-        </w:tc>
-        <w:tc>
-          <w:tcPr>
-            <w:tcW w:w="1803" w:type="dxa"/>
-          </w:tcPr>
-          <w:p>
-            <w:pPr>
-              <w:spacing w:after="0" w:line="240" w:lineRule="auto"/>
-              <w:rPr>
-                <w:sz w:val="24"/>
-                <w:szCs w:val="24"/>
-                <w:lang w:val="en-US"/>
-              </w:rPr>
-            </w:pPr>
-            <w:r>
-              <w:rPr>
-                <w:rFonts w:eastAsia="Aptos"/>
-                <w:sz w:val="24"/>
-                <w:szCs w:val="24"/>
-                <w:lang w:val="en-US"/>
-              </w:rPr>
-              <w:t>UAE</w:t>
-            </w:r>
-          </w:p>
-        </w:tc>
-        <w:tc>
-          <w:tcPr>
-            <w:tcW w:w="1803" w:type="dxa"/>
-          </w:tcPr>
-          <w:p>
-            <w:pPr>
-              <w:spacing w:after="0" w:line="240" w:lineRule="auto"/>
-              <w:rPr>
-                <w:sz w:val="24"/>
-                <w:szCs w:val="24"/>
-                <w:lang w:val="en-US"/>
-              </w:rPr>
-            </w:pPr>
-            <w:r>
-              <w:rPr>
-                <w:rFonts w:eastAsia="Aptos"/>
-                <w:sz w:val="24"/>
-                <w:szCs w:val="24"/>
-                <w:lang w:val="en-US"/>
-              </w:rPr>
-              <w:t xml:space="preserve">Nigeria </w:t>
-            </w:r>
-          </w:p>
-        </w:tc>
-        <w:tc>
-          <w:tcPr>
-            <w:tcW w:w="1804" w:type="dxa"/>
-          </w:tcPr>
-          <w:p>
-            <w:pPr>
-              <w:spacing w:after="0" w:line="240" w:lineRule="auto"/>
-              <w:rPr>
-                <w:sz w:val="24"/>
-                <w:szCs w:val="24"/>
-                <w:lang w:val="en-US"/>
-              </w:rPr>
-            </w:pPr>
-            <w:r>
-              <w:rPr>
-                <w:rFonts w:eastAsia="Aptos"/>
-                <w:sz w:val="24"/>
-                <w:szCs w:val="24"/>
-                <w:lang w:val="en-US"/>
-              </w:rPr>
-              <w:t>Total</w:t>
-            </w:r>
-          </w:p>
-        </w:tc>
-      </w:tr>
-      <w:tr>
-        <w:tc>
-          <w:tcPr>
-            <w:tcW w:w="1803" w:type="dxa"/>
-          </w:tcPr>
-          <w:p>
-            <w:pPr>
-              <w:spacing w:after="0" w:line="240" w:lineRule="auto"/>
-              <w:rPr>
-                <w:sz w:val="24"/>
-                <w:szCs w:val="24"/>
-                <w:lang w:val="en-US"/>
-              </w:rPr>
-            </w:pPr>
-            <w:r>
-              <w:rPr>
-                <w:rFonts w:eastAsia="Aptos"/>
-                <w:sz w:val="24"/>
-                <w:szCs w:val="24"/>
-                <w:lang w:val="en-US"/>
-              </w:rPr>
-              <w:t>19 439</w:t>
-            </w:r>
-          </w:p>
-        </w:tc>
-        <w:tc>
-          <w:tcPr>
-            <w:tcW w:w="1803" w:type="dxa"/>
-          </w:tcPr>
-          <w:p>
-            <w:pPr>
-              <w:spacing w:after="0" w:line="240" w:lineRule="auto"/>
-              <w:rPr>
-                <w:sz w:val="24"/>
-                <w:szCs w:val="24"/>
-                <w:lang w:val="en-US"/>
-              </w:rPr>
-            </w:pPr>
-            <w:r>
-              <w:rPr>
-                <w:rFonts w:eastAsia="Aptos"/>
-                <w:sz w:val="24"/>
-                <w:szCs w:val="24"/>
-                <w:lang w:val="en-US"/>
-              </w:rPr>
-              <w:t>264</w:t>
-            </w:r>
-          </w:p>
-        </w:tc>
-        <w:tc>
-          <w:tcPr>
-            <w:tcW w:w="1803" w:type="dxa"/>
-          </w:tcPr>
-          <w:p>
-            <w:pPr>
-              <w:spacing w:after="0" w:line="240" w:lineRule="auto"/>
-              <w:rPr>
-                <w:sz w:val="24"/>
-                <w:szCs w:val="24"/>
-                <w:lang w:val="en-US"/>
-              </w:rPr>
-            </w:pPr>
-            <w:r>
-              <w:rPr>
-                <w:rFonts w:eastAsia="Aptos"/>
-                <w:sz w:val="24"/>
-                <w:szCs w:val="24"/>
-                <w:lang w:val="en-US"/>
-              </w:rPr>
-              <w:t>5 715</w:t>
-            </w:r>
-          </w:p>
-        </w:tc>
-        <w:tc>
-          <w:tcPr>
-            <w:tcW w:w="1803" w:type="dxa"/>
-          </w:tcPr>
-          <w:p>
-            <w:pPr>
-              <w:spacing w:after="0" w:line="240" w:lineRule="auto"/>
-              <w:rPr>
-                <w:sz w:val="24"/>
-                <w:szCs w:val="24"/>
-                <w:lang w:val="en-US"/>
-              </w:rPr>
-            </w:pPr>
-            <w:r>
-              <w:rPr>
-                <w:rFonts w:eastAsia="Aptos"/>
-                <w:sz w:val="24"/>
-                <w:szCs w:val="24"/>
-                <w:lang w:val="en-US"/>
-              </w:rPr>
-              <w:t>739</w:t>
-            </w:r>
-          </w:p>
-        </w:tc>
-        <w:tc>
-          <w:tcPr>
-            <w:tcW w:w="1804" w:type="dxa"/>
-          </w:tcPr>
-          <w:p>
-            <w:pPr>
-              <w:spacing w:after="0" w:line="240" w:lineRule="auto"/>
-              <w:rPr>
-                <w:sz w:val="24"/>
-                <w:szCs w:val="24"/>
-                <w:lang w:val="en-US"/>
-              </w:rPr>
-            </w:pPr>
-            <w:r>
-              <w:rPr>
-                <w:rFonts w:eastAsia="Aptos"/>
-                <w:sz w:val="24"/>
-                <w:szCs w:val="24"/>
-                <w:lang w:val="en-US"/>
-              </w:rPr>
-              <w:t>26 158</w:t>
-            </w:r>
-          </w:p>
-        </w:tc>
-      </w:tr>
-    </w:tbl>
     <w:p>
       <w:pPr>
         <w:rPr>
@@ -3241,11 +3428,16 @@
           <w:szCs w:val="28"/>
           <w:lang w:val="en-US"/>
         </w:rPr>
-        <w:t>Source</w:t>
-      </w:r>
-    </w:p>
-    <w:p>
-      <w:pPr>
+        <w:t>References</w:t>
+      </w:r>
+    </w:p>
+    <w:p>
+      <w:pPr>
+        <w:pStyle w:val="ListParagraph"/>
+        <w:numPr>
+          <w:ilvl w:val="0"/>
+          <w:numId w:val="1"/>
+        </w:numPr>
         <w:spacing w:after="0"/>
         <w:rPr>
           <w:sz w:val="24"/>
@@ -3257,31 +3449,31 @@
         <w:rPr>
           <w:sz w:val="24"/>
           <w:szCs w:val="24"/>
-          <w:lang w:val="en-US"/>
         </w:rPr>
         <w:lastRenderedPageBreak/>
-        <w:t>University of Illinois Chicago</w:t>
-      </w:r>
-      <w:r>
-        <w:rPr>
-          <w:sz w:val="24"/>
-          <w:szCs w:val="24"/>
-          <w:lang w:val="en-US"/>
-        </w:rPr>
-        <w:t xml:space="preserve"> - </w:t>
-      </w:r>
-      <w:r>
-        <w:rPr>
-          <w:sz w:val="24"/>
-          <w:szCs w:val="24"/>
-          <w:lang w:val="en-US"/>
-        </w:rPr>
-        <w:t>Notes on Cournot Oligopoly</w:t>
+        <w:t xml:space="preserve">Marker, D. (2019). </w:t>
+      </w:r>
+      <w:r>
+        <w:rPr>
+          <w:i/>
+          <w:iCs/>
+          <w:sz w:val="24"/>
+          <w:szCs w:val="24"/>
+        </w:rPr>
+        <w:t>Notes on Cournot oligopoly</w:t>
+      </w:r>
+      <w:r>
+        <w:rPr>
+          <w:sz w:val="24"/>
+          <w:szCs w:val="24"/>
+        </w:rPr>
+        <w:t>. University of Illinois Chicago, Department of Mathematics, Statistics, and Computer Science.</w:t>
       </w:r>
     </w:p>
     <w:p>
       <w:pPr>
         <w:spacing w:after="0"/>
+        <w:ind w:left="360" w:firstLine="348"/>
         <w:rPr>
           <w:sz w:val="24"/>
           <w:szCs w:val="24"/>
@@ -3330,6 +3522,11 @@
     </w:p>
     <w:p>
       <w:pPr>
+        <w:pStyle w:val="ListParagraph"/>
+        <w:numPr>
+          <w:ilvl w:val="0"/>
+          <w:numId w:val="1"/>
+        </w:numPr>
         <w:spacing w:after="0"/>
         <w:rPr>
           <w:sz w:val="24"/>
@@ -3377,12 +3574,13 @@
     <w:p>
       <w:pPr>
         <w:spacing w:after="0"/>
-        <w:rPr>
-          <w:sz w:val="24"/>
-          <w:szCs w:val="24"/>
-        </w:rPr>
-      </w:pPr>
-      <w:hyperlink r:id="rId21">
+        <w:ind w:left="708"/>
+        <w:rPr>
+          <w:sz w:val="24"/>
+          <w:szCs w:val="24"/>
+        </w:rPr>
+      </w:pPr>
+      <w:hyperlink r:id="rId21" w:history="1">
         <w:r>
           <w:rPr>
             <w:rStyle w:val="Hyperlink"/>
@@ -3426,6 +3624,16 @@
         <w:t>Prilohy</w:t>
       </w:r>
       <w:proofErr w:type="spellEnd"/>
+      <w:r>
+        <w:rPr>
+          <w:b/>
+          <w:bCs/>
+          <w:sz w:val="28"/>
+          <w:szCs w:val="28"/>
+          <w:lang w:val="en-US"/>
+        </w:rPr>
+        <w:t xml:space="preserve"> ???</w:t>
+      </w:r>
     </w:p>
     <w:p>
       <w:pPr>
@@ -3601,6 +3809,103 @@
     </w:sectPr>
   </w:body>
 </w:document>
+</file>
+
+<file path=word/numbering.xml><?xml version="1.0" encoding="utf-8"?>
+<w:numbering xmlns:wpc="http://schemas.microsoft.com/office/word/2010/wordprocessingCanvas" xmlns:cx="http://schemas.microsoft.com/office/drawing/2014/chartex" xmlns:cx1="http://schemas.microsoft.com/office/drawing/2015/9/8/chartex" xmlns:cx2="http://schemas.microsoft.com/office/drawing/2015/10/21/chartex" xmlns:cx3="http://schemas.microsoft.com/office/drawing/2016/5/9/chartex" xmlns:cx4="http://schemas.microsoft.com/office/drawing/2016/5/10/chartex" xmlns:cx5="http://schemas.microsoft.com/office/drawing/2016/5/11/chartex" xmlns:cx6="http://schemas.microsoft.com/office/drawing/2016/5/12/chartex" xmlns:cx7="http://schemas.microsoft.com/office/drawing/2016/5/13/chartex" xmlns:cx8="http://schemas.microsoft.com/office/drawing/2016/5/14/chartex" xmlns:mc="http://schemas.openxmlformats.org/markup-compatibility/2006" xmlns:aink="http://schemas.microsoft.com/office/drawing/2016/ink" xmlns:am3d="http://schemas.microsoft.com/office/drawing/2017/model3d" xmlns:o="urn:schemas-microsoft-com:office:office" xmlns:oel="http://schemas.microsoft.com/office/2019/extlst" xmlns:r="http://schemas.openxmlformats.org/officeDocument/2006/relationships" xmlns:m="http://schemas.openxmlformats.org/officeDocument/2006/math" xmlns:v="urn:schemas-microsoft-com:vml" xmlns:wp14="http://schemas.microsoft.com/office/word/2010/wordprocessingDrawing" xmlns:wp="http://schemas.openxmlformats.org/drawingml/2006/wordprocessingDrawing" xmlns:w10="urn:schemas-microsoft-com:office:word" xmlns:w="http://schemas.openxmlformats.org/wordprocessingml/2006/main" xmlns:w14="http://schemas.microsoft.com/office/word/2010/wordml" xmlns:w15="http://schemas.microsoft.com/office/word/2012/wordml" xmlns:w16cex="http://schemas.microsoft.com/office/word/2018/wordml/cex" xmlns:w16cid="http://schemas.microsoft.com/office/word/2016/wordml/cid" xmlns:w16="http://schemas.microsoft.com/office/word/2018/wordml" xmlns:w16du="http://schemas.microsoft.com/office/word/2023/wordml/word16du" xmlns:w16sdtdh="http://schemas.microsoft.com/office/word/2020/wordml/sdtdatahash" xmlns:w16sdtfl="http://schemas.microsoft.com/office/word/2024/wordml/sdtformatlock" xmlns:w16se="http://schemas.microsoft.com/office/word/2015/wordml/symex" xmlns:wpg="http://schemas.microsoft.com/office/word/2010/wordprocessingGroup" xmlns:wpi="http://schemas.microsoft.com/office/word/2010/wordprocessingInk" xmlns:wne="http://schemas.microsoft.com/office/word/2006/wordml" xmlns:wps="http://schemas.microsoft.com/office/word/2010/wordprocessingShape" mc:Ignorable="w14 w15 w16se w16cid w16 w16cex w16sdtdh w16sdtfl w16du wp14">
+  <w:abstractNum w:abstractNumId="0" w15:restartNumberingAfterBreak="0">
+    <w:nsid w:val="297535D4"/>
+    <w:multiLevelType w:val="hybridMultilevel"/>
+    <w:tmpl w:val="8CA65DDE"/>
+    <w:lvl w:ilvl="0" w:tplc="40F0970E">
+      <w:start w:val="1"/>
+      <w:numFmt w:val="decimal"/>
+      <w:lvlText w:val="[%1]"/>
+      <w:lvlJc w:val="left"/>
+      <w:pPr>
+        <w:ind w:left="720" w:hanging="360"/>
+      </w:pPr>
+      <w:rPr>
+        <w:rFonts w:hint="default"/>
+      </w:rPr>
+    </w:lvl>
+    <w:lvl w:ilvl="1" w:tplc="04050019" w:tentative="1">
+      <w:start w:val="1"/>
+      <w:numFmt w:val="lowerLetter"/>
+      <w:lvlText w:val="%2."/>
+      <w:lvlJc w:val="left"/>
+      <w:pPr>
+        <w:ind w:left="1440" w:hanging="360"/>
+      </w:pPr>
+    </w:lvl>
+    <w:lvl w:ilvl="2" w:tplc="0405001B" w:tentative="1">
+      <w:start w:val="1"/>
+      <w:numFmt w:val="lowerRoman"/>
+      <w:lvlText w:val="%3."/>
+      <w:lvlJc w:val="right"/>
+      <w:pPr>
+        <w:ind w:left="2160" w:hanging="180"/>
+      </w:pPr>
+    </w:lvl>
+    <w:lvl w:ilvl="3" w:tplc="0405000F" w:tentative="1">
+      <w:start w:val="1"/>
+      <w:numFmt w:val="decimal"/>
+      <w:lvlText w:val="%4."/>
+      <w:lvlJc w:val="left"/>
+      <w:pPr>
+        <w:ind w:left="2880" w:hanging="360"/>
+      </w:pPr>
+    </w:lvl>
+    <w:lvl w:ilvl="4" w:tplc="04050019" w:tentative="1">
+      <w:start w:val="1"/>
+      <w:numFmt w:val="lowerLetter"/>
+      <w:lvlText w:val="%5."/>
+      <w:lvlJc w:val="left"/>
+      <w:pPr>
+        <w:ind w:left="3600" w:hanging="360"/>
+      </w:pPr>
+    </w:lvl>
+    <w:lvl w:ilvl="5" w:tplc="0405001B" w:tentative="1">
+      <w:start w:val="1"/>
+      <w:numFmt w:val="lowerRoman"/>
+      <w:lvlText w:val="%6."/>
+      <w:lvlJc w:val="right"/>
+      <w:pPr>
+        <w:ind w:left="4320" w:hanging="180"/>
+      </w:pPr>
+    </w:lvl>
+    <w:lvl w:ilvl="6" w:tplc="0405000F" w:tentative="1">
+      <w:start w:val="1"/>
+      <w:numFmt w:val="decimal"/>
+      <w:lvlText w:val="%7."/>
+      <w:lvlJc w:val="left"/>
+      <w:pPr>
+        <w:ind w:left="5040" w:hanging="360"/>
+      </w:pPr>
+    </w:lvl>
+    <w:lvl w:ilvl="7" w:tplc="04050019" w:tentative="1">
+      <w:start w:val="1"/>
+      <w:numFmt w:val="lowerLetter"/>
+      <w:lvlText w:val="%8."/>
+      <w:lvlJc w:val="left"/>
+      <w:pPr>
+        <w:ind w:left="5760" w:hanging="360"/>
+      </w:pPr>
+    </w:lvl>
+    <w:lvl w:ilvl="8" w:tplc="0405001B" w:tentative="1">
+      <w:start w:val="1"/>
+      <w:numFmt w:val="lowerRoman"/>
+      <w:lvlText w:val="%9."/>
+      <w:lvlJc w:val="right"/>
+      <w:pPr>
+        <w:ind w:left="6480" w:hanging="180"/>
+      </w:pPr>
+    </w:lvl>
+  </w:abstractNum>
+  <w:num w:numId="1" w16cid:durableId="1286544973">
+    <w:abstractNumId w:val="0"/>
+  </w:num>
+</w:numbering>
 </file>
 
 <file path=word/styles.xml><?xml version="1.0" encoding="utf-8"?>
@@ -4003,7 +4308,7 @@
   <w:style w:type="paragraph" w:default="1" w:styleId="Normal">
     <w:name w:val="Normal"/>
     <w:qFormat/>
-    <w:rsid w:val="007842B1"/>
+    <w:rsid w:val="002244B4"/>
     <w:pPr>
       <w:spacing w:after="160" w:line="259" w:lineRule="auto"/>
     </w:pPr>
@@ -4213,7 +4518,6 @@
   <w:style w:type="character" w:default="1" w:styleId="DefaultParagraphFont">
     <w:name w:val="Default Paragraph Font"/>
     <w:uiPriority w:val="1"/>
-    <w:semiHidden/>
     <w:unhideWhenUsed/>
   </w:style>
   <w:style w:type="table" w:default="1" w:styleId="TableNormal">

</xml_diff>

<commit_message>
first two pages of report done!
</commit_message>
<xml_diff>
--- a/report_notes.docx
+++ b/report_notes.docx
@@ -115,35 +115,63 @@
         </w:rPr>
         <w:t>.</w:t>
       </w:r>
-    </w:p>
-    <w:p>
-      <w:pPr>
-        <w:rPr>
-          <w:sz w:val="24"/>
-          <w:szCs w:val="24"/>
-          <w:lang w:val="en-US"/>
-        </w:rPr>
-      </w:pPr>
-    </w:p>
-    <w:p>
-      <w:pPr>
-        <w:rPr>
-          <w:b/>
-          <w:bCs/>
-          <w:sz w:val="28"/>
-          <w:szCs w:val="28"/>
-          <w:lang w:val="en-US"/>
-        </w:rPr>
-      </w:pPr>
-      <w:r>
-        <w:rPr>
-          <w:b/>
-          <w:bCs/>
-          <w:sz w:val="28"/>
-          <w:szCs w:val="28"/>
-          <w:lang w:val="en-US"/>
-        </w:rPr>
-        <w:t>Theoretical base - Cournot Oligopoly</w:t>
+      <w:r>
+        <w:rPr>
+          <w:sz w:val="24"/>
+          <w:szCs w:val="24"/>
+          <w:lang w:val="en-US"/>
+        </w:rPr>
+        <w:t xml:space="preserve"> Implementation of a model was done in Python.</w:t>
+      </w:r>
+    </w:p>
+    <w:p>
+      <w:pPr>
+        <w:rPr>
+          <w:sz w:val="24"/>
+          <w:szCs w:val="24"/>
+          <w:lang w:val="en-US"/>
+        </w:rPr>
+      </w:pPr>
+    </w:p>
+    <w:p>
+      <w:pPr>
+        <w:rPr>
+          <w:b/>
+          <w:bCs/>
+          <w:sz w:val="28"/>
+          <w:szCs w:val="28"/>
+          <w:lang w:val="en-US"/>
+        </w:rPr>
+      </w:pPr>
+      <w:r>
+        <w:rPr>
+          <w:b/>
+          <w:bCs/>
+          <w:sz w:val="28"/>
+          <w:szCs w:val="28"/>
+          <w:lang w:val="en-US"/>
+        </w:rPr>
+        <w:t xml:space="preserve">Theoretical </w:t>
+      </w:r>
+      <w:r>
+        <w:rPr>
+          <w:b/>
+          <w:bCs/>
+          <w:sz w:val="28"/>
+          <w:szCs w:val="28"/>
+          <w:lang w:val="en-US"/>
+        </w:rPr>
+        <w:t>B</w:t>
+      </w:r>
+      <w:r>
+        <w:rPr>
+          <w:b/>
+          <w:bCs/>
+          <w:sz w:val="28"/>
+          <w:szCs w:val="28"/>
+          <w:lang w:val="en-US"/>
+        </w:rPr>
+        <w:t>ase - Cournot Oligopoly</w:t>
       </w:r>
     </w:p>
     <w:p>
@@ -867,18 +895,16 @@
           <w:lang w:val="en-US"/>
         </w:rPr>
       </w:pPr>
-      <w:proofErr w:type="spellStart"/>
-      <w:r>
-        <w:rPr>
-          <w:b/>
-          <w:bCs/>
-          <w:sz w:val="28"/>
-          <w:szCs w:val="28"/>
-          <w:lang w:val="en-US"/>
-        </w:rPr>
-        <w:t>Atributes</w:t>
-      </w:r>
-      <w:proofErr w:type="spellEnd"/>
+      <w:r>
+        <w:rPr>
+          <w:b/>
+          <w:bCs/>
+          <w:sz w:val="28"/>
+          <w:szCs w:val="28"/>
+          <w:lang w:val="en-US"/>
+        </w:rPr>
+        <w:t>Attributes</w:t>
+      </w:r>
       <w:r>
         <w:rPr>
           <w:b/>
@@ -893,54 +919,1377 @@
     <w:p>
       <w:pPr>
         <w:rPr>
-          <w:b/>
-          <w:bCs/>
-          <w:sz w:val="28"/>
-          <w:szCs w:val="28"/>
-          <w:lang w:val="en-US"/>
-        </w:rPr>
-      </w:pPr>
-    </w:p>
-    <w:p>
-      <w:pPr>
-        <w:rPr>
-          <w:b/>
-          <w:bCs/>
-          <w:sz w:val="28"/>
-          <w:szCs w:val="28"/>
-          <w:lang w:val="en-US"/>
-        </w:rPr>
-      </w:pPr>
-      <w:r>
-        <w:rPr>
-          <w:b/>
-          <w:bCs/>
-          <w:sz w:val="28"/>
-          <w:szCs w:val="28"/>
-          <w:lang w:val="en-US"/>
-        </w:rPr>
-        <w:t>Scenarios</w:t>
-      </w:r>
-    </w:p>
-    <w:p>
-      <w:pPr>
-        <w:rPr>
-          <w:b/>
-          <w:bCs/>
-          <w:sz w:val="28"/>
-          <w:szCs w:val="28"/>
-          <w:lang w:val="en-US"/>
-        </w:rPr>
-      </w:pPr>
-      <w:r>
-        <w:rPr>
-          <w:b/>
-          <w:bCs/>
-          <w:sz w:val="28"/>
-          <w:szCs w:val="28"/>
-          <w:lang w:val="en-US"/>
-        </w:rPr>
-        <w:t>All follow</w:t>
+          <w:sz w:val="24"/>
+          <w:szCs w:val="24"/>
+        </w:rPr>
+      </w:pPr>
+      <w:r>
+        <w:rPr>
+          <w:sz w:val="24"/>
+          <w:szCs w:val="24"/>
+        </w:rPr>
+        <w:t>Our model simulates a</w:t>
+      </w:r>
+      <w:r>
+        <w:rPr>
+          <w:sz w:val="24"/>
+          <w:szCs w:val="24"/>
+        </w:rPr>
+        <w:t xml:space="preserve"> 50-round</w:t>
+      </w:r>
+      <w:r>
+        <w:rPr>
+          <w:sz w:val="24"/>
+          <w:szCs w:val="24"/>
+        </w:rPr>
+        <w:t xml:space="preserve"> game involving four players, each representing an archetype of an OPEC member state. Each player's attributes and production quotas are calibrated to reflect the current economic status and strategic positioning of representative OPEC nations, as detailed in Table 1</w:t>
+      </w:r>
+      <w:r>
+        <w:rPr>
+          <w:sz w:val="24"/>
+          <w:szCs w:val="24"/>
+        </w:rPr>
+        <w:t>.</w:t>
+      </w:r>
+    </w:p>
+    <w:p>
+      <w:pPr>
+        <w:rPr>
+          <w:sz w:val="24"/>
+          <w:szCs w:val="24"/>
+        </w:rPr>
+      </w:pPr>
+    </w:p>
+    <w:tbl>
+      <w:tblPr>
+        <w:tblStyle w:val="TableGrid"/>
+        <w:tblW w:w="9459" w:type="dxa"/>
+        <w:tblInd w:w="-572" w:type="dxa"/>
+        <w:tblLook w:val="04A0" w:firstRow="1" w:lastRow="0" w:firstColumn="1" w:lastColumn="0" w:noHBand="0" w:noVBand="1"/>
+      </w:tblPr>
+      <w:tblGrid>
+        <w:gridCol w:w="1533"/>
+        <w:gridCol w:w="1112"/>
+        <w:gridCol w:w="1529"/>
+        <w:gridCol w:w="1670"/>
+        <w:gridCol w:w="1630"/>
+        <w:gridCol w:w="1985"/>
+      </w:tblGrid>
+      <w:tr>
+        <w:trPr>
+          <w:trHeight w:val="699"/>
+        </w:trPr>
+        <w:tc>
+          <w:tcPr>
+            <w:tcW w:w="1533" w:type="dxa"/>
+          </w:tcPr>
+          <w:p>
+            <w:pPr>
+              <w:spacing w:after="0"/>
+              <w:rPr>
+                <w:sz w:val="24"/>
+                <w:szCs w:val="24"/>
+              </w:rPr>
+            </w:pPr>
+          </w:p>
+        </w:tc>
+        <w:tc>
+          <w:tcPr>
+            <w:tcW w:w="1112" w:type="dxa"/>
+          </w:tcPr>
+          <w:p>
+            <w:pPr>
+              <w:spacing w:after="0"/>
+              <w:rPr>
+                <w:b/>
+                <w:bCs/>
+                <w:sz w:val="24"/>
+                <w:szCs w:val="24"/>
+              </w:rPr>
+            </w:pPr>
+            <w:r>
+              <w:rPr>
+                <w:b/>
+                <w:bCs/>
+                <w:sz w:val="24"/>
+                <w:szCs w:val="24"/>
+              </w:rPr>
+              <w:t>Quota</w:t>
+            </w:r>
+          </w:p>
+          <w:p>
+            <w:pPr>
+              <w:spacing w:after="0"/>
+              <w:rPr>
+                <w:sz w:val="24"/>
+                <w:szCs w:val="24"/>
+                <w:lang w:val="en-US"/>
+              </w:rPr>
+            </w:pPr>
+            <w:r>
+              <w:rPr>
+                <w:sz w:val="24"/>
+                <w:szCs w:val="24"/>
+                <w:lang w:val="en-US"/>
+              </w:rPr>
+              <w:t>[mb/d]</w:t>
+            </w:r>
+          </w:p>
+        </w:tc>
+        <w:tc>
+          <w:tcPr>
+            <w:tcW w:w="1529" w:type="dxa"/>
+          </w:tcPr>
+          <w:p>
+            <w:pPr>
+              <w:spacing w:after="0"/>
+              <w:rPr>
+                <w:b/>
+                <w:bCs/>
+                <w:sz w:val="24"/>
+                <w:szCs w:val="24"/>
+              </w:rPr>
+            </w:pPr>
+            <w:r>
+              <w:rPr>
+                <w:b/>
+                <w:bCs/>
+                <w:sz w:val="24"/>
+                <w:szCs w:val="24"/>
+              </w:rPr>
+              <w:t>Mine Price</w:t>
+            </w:r>
+          </w:p>
+          <w:p>
+            <w:pPr>
+              <w:spacing w:after="0"/>
+              <w:rPr>
+                <w:sz w:val="24"/>
+                <w:szCs w:val="24"/>
+              </w:rPr>
+            </w:pPr>
+            <w:r>
+              <w:rPr>
+                <w:sz w:val="24"/>
+                <w:szCs w:val="24"/>
+              </w:rPr>
+              <w:t>[</w:t>
+            </w:r>
+            <w:r>
+              <w:rPr>
+                <w:sz w:val="24"/>
+                <w:szCs w:val="24"/>
+              </w:rPr>
+              <w:t>USD/</w:t>
+            </w:r>
+            <w:proofErr w:type="spellStart"/>
+            <w:r>
+              <w:rPr>
+                <w:sz w:val="24"/>
+                <w:szCs w:val="24"/>
+              </w:rPr>
+              <w:t>bbl</w:t>
+            </w:r>
+            <w:proofErr w:type="spellEnd"/>
+            <w:r>
+              <w:rPr>
+                <w:sz w:val="24"/>
+                <w:szCs w:val="24"/>
+              </w:rPr>
+              <w:t>]</w:t>
+            </w:r>
+          </w:p>
+        </w:tc>
+        <w:tc>
+          <w:tcPr>
+            <w:tcW w:w="1670" w:type="dxa"/>
+          </w:tcPr>
+          <w:p>
+            <w:pPr>
+              <w:spacing w:after="0"/>
+              <w:rPr>
+                <w:b/>
+                <w:bCs/>
+                <w:sz w:val="24"/>
+                <w:szCs w:val="24"/>
+              </w:rPr>
+            </w:pPr>
+            <w:r>
+              <w:rPr>
+                <w:b/>
+                <w:bCs/>
+                <w:sz w:val="24"/>
+                <w:szCs w:val="24"/>
+              </w:rPr>
+              <w:t>Budget Price</w:t>
+            </w:r>
+          </w:p>
+          <w:p>
+            <w:pPr>
+              <w:spacing w:after="0"/>
+              <w:rPr>
+                <w:sz w:val="24"/>
+                <w:szCs w:val="24"/>
+              </w:rPr>
+            </w:pPr>
+            <w:r>
+              <w:rPr>
+                <w:sz w:val="24"/>
+                <w:szCs w:val="24"/>
+              </w:rPr>
+              <w:t>[USD/</w:t>
+            </w:r>
+            <w:proofErr w:type="spellStart"/>
+            <w:r>
+              <w:rPr>
+                <w:sz w:val="24"/>
+                <w:szCs w:val="24"/>
+              </w:rPr>
+              <w:t>bbl</w:t>
+            </w:r>
+            <w:proofErr w:type="spellEnd"/>
+            <w:r>
+              <w:rPr>
+                <w:sz w:val="24"/>
+                <w:szCs w:val="24"/>
+              </w:rPr>
+              <w:t>]</w:t>
+            </w:r>
+          </w:p>
+        </w:tc>
+        <w:tc>
+          <w:tcPr>
+            <w:tcW w:w="1630" w:type="dxa"/>
+          </w:tcPr>
+          <w:p>
+            <w:pPr>
+              <w:spacing w:after="0"/>
+              <w:rPr>
+                <w:b/>
+                <w:bCs/>
+                <w:sz w:val="24"/>
+                <w:szCs w:val="24"/>
+              </w:rPr>
+            </w:pPr>
+            <w:r>
+              <w:rPr>
+                <w:b/>
+                <w:bCs/>
+                <w:sz w:val="24"/>
+                <w:szCs w:val="24"/>
+              </w:rPr>
+              <w:t>Cutoff Price</w:t>
+            </w:r>
+          </w:p>
+          <w:p>
+            <w:pPr>
+              <w:spacing w:after="0"/>
+              <w:rPr>
+                <w:sz w:val="24"/>
+                <w:szCs w:val="24"/>
+              </w:rPr>
+            </w:pPr>
+            <w:r>
+              <w:rPr>
+                <w:sz w:val="24"/>
+                <w:szCs w:val="24"/>
+              </w:rPr>
+              <w:t>[USD/</w:t>
+            </w:r>
+            <w:proofErr w:type="spellStart"/>
+            <w:r>
+              <w:rPr>
+                <w:sz w:val="24"/>
+                <w:szCs w:val="24"/>
+              </w:rPr>
+              <w:t>bbl</w:t>
+            </w:r>
+            <w:proofErr w:type="spellEnd"/>
+            <w:r>
+              <w:rPr>
+                <w:sz w:val="24"/>
+                <w:szCs w:val="24"/>
+              </w:rPr>
+              <w:t>]</w:t>
+            </w:r>
+          </w:p>
+        </w:tc>
+        <w:tc>
+          <w:tcPr>
+            <w:tcW w:w="1985" w:type="dxa"/>
+          </w:tcPr>
+          <w:p>
+            <w:pPr>
+              <w:spacing w:after="0"/>
+              <w:rPr>
+                <w:b/>
+                <w:bCs/>
+                <w:sz w:val="24"/>
+                <w:szCs w:val="24"/>
+              </w:rPr>
+            </w:pPr>
+            <w:r>
+              <w:rPr>
+                <w:b/>
+                <w:bCs/>
+                <w:sz w:val="24"/>
+                <w:szCs w:val="24"/>
+              </w:rPr>
+              <w:t>Max Production</w:t>
+            </w:r>
+          </w:p>
+          <w:p>
+            <w:pPr>
+              <w:spacing w:after="0"/>
+              <w:rPr>
+                <w:sz w:val="24"/>
+                <w:szCs w:val="24"/>
+              </w:rPr>
+            </w:pPr>
+            <w:r>
+              <w:rPr>
+                <w:sz w:val="24"/>
+                <w:szCs w:val="24"/>
+                <w:lang w:val="en-US"/>
+              </w:rPr>
+              <w:t>[mb/d]</w:t>
+            </w:r>
+          </w:p>
+        </w:tc>
+      </w:tr>
+      <w:tr>
+        <w:tc>
+          <w:tcPr>
+            <w:tcW w:w="1533" w:type="dxa"/>
+            <w:vAlign w:val="center"/>
+          </w:tcPr>
+          <w:p>
+            <w:pPr>
+              <w:jc w:val="center"/>
+              <w:rPr>
+                <w:sz w:val="24"/>
+                <w:szCs w:val="24"/>
+              </w:rPr>
+            </w:pPr>
+            <w:r>
+              <w:rPr>
+                <w:sz w:val="24"/>
+                <w:szCs w:val="24"/>
+              </w:rPr>
+              <w:t>Saudi Arabia</w:t>
+            </w:r>
+          </w:p>
+        </w:tc>
+        <w:tc>
+          <w:tcPr>
+            <w:tcW w:w="1112" w:type="dxa"/>
+            <w:vAlign w:val="center"/>
+          </w:tcPr>
+          <w:p>
+            <w:pPr>
+              <w:jc w:val="center"/>
+              <w:rPr>
+                <w:sz w:val="24"/>
+                <w:szCs w:val="24"/>
+              </w:rPr>
+            </w:pPr>
+            <w:r>
+              <w:rPr>
+                <w:sz w:val="24"/>
+                <w:szCs w:val="24"/>
+              </w:rPr>
+              <w:t>9</w:t>
+            </w:r>
+          </w:p>
+        </w:tc>
+        <w:tc>
+          <w:tcPr>
+            <w:tcW w:w="1529" w:type="dxa"/>
+            <w:vAlign w:val="center"/>
+          </w:tcPr>
+          <w:p>
+            <w:pPr>
+              <w:jc w:val="center"/>
+              <w:rPr>
+                <w:sz w:val="24"/>
+                <w:szCs w:val="24"/>
+              </w:rPr>
+            </w:pPr>
+            <w:r>
+              <w:rPr>
+                <w:sz w:val="24"/>
+                <w:szCs w:val="24"/>
+              </w:rPr>
+              <w:t>5</w:t>
+            </w:r>
+          </w:p>
+        </w:tc>
+        <w:tc>
+          <w:tcPr>
+            <w:tcW w:w="1670" w:type="dxa"/>
+            <w:vAlign w:val="center"/>
+          </w:tcPr>
+          <w:p>
+            <w:pPr>
+              <w:jc w:val="center"/>
+              <w:rPr>
+                <w:sz w:val="24"/>
+                <w:szCs w:val="24"/>
+              </w:rPr>
+            </w:pPr>
+            <w:r>
+              <w:rPr>
+                <w:sz w:val="24"/>
+                <w:szCs w:val="24"/>
+              </w:rPr>
+              <w:t>82</w:t>
+            </w:r>
+          </w:p>
+        </w:tc>
+        <w:tc>
+          <w:tcPr>
+            <w:tcW w:w="1630" w:type="dxa"/>
+            <w:vAlign w:val="center"/>
+          </w:tcPr>
+          <w:p>
+            <w:pPr>
+              <w:jc w:val="center"/>
+              <w:rPr>
+                <w:sz w:val="24"/>
+                <w:szCs w:val="24"/>
+              </w:rPr>
+            </w:pPr>
+            <w:r>
+              <w:rPr>
+                <w:sz w:val="24"/>
+                <w:szCs w:val="24"/>
+              </w:rPr>
+              <w:t>68</w:t>
+            </w:r>
+          </w:p>
+        </w:tc>
+        <w:tc>
+          <w:tcPr>
+            <w:tcW w:w="1985" w:type="dxa"/>
+            <w:vAlign w:val="center"/>
+          </w:tcPr>
+          <w:p>
+            <w:pPr>
+              <w:jc w:val="center"/>
+              <w:rPr>
+                <w:sz w:val="24"/>
+                <w:szCs w:val="24"/>
+              </w:rPr>
+            </w:pPr>
+            <w:r>
+              <w:rPr>
+                <w:sz w:val="24"/>
+                <w:szCs w:val="24"/>
+              </w:rPr>
+              <w:t>12</w:t>
+            </w:r>
+          </w:p>
+        </w:tc>
+      </w:tr>
+      <w:tr>
+        <w:tc>
+          <w:tcPr>
+            <w:tcW w:w="1533" w:type="dxa"/>
+            <w:vAlign w:val="center"/>
+          </w:tcPr>
+          <w:p>
+            <w:pPr>
+              <w:rPr>
+                <w:sz w:val="24"/>
+                <w:szCs w:val="24"/>
+              </w:rPr>
+            </w:pPr>
+            <w:r>
+              <w:rPr>
+                <w:sz w:val="24"/>
+                <w:szCs w:val="24"/>
+              </w:rPr>
+              <w:t>Venezuela</w:t>
+            </w:r>
+          </w:p>
+        </w:tc>
+        <w:tc>
+          <w:tcPr>
+            <w:tcW w:w="1112" w:type="dxa"/>
+            <w:vAlign w:val="center"/>
+          </w:tcPr>
+          <w:p>
+            <w:pPr>
+              <w:jc w:val="center"/>
+              <w:rPr>
+                <w:sz w:val="24"/>
+                <w:szCs w:val="24"/>
+              </w:rPr>
+            </w:pPr>
+            <w:r>
+              <w:rPr>
+                <w:sz w:val="24"/>
+                <w:szCs w:val="24"/>
+              </w:rPr>
+              <w:t>1.8</w:t>
+            </w:r>
+          </w:p>
+        </w:tc>
+        <w:tc>
+          <w:tcPr>
+            <w:tcW w:w="1529" w:type="dxa"/>
+            <w:vAlign w:val="center"/>
+          </w:tcPr>
+          <w:p>
+            <w:pPr>
+              <w:jc w:val="center"/>
+              <w:rPr>
+                <w:sz w:val="24"/>
+                <w:szCs w:val="24"/>
+              </w:rPr>
+            </w:pPr>
+            <w:r>
+              <w:rPr>
+                <w:sz w:val="24"/>
+                <w:szCs w:val="24"/>
+              </w:rPr>
+              <w:t>35</w:t>
+            </w:r>
+          </w:p>
+        </w:tc>
+        <w:tc>
+          <w:tcPr>
+            <w:tcW w:w="1670" w:type="dxa"/>
+            <w:vAlign w:val="center"/>
+          </w:tcPr>
+          <w:p>
+            <w:pPr>
+              <w:jc w:val="center"/>
+              <w:rPr>
+                <w:sz w:val="24"/>
+                <w:szCs w:val="24"/>
+              </w:rPr>
+            </w:pPr>
+            <w:r>
+              <w:rPr>
+                <w:sz w:val="24"/>
+                <w:szCs w:val="24"/>
+              </w:rPr>
+              <w:t>120</w:t>
+            </w:r>
+          </w:p>
+        </w:tc>
+        <w:tc>
+          <w:tcPr>
+            <w:tcW w:w="1630" w:type="dxa"/>
+            <w:vAlign w:val="center"/>
+          </w:tcPr>
+          <w:p>
+            <w:pPr>
+              <w:jc w:val="center"/>
+              <w:rPr>
+                <w:sz w:val="24"/>
+                <w:szCs w:val="24"/>
+              </w:rPr>
+            </w:pPr>
+            <w:r>
+              <w:rPr>
+                <w:sz w:val="24"/>
+                <w:szCs w:val="24"/>
+              </w:rPr>
+              <w:t>100</w:t>
+            </w:r>
+          </w:p>
+        </w:tc>
+        <w:tc>
+          <w:tcPr>
+            <w:tcW w:w="1985" w:type="dxa"/>
+            <w:vAlign w:val="center"/>
+          </w:tcPr>
+          <w:p>
+            <w:pPr>
+              <w:jc w:val="center"/>
+              <w:rPr>
+                <w:sz w:val="24"/>
+                <w:szCs w:val="24"/>
+              </w:rPr>
+            </w:pPr>
+            <w:r>
+              <w:rPr>
+                <w:sz w:val="24"/>
+                <w:szCs w:val="24"/>
+              </w:rPr>
+              <w:t>2.2</w:t>
+            </w:r>
+          </w:p>
+        </w:tc>
+      </w:tr>
+      <w:tr>
+        <w:tc>
+          <w:tcPr>
+            <w:tcW w:w="1533" w:type="dxa"/>
+            <w:vAlign w:val="center"/>
+          </w:tcPr>
+          <w:p>
+            <w:pPr>
+              <w:rPr>
+                <w:sz w:val="24"/>
+                <w:szCs w:val="24"/>
+              </w:rPr>
+            </w:pPr>
+            <w:r>
+              <w:rPr>
+                <w:sz w:val="24"/>
+                <w:szCs w:val="24"/>
+              </w:rPr>
+              <w:t>UAE</w:t>
+            </w:r>
+          </w:p>
+        </w:tc>
+        <w:tc>
+          <w:tcPr>
+            <w:tcW w:w="1112" w:type="dxa"/>
+            <w:vAlign w:val="center"/>
+          </w:tcPr>
+          <w:p>
+            <w:pPr>
+              <w:jc w:val="center"/>
+              <w:rPr>
+                <w:sz w:val="24"/>
+                <w:szCs w:val="24"/>
+              </w:rPr>
+            </w:pPr>
+            <w:r>
+              <w:rPr>
+                <w:sz w:val="24"/>
+                <w:szCs w:val="24"/>
+              </w:rPr>
+              <w:t>4</w:t>
+            </w:r>
+          </w:p>
+        </w:tc>
+        <w:tc>
+          <w:tcPr>
+            <w:tcW w:w="1529" w:type="dxa"/>
+            <w:vAlign w:val="center"/>
+          </w:tcPr>
+          <w:p>
+            <w:pPr>
+              <w:jc w:val="center"/>
+              <w:rPr>
+                <w:sz w:val="24"/>
+                <w:szCs w:val="24"/>
+              </w:rPr>
+            </w:pPr>
+            <w:r>
+              <w:rPr>
+                <w:sz w:val="24"/>
+                <w:szCs w:val="24"/>
+              </w:rPr>
+              <w:t>12</w:t>
+            </w:r>
+          </w:p>
+        </w:tc>
+        <w:tc>
+          <w:tcPr>
+            <w:tcW w:w="1670" w:type="dxa"/>
+            <w:vAlign w:val="center"/>
+          </w:tcPr>
+          <w:p>
+            <w:pPr>
+              <w:jc w:val="center"/>
+              <w:rPr>
+                <w:sz w:val="24"/>
+                <w:szCs w:val="24"/>
+              </w:rPr>
+            </w:pPr>
+            <w:r>
+              <w:rPr>
+                <w:sz w:val="24"/>
+                <w:szCs w:val="24"/>
+              </w:rPr>
+              <w:t>65</w:t>
+            </w:r>
+          </w:p>
+        </w:tc>
+        <w:tc>
+          <w:tcPr>
+            <w:tcW w:w="1630" w:type="dxa"/>
+            <w:vAlign w:val="center"/>
+          </w:tcPr>
+          <w:p>
+            <w:pPr>
+              <w:jc w:val="center"/>
+              <w:rPr>
+                <w:sz w:val="24"/>
+                <w:szCs w:val="24"/>
+              </w:rPr>
+            </w:pPr>
+            <w:r>
+              <w:rPr>
+                <w:sz w:val="24"/>
+                <w:szCs w:val="24"/>
+              </w:rPr>
+              <w:t>62</w:t>
+            </w:r>
+          </w:p>
+        </w:tc>
+        <w:tc>
+          <w:tcPr>
+            <w:tcW w:w="1985" w:type="dxa"/>
+            <w:vAlign w:val="center"/>
+          </w:tcPr>
+          <w:p>
+            <w:pPr>
+              <w:jc w:val="center"/>
+              <w:rPr>
+                <w:sz w:val="24"/>
+                <w:szCs w:val="24"/>
+              </w:rPr>
+            </w:pPr>
+            <w:r>
+              <w:rPr>
+                <w:sz w:val="24"/>
+                <w:szCs w:val="24"/>
+              </w:rPr>
+              <w:t>4.5</w:t>
+            </w:r>
+          </w:p>
+        </w:tc>
+      </w:tr>
+      <w:tr>
+        <w:tc>
+          <w:tcPr>
+            <w:tcW w:w="1533" w:type="dxa"/>
+            <w:vAlign w:val="center"/>
+          </w:tcPr>
+          <w:p>
+            <w:pPr>
+              <w:rPr>
+                <w:sz w:val="24"/>
+                <w:szCs w:val="24"/>
+              </w:rPr>
+            </w:pPr>
+            <w:r>
+              <w:rPr>
+                <w:sz w:val="24"/>
+                <w:szCs w:val="24"/>
+              </w:rPr>
+              <w:t>Nigeria</w:t>
+            </w:r>
+          </w:p>
+        </w:tc>
+        <w:tc>
+          <w:tcPr>
+            <w:tcW w:w="1112" w:type="dxa"/>
+            <w:vAlign w:val="center"/>
+          </w:tcPr>
+          <w:p>
+            <w:pPr>
+              <w:jc w:val="center"/>
+              <w:rPr>
+                <w:sz w:val="24"/>
+                <w:szCs w:val="24"/>
+              </w:rPr>
+            </w:pPr>
+            <w:r>
+              <w:rPr>
+                <w:sz w:val="24"/>
+                <w:szCs w:val="24"/>
+              </w:rPr>
+              <w:t>1.5</w:t>
+            </w:r>
+          </w:p>
+        </w:tc>
+        <w:tc>
+          <w:tcPr>
+            <w:tcW w:w="1529" w:type="dxa"/>
+            <w:vAlign w:val="center"/>
+          </w:tcPr>
+          <w:p>
+            <w:pPr>
+              <w:jc w:val="center"/>
+              <w:rPr>
+                <w:sz w:val="24"/>
+                <w:szCs w:val="24"/>
+              </w:rPr>
+            </w:pPr>
+            <w:r>
+              <w:rPr>
+                <w:sz w:val="24"/>
+                <w:szCs w:val="24"/>
+              </w:rPr>
+              <w:t>30</w:t>
+            </w:r>
+          </w:p>
+        </w:tc>
+        <w:tc>
+          <w:tcPr>
+            <w:tcW w:w="1670" w:type="dxa"/>
+            <w:vAlign w:val="center"/>
+          </w:tcPr>
+          <w:p>
+            <w:pPr>
+              <w:jc w:val="center"/>
+              <w:rPr>
+                <w:sz w:val="24"/>
+                <w:szCs w:val="24"/>
+              </w:rPr>
+            </w:pPr>
+            <w:r>
+              <w:rPr>
+                <w:sz w:val="24"/>
+                <w:szCs w:val="24"/>
+              </w:rPr>
+              <w:t>60</w:t>
+            </w:r>
+          </w:p>
+        </w:tc>
+        <w:tc>
+          <w:tcPr>
+            <w:tcW w:w="1630" w:type="dxa"/>
+            <w:vAlign w:val="center"/>
+          </w:tcPr>
+          <w:p>
+            <w:pPr>
+              <w:jc w:val="center"/>
+              <w:rPr>
+                <w:sz w:val="24"/>
+                <w:szCs w:val="24"/>
+              </w:rPr>
+            </w:pPr>
+            <w:r>
+              <w:rPr>
+                <w:sz w:val="24"/>
+                <w:szCs w:val="24"/>
+              </w:rPr>
+              <w:t>50</w:t>
+            </w:r>
+          </w:p>
+        </w:tc>
+        <w:tc>
+          <w:tcPr>
+            <w:tcW w:w="1985" w:type="dxa"/>
+            <w:vAlign w:val="center"/>
+          </w:tcPr>
+          <w:p>
+            <w:pPr>
+              <w:jc w:val="center"/>
+              <w:rPr>
+                <w:sz w:val="24"/>
+                <w:szCs w:val="24"/>
+              </w:rPr>
+            </w:pPr>
+            <w:r>
+              <w:rPr>
+                <w:sz w:val="24"/>
+                <w:szCs w:val="24"/>
+              </w:rPr>
+              <w:t>2</w:t>
+            </w:r>
+          </w:p>
+        </w:tc>
+      </w:tr>
+    </w:tbl>
+    <w:p>
+      <w:pPr>
+        <w:rPr>
+          <w:sz w:val="24"/>
+          <w:szCs w:val="24"/>
+        </w:rPr>
+      </w:pPr>
+      <w:r>
+        <w:rPr>
+          <w:noProof/>
+          <w:sz w:val="24"/>
+          <w:szCs w:val="24"/>
+        </w:rPr>
+        <mc:AlternateContent>
+          <mc:Choice Requires="wps">
+            <w:drawing>
+              <wp:anchor distT="45720" distB="45720" distL="114300" distR="114300" simplePos="0" relativeHeight="251659264" behindDoc="0" locked="0" layoutInCell="1" allowOverlap="1" wp14:anchorId="71EE1DB5" wp14:editId="0F1472F5">
+                <wp:simplePos x="0" y="0"/>
+                <wp:positionH relativeFrom="margin">
+                  <wp:posOffset>504288</wp:posOffset>
+                </wp:positionH>
+                <wp:positionV relativeFrom="paragraph">
+                  <wp:posOffset>52070</wp:posOffset>
+                </wp:positionV>
+                <wp:extent cx="4923155" cy="513080"/>
+                <wp:effectExtent l="0" t="0" r="10795" b="20320"/>
+                <wp:wrapSquare wrapText="bothSides"/>
+                <wp:docPr id="217" name="Text Box 2"/>
+                <wp:cNvGraphicFramePr>
+                  <a:graphicFrameLocks xmlns:a="http://schemas.openxmlformats.org/drawingml/2006/main"/>
+                </wp:cNvGraphicFramePr>
+                <a:graphic xmlns:a="http://schemas.openxmlformats.org/drawingml/2006/main">
+                  <a:graphicData uri="http://schemas.microsoft.com/office/word/2010/wordprocessingShape">
+                    <wps:wsp>
+                      <wps:cNvSpPr txBox="1">
+                        <a:spLocks noChangeArrowheads="1"/>
+                      </wps:cNvSpPr>
+                      <wps:spPr bwMode="auto">
+                        <a:xfrm>
+                          <a:off x="0" y="0"/>
+                          <a:ext cx="4923155" cy="513080"/>
+                        </a:xfrm>
+                        <a:prstGeom prst="rect">
+                          <a:avLst/>
+                        </a:prstGeom>
+                        <a:solidFill>
+                          <a:srgbClr val="FFFFFF"/>
+                        </a:solidFill>
+                        <a:ln w="9525">
+                          <a:solidFill>
+                            <a:schemeClr val="bg1"/>
+                          </a:solidFill>
+                          <a:miter lim="800000"/>
+                          <a:headEnd/>
+                          <a:tailEnd/>
+                        </a:ln>
+                      </wps:spPr>
+                      <wps:txbx>
+                        <w:txbxContent>
+                          <w:p>
+                            <w:pPr>
+                              <w:spacing w:after="0"/>
+                              <w:jc w:val="center"/>
+                              <w:rPr>
+                                <w:lang w:val="en-US"/>
+                              </w:rPr>
+                            </w:pPr>
+                            <w:r>
+                              <w:rPr>
+                                <w:lang w:val="en-US"/>
+                              </w:rPr>
+                              <w:t>Table 1: Attributes of all players</w:t>
+                            </w:r>
+                          </w:p>
+                          <w:p>
+                            <w:pPr>
+                              <w:spacing w:after="0"/>
+                              <w:jc w:val="center"/>
+                              <w:rPr>
+                                <w:lang w:val="en-US"/>
+                              </w:rPr>
+                            </w:pPr>
+                            <w:r>
+                              <w:rPr>
+                                <w:lang w:val="en-US"/>
+                              </w:rPr>
+                              <w:t>Note: mb/d…Million barrels per day; USD/</w:t>
+                            </w:r>
+                            <w:proofErr w:type="spellStart"/>
+                            <w:r>
+                              <w:rPr>
+                                <w:lang w:val="en-US"/>
+                              </w:rPr>
+                              <w:t>bbl</w:t>
+                            </w:r>
+                            <w:proofErr w:type="spellEnd"/>
+                            <w:r>
+                              <w:rPr>
+                                <w:lang w:val="en-US"/>
+                              </w:rPr>
+                              <w:t>…US Dollars per Barrel</w:t>
+                            </w:r>
+                          </w:p>
+                          <w:p>
+                            <w:pPr>
+                              <w:rPr>
+                                <w:lang w:val="en-US"/>
+                              </w:rPr>
+                            </w:pPr>
+                          </w:p>
+                          <w:p>
+                            <w:pPr>
+                              <w:rPr>
+                                <w:lang w:val="en-US"/>
+                              </w:rPr>
+                            </w:pPr>
+                          </w:p>
+                        </w:txbxContent>
+                      </wps:txbx>
+                      <wps:bodyPr rot="0" vert="horz" wrap="square" lIns="91440" tIns="45720" rIns="91440" bIns="45720" anchor="t" anchorCtr="0">
+                        <a:noAutofit/>
+                      </wps:bodyPr>
+                    </wps:wsp>
+                  </a:graphicData>
+                </a:graphic>
+                <wp14:sizeRelH relativeFrom="margin">
+                  <wp14:pctWidth>0</wp14:pctWidth>
+                </wp14:sizeRelH>
+                <wp14:sizeRelV relativeFrom="margin">
+                  <wp14:pctHeight>0</wp14:pctHeight>
+                </wp14:sizeRelV>
+              </wp:anchor>
+            </w:drawing>
+          </mc:Choice>
+          <mc:Fallback>
+            <w:pict>
+              <v:shapetype w14:anchorId="71EE1DB5" id="_x0000_t202" coordsize="21600,21600" o:spt="202" path="m,l,21600r21600,l21600,xe">
+                <v:stroke joinstyle="miter"/>
+                <v:path gradientshapeok="t" o:connecttype="rect"/>
+              </v:shapetype>
+              <v:shape id="Text Box 2" o:spid="_x0000_s1026" type="#_x0000_t202" style="position:absolute;margin-left:39.7pt;margin-top:4.1pt;width:387.65pt;height:40.4pt;z-index:251659264;visibility:visible;mso-wrap-style:square;mso-width-percent:0;mso-height-percent:0;mso-wrap-distance-left:9pt;mso-wrap-distance-top:3.6pt;mso-wrap-distance-right:9pt;mso-wrap-distance-bottom:3.6pt;mso-position-horizontal:absolute;mso-position-horizontal-relative:margin;mso-position-vertical:absolute;mso-position-vertical-relative:text;mso-width-percent:0;mso-height-percent:0;mso-width-relative:margin;mso-height-relative:margin;v-text-anchor:top" o:gfxdata="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" strokecolor="white [3212]">
+                <v:textbox>
+                  <w:txbxContent>
+                    <w:p>
+                      <w:pPr>
+                        <w:spacing w:after="0"/>
+                        <w:jc w:val="center"/>
+                        <w:rPr>
+                          <w:lang w:val="en-US"/>
+                        </w:rPr>
+                      </w:pPr>
+                      <w:r>
+                        <w:rPr>
+                          <w:lang w:val="en-US"/>
+                        </w:rPr>
+                        <w:t>Table 1: Attributes of all players</w:t>
+                      </w:r>
+                    </w:p>
+                    <w:p>
+                      <w:pPr>
+                        <w:spacing w:after="0"/>
+                        <w:jc w:val="center"/>
+                        <w:rPr>
+                          <w:lang w:val="en-US"/>
+                        </w:rPr>
+                      </w:pPr>
+                      <w:r>
+                        <w:rPr>
+                          <w:lang w:val="en-US"/>
+                        </w:rPr>
+                        <w:t>Note: mb/d…Million barrels per day; USD/</w:t>
+                      </w:r>
+                      <w:proofErr w:type="spellStart"/>
+                      <w:r>
+                        <w:rPr>
+                          <w:lang w:val="en-US"/>
+                        </w:rPr>
+                        <w:t>bbl</w:t>
+                      </w:r>
+                      <w:proofErr w:type="spellEnd"/>
+                      <w:r>
+                        <w:rPr>
+                          <w:lang w:val="en-US"/>
+                        </w:rPr>
+                        <w:t>…US Dollars per Barrel</w:t>
+                      </w:r>
+                    </w:p>
+                    <w:p>
+                      <w:pPr>
+                        <w:rPr>
+                          <w:lang w:val="en-US"/>
+                        </w:rPr>
+                      </w:pPr>
+                    </w:p>
+                    <w:p>
+                      <w:pPr>
+                        <w:rPr>
+                          <w:lang w:val="en-US"/>
+                        </w:rPr>
+                      </w:pPr>
+                    </w:p>
+                  </w:txbxContent>
+                </v:textbox>
+                <w10:wrap type="square" anchorx="margin"/>
+              </v:shape>
+            </w:pict>
+          </mc:Fallback>
+        </mc:AlternateContent>
+      </w:r>
+    </w:p>
+    <w:p>
+      <w:pPr>
+        <w:rPr>
+          <w:sz w:val="24"/>
+          <w:szCs w:val="24"/>
+        </w:rPr>
+      </w:pPr>
+    </w:p>
+    <w:p>
+      <w:pPr>
+        <w:rPr>
+          <w:sz w:val="24"/>
+          <w:szCs w:val="24"/>
+        </w:rPr>
+      </w:pPr>
+      <w:r>
+        <w:rPr>
+          <w:sz w:val="24"/>
+          <w:szCs w:val="24"/>
+        </w:rPr>
+        <w:t xml:space="preserve">Quota refers to a </w:t>
+      </w:r>
+      <w:r>
+        <w:rPr>
+          <w:sz w:val="24"/>
+          <w:szCs w:val="24"/>
+        </w:rPr>
+        <w:t>production allocation assigned to the state</w:t>
+      </w:r>
+      <w:r>
+        <w:rPr>
+          <w:sz w:val="24"/>
+          <w:szCs w:val="24"/>
+        </w:rPr>
+        <w:t xml:space="preserve"> by OPEC, while Max Production is the maximum production capacity of </w:t>
+      </w:r>
+      <w:r>
+        <w:rPr>
+          <w:sz w:val="24"/>
+          <w:szCs w:val="24"/>
+        </w:rPr>
+        <w:t>state's oil infrastructure</w:t>
+      </w:r>
+      <w:r>
+        <w:rPr>
+          <w:sz w:val="24"/>
+          <w:szCs w:val="24"/>
+        </w:rPr>
+        <w:t xml:space="preserve">. </w:t>
+      </w:r>
+      <w:r>
+        <w:rPr>
+          <w:sz w:val="24"/>
+          <w:szCs w:val="24"/>
+        </w:rPr>
+        <w:t>Budget price</w:t>
+      </w:r>
+      <w:r>
+        <w:rPr>
+          <w:sz w:val="24"/>
+          <w:szCs w:val="24"/>
+        </w:rPr>
+        <w:t xml:space="preserve"> defines the price level </w:t>
+      </w:r>
+      <w:r>
+        <w:rPr>
+          <w:sz w:val="24"/>
+          <w:szCs w:val="24"/>
+        </w:rPr>
+        <w:t>necessary for the state to maintain national expenditures</w:t>
+      </w:r>
+      <w:r>
+        <w:rPr>
+          <w:sz w:val="24"/>
+          <w:szCs w:val="24"/>
+        </w:rPr>
+        <w:t xml:space="preserve">. Cutoff price represents the market price at which </w:t>
+      </w:r>
+      <w:r>
+        <w:rPr>
+          <w:sz w:val="24"/>
+          <w:szCs w:val="24"/>
+        </w:rPr>
+        <w:t>the state shifts from a passive strategy to an active market intervention</w:t>
+      </w:r>
+      <w:r>
+        <w:rPr>
+          <w:sz w:val="24"/>
+          <w:szCs w:val="24"/>
+        </w:rPr>
+        <w:t>.</w:t>
+      </w:r>
+    </w:p>
+    <w:p>
+      <w:pPr>
+        <w:rPr>
+          <w:sz w:val="24"/>
+          <w:szCs w:val="24"/>
+          <w:lang w:val="en-US"/>
+        </w:rPr>
+      </w:pPr>
+    </w:p>
+    <w:p>
+      <w:pPr>
+        <w:rPr>
+          <w:b/>
+          <w:bCs/>
+          <w:sz w:val="28"/>
+          <w:szCs w:val="28"/>
+          <w:lang w:val="en-US"/>
+        </w:rPr>
+      </w:pPr>
+      <w:r>
+        <w:rPr>
+          <w:b/>
+          <w:bCs/>
+          <w:sz w:val="28"/>
+          <w:szCs w:val="28"/>
+          <w:lang w:val="en-US"/>
+        </w:rPr>
+        <w:t>The effectivity of OPEC Quotas</w:t>
+      </w:r>
+    </w:p>
+    <w:p>
+      <w:pPr>
+        <w:rPr>
+          <w:sz w:val="24"/>
+          <w:szCs w:val="24"/>
+        </w:rPr>
+      </w:pPr>
+      <w:r>
+        <w:rPr>
+          <w:sz w:val="24"/>
+          <w:szCs w:val="24"/>
+        </w:rPr>
+        <w:t>We examined the effectiveness of OPEC-enforced quotas to determine whether they enable member states to increase their aggregate revenue. To do so, we evaluated two distinct strategic scenarios</w:t>
+      </w:r>
+      <w:r>
+        <w:rPr>
+          <w:sz w:val="24"/>
+          <w:szCs w:val="24"/>
+        </w:rPr>
+        <w:t xml:space="preserve">. First strategy </w:t>
+      </w:r>
+      <w:r>
+        <w:rPr>
+          <w:sz w:val="24"/>
+          <w:szCs w:val="24"/>
+        </w:rPr>
+        <w:t xml:space="preserve">assumes </w:t>
+      </w:r>
+      <w:r>
+        <w:rPr>
+          <w:sz w:val="24"/>
+          <w:szCs w:val="24"/>
+        </w:rPr>
+        <w:t>that each state decides to produce exactly the amount of barrels per day</w:t>
+      </w:r>
+      <w:r>
+        <w:rPr>
+          <w:sz w:val="24"/>
+          <w:szCs w:val="24"/>
+        </w:rPr>
+        <w:t xml:space="preserve"> as they are assigned by OPEC quota. Each state then produces a lower volume than its maximum production capacity would otherwise allow. Resulting revenues after 50 rounds of game are in Table 2.</w:t>
+      </w:r>
+    </w:p>
+    <w:p>
+      <w:pPr>
+        <w:rPr>
+          <w:b/>
+          <w:bCs/>
+          <w:sz w:val="28"/>
+          <w:szCs w:val="28"/>
+          <w:lang w:val="cs-CZ"/>
+        </w:rPr>
+      </w:pPr>
+      <w:r>
+        <w:rPr>
+          <w:sz w:val="24"/>
+          <w:szCs w:val="24"/>
+        </w:rPr>
+        <mc:AlternateContent>
+          <mc:Choice Requires="wps">
+            <w:drawing>
+              <wp:anchor distT="45720" distB="45720" distL="114300" distR="114300" simplePos="0" relativeHeight="251661312" behindDoc="0" locked="0" layoutInCell="1" allowOverlap="1" wp14:anchorId="7E77704B" wp14:editId="1EB41EB0">
+                <wp:simplePos x="0" y="0"/>
+                <wp:positionH relativeFrom="margin">
+                  <wp:align>center</wp:align>
+                </wp:positionH>
+                <wp:positionV relativeFrom="paragraph">
+                  <wp:posOffset>1157556</wp:posOffset>
+                </wp:positionV>
+                <wp:extent cx="5711190" cy="316230"/>
+                <wp:effectExtent l="0" t="0" r="22860" b="26670"/>
+                <wp:wrapSquare wrapText="bothSides"/>
+                <wp:docPr id="829296581" name="Text Box 2"/>
+                <wp:cNvGraphicFramePr>
+                  <a:graphicFrameLocks xmlns:a="http://schemas.openxmlformats.org/drawingml/2006/main"/>
+                </wp:cNvGraphicFramePr>
+                <a:graphic xmlns:a="http://schemas.openxmlformats.org/drawingml/2006/main">
+                  <a:graphicData uri="http://schemas.microsoft.com/office/word/2010/wordprocessingShape">
+                    <wps:wsp>
+                      <wps:cNvSpPr txBox="1">
+                        <a:spLocks noChangeArrowheads="1"/>
+                      </wps:cNvSpPr>
+                      <wps:spPr bwMode="auto">
+                        <a:xfrm>
+                          <a:off x="0" y="0"/>
+                          <a:ext cx="5711190" cy="316230"/>
+                        </a:xfrm>
+                        <a:prstGeom prst="rect">
+                          <a:avLst/>
+                        </a:prstGeom>
+                        <a:solidFill>
+                          <a:srgbClr val="FFFFFF"/>
+                        </a:solidFill>
+                        <a:ln w="9525">
+                          <a:solidFill>
+                            <a:schemeClr val="bg1"/>
+                          </a:solidFill>
+                          <a:miter lim="800000"/>
+                          <a:headEnd/>
+                          <a:tailEnd/>
+                        </a:ln>
+                      </wps:spPr>
+                      <wps:txbx>
+                        <w:txbxContent>
+                          <w:p>
+                            <w:pPr>
+                              <w:rPr>
+                                <w:lang w:val="en-US"/>
+                              </w:rPr>
+                            </w:pPr>
+                            <w:r>
+                              <w:rPr>
+                                <w:lang w:val="en-US"/>
+                              </w:rPr>
+                              <w:t>Table 2: Revenues of each state and total revenue if all states comply to OPEC quotas</w:t>
+                            </w:r>
+                          </w:p>
+                        </w:txbxContent>
+                      </wps:txbx>
+                      <wps:bodyPr rot="0" vert="horz" wrap="square" lIns="91440" tIns="45720" rIns="91440" bIns="45720" anchor="t" anchorCtr="0">
+                        <a:noAutofit/>
+                      </wps:bodyPr>
+                    </wps:wsp>
+                  </a:graphicData>
+                </a:graphic>
+                <wp14:sizeRelH relativeFrom="margin">
+                  <wp14:pctWidth>0</wp14:pctWidth>
+                </wp14:sizeRelH>
+                <wp14:sizeRelV relativeFrom="margin">
+                  <wp14:pctHeight>0</wp14:pctHeight>
+                </wp14:sizeRelV>
+              </wp:anchor>
+            </w:drawing>
+          </mc:Choice>
+          <mc:Fallback>
+            <w:pict>
+              <v:shape w14:anchorId="7E77704B" id="_x0000_s1027" type="#_x0000_t202" style="position:absolute;margin-left:0;margin-top:91.15pt;width:449.7pt;height:24.9pt;z-index:251661312;visibility:visible;mso-wrap-style:square;mso-width-percent:0;mso-height-percent:0;mso-wrap-distance-left:9pt;mso-wrap-distance-top:3.6pt;mso-wrap-distance-right:9pt;mso-wrap-distance-bottom:3.6pt;mso-position-horizontal:center;mso-position-horizontal-relative:margin;mso-position-vertical:absolute;mso-position-vertical-relative:text;mso-width-percent:0;mso-height-percent:0;mso-width-relative:margin;mso-height-relative:margin;v-text-anchor:top" o:gfxdata="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" strokecolor="white [3212]">
+                <v:textbox>
+                  <w:txbxContent>
+                    <w:p>
+                      <w:pPr>
+                        <w:rPr>
+                          <w:lang w:val="en-US"/>
+                        </w:rPr>
+                      </w:pPr>
+                      <w:r>
+                        <w:rPr>
+                          <w:lang w:val="en-US"/>
+                        </w:rPr>
+                        <w:t>Table 2: Revenues of each state and total revenue if all states comply to OPEC quotas</w:t>
+                      </w:r>
+                    </w:p>
+                  </w:txbxContent>
+                </v:textbox>
+                <w10:wrap type="square" anchorx="margin"/>
+              </v:shape>
+            </w:pict>
+          </mc:Fallback>
+        </mc:AlternateContent>
+      </w:r>
+      <w:r>
+        <w:rPr>
+          <w:sz w:val="24"/>
+          <w:szCs w:val="24"/>
+        </w:rPr>
+        <w:t>The second strategy simulates a market scenario without an operative OPEC, where states produce at their maximum capacity to maximize revenue in each round. The corresponding revenues for this scenario are presented in Table 3.</w:t>
       </w:r>
     </w:p>
     <w:tbl>
@@ -1257,38 +2606,153 @@
           <w:lang w:val="en-US"/>
         </w:rPr>
       </w:pPr>
-    </w:p>
-    <w:p>
-      <w:pPr>
-        <w:rPr>
-          <w:b/>
-          <w:bCs/>
-          <w:sz w:val="28"/>
-          <w:szCs w:val="28"/>
-          <w:lang w:val="en-US"/>
-        </w:rPr>
-      </w:pPr>
-      <w:r>
-        <w:rPr>
-          <w:b/>
-          <w:bCs/>
-          <w:sz w:val="28"/>
-          <w:szCs w:val="28"/>
-          <w:lang w:val="en-US"/>
-        </w:rPr>
-        <w:t>ignore quotas</w:t>
-      </w:r>
-    </w:p>
-    <w:p>
-      <w:pPr>
-        <w:rPr>
-          <w:b/>
-          <w:bCs/>
-          <w:sz w:val="28"/>
-          <w:szCs w:val="28"/>
-          <w:lang w:val="en-US"/>
-        </w:rPr>
-      </w:pPr>
+      <w:r>
+        <w:rPr>
+          <w:b/>
+          <w:bCs/>
+          <w:noProof/>
+          <w:sz w:val="28"/>
+          <w:szCs w:val="28"/>
+          <w:lang w:val="en-US"/>
+        </w:rPr>
+        <mc:AlternateContent>
+          <mc:Choice Requires="wps">
+            <w:drawing>
+              <wp:anchor distT="45720" distB="45720" distL="114300" distR="114300" simplePos="0" relativeHeight="251663360" behindDoc="0" locked="0" layoutInCell="1" allowOverlap="1" wp14:anchorId="03FF562D" wp14:editId="7EBD9BFE">
+                <wp:simplePos x="0" y="0"/>
+                <wp:positionH relativeFrom="margin">
+                  <wp:align>right</wp:align>
+                </wp:positionH>
+                <wp:positionV relativeFrom="paragraph">
+                  <wp:posOffset>1307367</wp:posOffset>
+                </wp:positionV>
+                <wp:extent cx="5711190" cy="576580"/>
+                <wp:effectExtent l="0" t="0" r="22860" b="13970"/>
+                <wp:wrapSquare wrapText="bothSides"/>
+                <wp:docPr id="974562108" name="Text Box 2"/>
+                <wp:cNvGraphicFramePr>
+                  <a:graphicFrameLocks xmlns:a="http://schemas.openxmlformats.org/drawingml/2006/main"/>
+                </wp:cNvGraphicFramePr>
+                <a:graphic xmlns:a="http://schemas.openxmlformats.org/drawingml/2006/main">
+                  <a:graphicData uri="http://schemas.microsoft.com/office/word/2010/wordprocessingShape">
+                    <wps:wsp>
+                      <wps:cNvSpPr txBox="1">
+                        <a:spLocks noChangeArrowheads="1"/>
+                      </wps:cNvSpPr>
+                      <wps:spPr bwMode="auto">
+                        <a:xfrm>
+                          <a:off x="0" y="0"/>
+                          <a:ext cx="5711190" cy="576775"/>
+                        </a:xfrm>
+                        <a:prstGeom prst="rect">
+                          <a:avLst/>
+                        </a:prstGeom>
+                        <a:solidFill>
+                          <a:srgbClr val="FFFFFF"/>
+                        </a:solidFill>
+                        <a:ln w="9525">
+                          <a:solidFill>
+                            <a:schemeClr val="bg1"/>
+                          </a:solidFill>
+                          <a:miter lim="800000"/>
+                          <a:headEnd/>
+                          <a:tailEnd/>
+                        </a:ln>
+                      </wps:spPr>
+                      <wps:txbx>
+                        <w:txbxContent>
+                          <w:p>
+                            <w:pPr>
+                              <w:rPr>
+                                <w:lang w:val="en-US"/>
+                              </w:rPr>
+                            </w:pPr>
+                            <w:r>
+                              <w:rPr>
+                                <w:lang w:val="en-US"/>
+                              </w:rPr>
+                              <w:t xml:space="preserve">Table </w:t>
+                            </w:r>
+                            <w:r>
+                              <w:rPr>
+                                <w:lang w:val="en-US"/>
+                              </w:rPr>
+                              <w:t>3</w:t>
+                            </w:r>
+                            <w:r>
+                              <w:rPr>
+                                <w:lang w:val="en-US"/>
+                              </w:rPr>
+                              <w:t xml:space="preserve">: Revenues of each state and total revenue if all states </w:t>
+                            </w:r>
+                            <w:r>
+                              <w:rPr>
+                                <w:lang w:val="en-US"/>
+                              </w:rPr>
+                              <w:t>produce at their maximum capacity</w:t>
+                            </w:r>
+                          </w:p>
+                        </w:txbxContent>
+                      </wps:txbx>
+                      <wps:bodyPr rot="0" vert="horz" wrap="square" lIns="91440" tIns="45720" rIns="91440" bIns="45720" anchor="t" anchorCtr="0">
+                        <a:noAutofit/>
+                      </wps:bodyPr>
+                    </wps:wsp>
+                  </a:graphicData>
+                </a:graphic>
+                <wp14:sizeRelH relativeFrom="margin">
+                  <wp14:pctWidth>0</wp14:pctWidth>
+                </wp14:sizeRelH>
+                <wp14:sizeRelV relativeFrom="margin">
+                  <wp14:pctHeight>0</wp14:pctHeight>
+                </wp14:sizeRelV>
+              </wp:anchor>
+            </w:drawing>
+          </mc:Choice>
+          <mc:Fallback>
+            <w:pict>
+              <v:shape w14:anchorId="03FF562D" id="_x0000_s1028" type="#_x0000_t202" style="position:absolute;margin-left:398.5pt;margin-top:102.95pt;width:449.7pt;height:45.4pt;z-index:251663360;visibility:visible;mso-wrap-style:square;mso-width-percent:0;mso-height-percent:0;mso-wrap-distance-left:9pt;mso-wrap-distance-top:3.6pt;mso-wrap-distance-right:9pt;mso-wrap-distance-bottom:3.6pt;mso-position-horizontal:right;mso-position-horizontal-relative:margin;mso-position-vertical:absolute;mso-position-vertical-relative:text;mso-width-percent:0;mso-height-percent:0;mso-width-relative:margin;mso-height-relative:margin;v-text-anchor:top" o:gfxdata="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" strokecolor="white [3212]">
+                <v:textbox>
+                  <w:txbxContent>
+                    <w:p>
+                      <w:pPr>
+                        <w:rPr>
+                          <w:lang w:val="en-US"/>
+                        </w:rPr>
+                      </w:pPr>
+                      <w:r>
+                        <w:rPr>
+                          <w:lang w:val="en-US"/>
+                        </w:rPr>
+                        <w:t xml:space="preserve">Table </w:t>
+                      </w:r>
+                      <w:r>
+                        <w:rPr>
+                          <w:lang w:val="en-US"/>
+                        </w:rPr>
+                        <w:t>3</w:t>
+                      </w:r>
+                      <w:r>
+                        <w:rPr>
+                          <w:lang w:val="en-US"/>
+                        </w:rPr>
+                        <w:t xml:space="preserve">: Revenues of each state and total revenue if all states </w:t>
+                      </w:r>
+                      <w:r>
+                        <w:rPr>
+                          <w:lang w:val="en-US"/>
+                        </w:rPr>
+                        <w:t>produce at their maximum capacity</w:t>
+                      </w:r>
+                    </w:p>
+                  </w:txbxContent>
+                </v:textbox>
+                <w10:wrap type="square" anchorx="margin"/>
+              </v:shape>
+            </w:pict>
+          </mc:Fallback>
+        </mc:AlternateContent>
+      </w:r>
     </w:p>
     <w:tbl>
       <w:tblPr>
@@ -1447,6 +2911,15 @@
                 <w:szCs w:val="24"/>
                 <w:lang w:val="en-US"/>
               </w:rPr>
+              <w:t>$</w:t>
+            </w:r>
+            <w:r>
+              <w:rPr>
+                <w:rFonts w:eastAsia="Aptos"/>
+                <w:sz w:val="24"/>
+                <w:szCs w:val="24"/>
+                <w:lang w:val="en-US"/>
+              </w:rPr>
               <w:t>19 439</w:t>
             </w:r>
           </w:p>
@@ -1471,6 +2944,15 @@
                 <w:szCs w:val="24"/>
                 <w:lang w:val="en-US"/>
               </w:rPr>
+              <w:t>$</w:t>
+            </w:r>
+            <w:r>
+              <w:rPr>
+                <w:rFonts w:eastAsia="Aptos"/>
+                <w:sz w:val="24"/>
+                <w:szCs w:val="24"/>
+                <w:lang w:val="en-US"/>
+              </w:rPr>
               <w:t>264</w:t>
             </w:r>
           </w:p>
@@ -1495,6 +2977,15 @@
                 <w:szCs w:val="24"/>
                 <w:lang w:val="en-US"/>
               </w:rPr>
+              <w:t>$</w:t>
+            </w:r>
+            <w:r>
+              <w:rPr>
+                <w:rFonts w:eastAsia="Aptos"/>
+                <w:sz w:val="24"/>
+                <w:szCs w:val="24"/>
+                <w:lang w:val="en-US"/>
+              </w:rPr>
               <w:t>5 715</w:t>
             </w:r>
           </w:p>
@@ -1519,6 +3010,15 @@
                 <w:szCs w:val="24"/>
                 <w:lang w:val="en-US"/>
               </w:rPr>
+              <w:t>$</w:t>
+            </w:r>
+            <w:r>
+              <w:rPr>
+                <w:rFonts w:eastAsia="Aptos"/>
+                <w:sz w:val="24"/>
+                <w:szCs w:val="24"/>
+                <w:lang w:val="en-US"/>
+              </w:rPr>
               <w:t>739</w:t>
             </w:r>
           </w:p>
@@ -1536,6 +3036,15 @@
                 <w:lang w:val="en-US"/>
               </w:rPr>
             </w:pPr>
+            <w:r>
+              <w:rPr>
+                <w:rFonts w:eastAsia="Aptos"/>
+                <w:sz w:val="24"/>
+                <w:szCs w:val="24"/>
+                <w:lang w:val="en-US"/>
+              </w:rPr>
+              <w:t>$</w:t>
+            </w:r>
             <w:r>
               <w:rPr>
                 <w:rFonts w:eastAsia="Aptos"/>
@@ -1563,24 +3072,25 @@
     <w:p>
       <w:pPr>
         <w:rPr>
-          <w:b/>
-          <w:bCs/>
-          <w:sz w:val="28"/>
-          <w:szCs w:val="28"/>
-          <w:lang w:val="en-US"/>
-        </w:rPr>
-      </w:pPr>
-    </w:p>
-    <w:p>
-      <w:pPr>
-        <w:rPr>
-          <w:b/>
-          <w:bCs/>
-          <w:sz w:val="28"/>
-          <w:szCs w:val="28"/>
-          <w:lang w:val="en-US"/>
-        </w:rPr>
-      </w:pPr>
+          <w:sz w:val="24"/>
+          <w:szCs w:val="24"/>
+        </w:rPr>
+      </w:pPr>
+      <w:r>
+        <w:rPr>
+          <w:sz w:val="24"/>
+          <w:szCs w:val="24"/>
+        </w:rPr>
+        <w:lastRenderedPageBreak/>
+        <w:t>Our model results confirm the economic rationale for OPEC's existence: by coordinating production through quotas, member states can restrict supply to sustain higher market prices, thereby achieving higher aggregate revenues than would be possible under unconstrained competition</w:t>
+      </w:r>
+      <w:r>
+        <w:rPr>
+          <w:sz w:val="24"/>
+          <w:szCs w:val="24"/>
+        </w:rPr>
+        <w:t xml:space="preserve">. </w:t>
+      </w:r>
     </w:p>
     <w:p>
       <w:pPr>
@@ -2061,7 +3571,6 @@
           <w:szCs w:val="28"/>
           <w:lang w:val="en-US"/>
         </w:rPr>
-        <w:lastRenderedPageBreak/>
         <w:drawing>
           <wp:anchor distT="0" distB="0" distL="0" distR="0" simplePos="0" relativeHeight="16" behindDoc="0" locked="0" layoutInCell="0" allowOverlap="1" wp14:anchorId="5BCFDC52" wp14:editId="50441818">
             <wp:simplePos x="0" y="0"/>
@@ -2323,6 +3832,7 @@
                 <w:szCs w:val="24"/>
                 <w:lang w:val="en-US"/>
               </w:rPr>
+              <w:lastRenderedPageBreak/>
               <w:t>27 763</w:t>
             </w:r>
           </w:p>
@@ -2647,7 +4157,6 @@
         <w:rPr>
           <w:noProof/>
         </w:rPr>
-        <w:lastRenderedPageBreak/>
         <w:drawing>
           <wp:anchor distT="0" distB="0" distL="0" distR="0" simplePos="0" relativeHeight="7" behindDoc="0" locked="0" layoutInCell="0" allowOverlap="1" wp14:anchorId="673F1D78" wp14:editId="7B5A79C7">
             <wp:simplePos x="0" y="0"/>
@@ -2842,6 +4351,7 @@
           <w:szCs w:val="28"/>
           <w:lang w:val="en-US"/>
         </w:rPr>
+        <w:lastRenderedPageBreak/>
         <w:drawing>
           <wp:anchor distT="0" distB="0" distL="0" distR="0" simplePos="0" relativeHeight="10" behindDoc="0" locked="0" layoutInCell="0" allowOverlap="1" wp14:anchorId="160605A7" wp14:editId="00138BE6">
             <wp:simplePos x="0" y="0"/>
@@ -3020,7 +4530,6 @@
           <w:szCs w:val="28"/>
           <w:lang w:val="en-US"/>
         </w:rPr>
-        <w:lastRenderedPageBreak/>
         <w:drawing>
           <wp:anchor distT="0" distB="0" distL="0" distR="0" simplePos="0" relativeHeight="15" behindDoc="0" locked="0" layoutInCell="0" allowOverlap="1" wp14:anchorId="27BE0B02" wp14:editId="40B91502">
             <wp:simplePos x="0" y="0"/>
@@ -3175,6 +4684,7 @@
           <w:szCs w:val="28"/>
           <w:lang w:val="en-US"/>
         </w:rPr>
+        <w:lastRenderedPageBreak/>
         <w:drawing>
           <wp:anchor distT="0" distB="0" distL="0" distR="0" simplePos="0" relativeHeight="12" behindDoc="0" locked="0" layoutInCell="0" allowOverlap="1" wp14:anchorId="1767B9EE" wp14:editId="0154AEE4">
             <wp:simplePos x="0" y="0"/>
@@ -3450,7 +4960,6 @@
           <w:sz w:val="24"/>
           <w:szCs w:val="24"/>
         </w:rPr>
-        <w:lastRenderedPageBreak/>
         <w:t xml:space="preserve">Marker, D. (2019). </w:t>
       </w:r>
       <w:r>
@@ -3506,81 +5015,8 @@
             <w:szCs w:val="24"/>
             <w:lang w:val="en-US"/>
           </w:rPr>
-          <w:t>th.uic.edu/~marker/stat473-s19/Cournot.pdf</w:t>
+          <w:t>th.uic.edu/</w:t>
         </w:r>
-      </w:hyperlink>
-    </w:p>
-    <w:p>
-      <w:pPr>
-        <w:spacing w:after="0"/>
-        <w:rPr>
-          <w:sz w:val="24"/>
-          <w:szCs w:val="24"/>
-          <w:lang w:val="en-US"/>
-        </w:rPr>
-      </w:pPr>
-    </w:p>
-    <w:p>
-      <w:pPr>
-        <w:pStyle w:val="ListParagraph"/>
-        <w:numPr>
-          <w:ilvl w:val="0"/>
-          <w:numId w:val="1"/>
-        </w:numPr>
-        <w:spacing w:after="0"/>
-        <w:rPr>
-          <w:sz w:val="24"/>
-          <w:szCs w:val="24"/>
-          <w:lang w:val="en-US"/>
-        </w:rPr>
-      </w:pPr>
-      <w:r>
-        <w:rPr>
-          <w:sz w:val="24"/>
-          <w:szCs w:val="24"/>
-          <w:lang w:val="en-US"/>
-        </w:rPr>
-        <w:t xml:space="preserve">OPEC </w:t>
-      </w:r>
-      <w:proofErr w:type="spellStart"/>
-      <w:r>
-        <w:rPr>
-          <w:sz w:val="24"/>
-          <w:szCs w:val="24"/>
-          <w:lang w:val="en-US"/>
-        </w:rPr>
-        <w:t>behaviour</w:t>
-      </w:r>
-      <w:proofErr w:type="spellEnd"/>
-      <w:r>
-        <w:rPr>
-          <w:sz w:val="24"/>
-          <w:szCs w:val="24"/>
-          <w:lang w:val="en-US"/>
-        </w:rPr>
-        <w:t xml:space="preserve">: A Test of Alternative </w:t>
-      </w:r>
-      <w:proofErr w:type="spellStart"/>
-      <w:r>
-        <w:rPr>
-          <w:sz w:val="24"/>
-          <w:szCs w:val="24"/>
-          <w:lang w:val="en-US"/>
-        </w:rPr>
-        <w:t>Hypotesis</w:t>
-      </w:r>
-      <w:proofErr w:type="spellEnd"/>
-    </w:p>
-    <w:p>
-      <w:pPr>
-        <w:spacing w:after="0"/>
-        <w:ind w:left="708"/>
-        <w:rPr>
-          <w:sz w:val="24"/>
-          <w:szCs w:val="24"/>
-        </w:rPr>
-      </w:pPr>
-      <w:hyperlink r:id="rId21" w:history="1">
         <w:r>
           <w:rPr>
             <w:rStyle w:val="Hyperlink"/>
@@ -3588,9 +5024,46 @@
             <w:szCs w:val="24"/>
             <w:lang w:val="en-US"/>
           </w:rPr>
-          <w:t>https://oaktrust.library.tamu.edu/server/api/core/bitstreams/7baa611a-3399-41b8-b3fc-70381131baca/content</w:t>
+          <w:t>~</w:t>
+        </w:r>
+        <w:r>
+          <w:rPr>
+            <w:rStyle w:val="Hyperlink"/>
+            <w:sz w:val="24"/>
+            <w:szCs w:val="24"/>
+            <w:lang w:val="en-US"/>
+          </w:rPr>
+          <w:t>marker/s</w:t>
+        </w:r>
+        <w:r>
+          <w:rPr>
+            <w:rStyle w:val="Hyperlink"/>
+            <w:sz w:val="24"/>
+            <w:szCs w:val="24"/>
+            <w:lang w:val="en-US"/>
+          </w:rPr>
+          <w:t>t</w:t>
+        </w:r>
+        <w:r>
+          <w:rPr>
+            <w:rStyle w:val="Hyperlink"/>
+            <w:sz w:val="24"/>
+            <w:szCs w:val="24"/>
+            <w:lang w:val="en-US"/>
+          </w:rPr>
+          <w:t>at473-s19/Cournot.pdf</w:t>
         </w:r>
       </w:hyperlink>
+    </w:p>
+    <w:p>
+      <w:pPr>
+        <w:spacing w:after="0"/>
+        <w:rPr>
+          <w:sz w:val="24"/>
+          <w:szCs w:val="24"/>
+          <w:lang w:val="en-US"/>
+        </w:rPr>
+      </w:pPr>
     </w:p>
     <w:p>
       <w:pPr>

</xml_diff>